<commit_message>
docs(marketing): add UC-76 email marketing documentation and test inspection scripts
</commit_message>
<xml_diff>
--- a/docs/Template-Weekly-report-and-weekly-3-meeting-notes.docx
+++ b/docs/Template-Weekly-report-and-weekly-3-meeting-notes.docx
@@ -86,6 +86,3916 @@
           <w:rtl w:val="0"/>
         </w:rPr>
         <w:t xml:space="preserve">// ví dụ họp vào tối thứ tư, thì báo cáo sẽ là kết quả công việc từ thứ tư tuần trước, tới thứ ba tuần này </w:t>
+      </w:r>
+    </w:p>
+    <w:p>
+      <w:pPr>
+        <w:pStyle w:val="Heading1"/>
+        <w:spacing w:after="120" w:before="280" w:line="276" w:lineRule="auto"/>
+        <w:rPr/>
+      </w:pPr>
+      <w:r>
+        <w:rPr>
+          <w:rFonts w:ascii="Calibri" w:cs="Calibri" w:eastAsia="Calibri" w:hAnsi="Calibri"/>
+          <w:b w:val="1"/>
+          <w:bCs w:val="1"/>
+          <w:color w:val="1e3a8a"/>
+          <w:sz w:val="32"/>
+          <w:szCs w:val="32"/>
+          <w:rtl w:val="0"/>
+        </w:rPr>
+        <w:t xml:space="preserve">[Tuần 6] 2026-10-13 ~ 2026-10-19</w:t>
+      </w:r>
+    </w:p>
+    <w:p>
+      <w:pPr>
+        <w:pStyle w:val="Heading2"/>
+        <w:spacing w:after="80" w:before="200" w:line="276" w:lineRule="auto"/>
+        <w:rPr/>
+      </w:pPr>
+      <w:r>
+        <w:rPr>
+          <w:rFonts w:ascii="Calibri" w:cs="Calibri" w:eastAsia="Calibri" w:hAnsi="Calibri"/>
+          <w:b w:val="1"/>
+          <w:bCs w:val="1"/>
+          <w:color w:val="1e3a8a"/>
+          <w:sz w:val="28"/>
+          <w:szCs w:val="28"/>
+          <w:rtl w:val="0"/>
+        </w:rPr>
+        <w:t xml:space="preserve">Project Report</w:t>
+      </w:r>
+    </w:p>
+    <w:p>
+      <w:pPr>
+        <w:pStyle w:val="Heading3"/>
+        <w:spacing w:after="40" w:before="120" w:line="276" w:lineRule="auto"/>
+        <w:rPr/>
+      </w:pPr>
+      <w:r>
+        <w:rPr>
+          <w:rFonts w:ascii="Calibri" w:cs="Calibri" w:eastAsia="Calibri" w:hAnsi="Calibri"/>
+          <w:b w:val="1"/>
+          <w:bCs w:val="1"/>
+          <w:color w:val="1e3a8a"/>
+          <w:sz w:val="24"/>
+          <w:szCs w:val="24"/>
+          <w:rtl w:val="0"/>
+        </w:rPr>
+        <w:t xml:space="preserve">Overview</w:t>
+      </w:r>
+    </w:p>
+    <w:p>
+      <w:pPr>
+        <w:pStyle w:val="Heading4"/>
+        <w:spacing w:after="40" w:before="80" w:line="276" w:lineRule="auto"/>
+        <w:rPr/>
+      </w:pPr>
+      <w:r>
+        <w:rPr>
+          <w:rFonts w:ascii="Calibri" w:cs="Calibri" w:eastAsia="Calibri" w:hAnsi="Calibri"/>
+          <w:b w:val="1"/>
+          <w:bCs w:val="1"/>
+          <w:color w:val="1e3a8a"/>
+          <w:sz w:val="22"/>
+          <w:szCs w:val="22"/>
+          <w:rtl w:val="0"/>
+        </w:rPr>
+        <w:t xml:space="preserve">Recover</w:t>
+      </w:r>
+    </w:p>
+    <w:tbl>
+      <w:tblPr>
+        <w:tblStyle w:val="Table1"/>
+        <w:tblW w:w="13958.0" w:type="dxa"/>
+        <w:jc w:val="center"/>
+        <w:tblBorders>
+          <w:top w:color="cbd5e1" w:space="0" w:sz="4" w:val="single"/>
+          <w:left w:color="cbd5e1" w:space="0" w:sz="4" w:val="single"/>
+          <w:bottom w:color="cbd5e1" w:space="0" w:sz="4" w:val="single"/>
+          <w:right w:color="cbd5e1" w:space="0" w:sz="4" w:val="single"/>
+          <w:insideH w:color="cbd5e1" w:space="0" w:sz="4" w:val="single"/>
+          <w:insideV w:color="cbd5e1" w:space="0" w:sz="4" w:val="single"/>
+        </w:tblBorders>
+        <w:tblLayout w:type="fixed"/>
+        <w:tblLook w:val="0400"/>
+      </w:tblPr>
+      <w:tblGrid>
+        <w:gridCol w:w="800"/>
+        <w:gridCol w:w="4300"/>
+        <w:gridCol w:w="1400"/>
+        <w:gridCol w:w="7458"/>
+      </w:tblGrid>
+      <w:tr>
+        <w:trPr>
+          <w:cantSplit w:val="0"/>
+          <w:tblHeader w:val="1"/>
+        </w:trPr>
+        <w:tc>
+          <w:tcPr>
+            <w:tcW w:w="800" w:type="dxa"/>
+            <w:shd w:fill="1e3a8a" w:val="clear"/>
+            <w:tcMar>
+              <w:top w:w="70.0" w:type="dxa"/>
+              <w:left w:w="90.0" w:type="dxa"/>
+              <w:bottom w:w="70.0" w:type="dxa"/>
+              <w:right w:w="90.0" w:type="dxa"/>
+            </w:tcMar>
+            <w:vAlign w:val="center"/>
+          </w:tcPr>
+          <w:p>
+            <w:pPr>
+              <w:jc w:val="center"/>
+              <w:spacing w:after="40" w:before="40" w:line="276" w:lineRule="auto"/>
+              <w:rPr/>
+            </w:pPr>
+            <w:r>
+              <w:rPr>
+                <w:rFonts w:ascii="Calibri" w:cs="Calibri" w:eastAsia="Calibri" w:hAnsi="Calibri"/>
+                <w:b w:val="1"/>
+                <w:bCs w:val="1"/>
+                <w:color w:val="ffffff"/>
+                <w:sz w:val="20"/>
+                <w:szCs w:val="20"/>
+                <w:rtl w:val="0"/>
+              </w:rPr>
+              <w:t xml:space="preserve">#</w:t>
+            </w:r>
+          </w:p>
+        </w:tc>
+        <w:tc>
+          <w:tcPr>
+            <w:tcW w:w="4300" w:type="dxa"/>
+            <w:shd w:fill="1e3a8a" w:val="clear"/>
+            <w:tcMar>
+              <w:top w:w="70.0" w:type="dxa"/>
+              <w:left w:w="90.0" w:type="dxa"/>
+              <w:bottom w:w="70.0" w:type="dxa"/>
+              <w:right w:w="90.0" w:type="dxa"/>
+            </w:tcMar>
+            <w:vAlign w:val="center"/>
+          </w:tcPr>
+          <w:p>
+            <w:pPr>
+              <w:jc w:val="center"/>
+              <w:spacing w:after="40" w:before="40" w:line="276" w:lineRule="auto"/>
+              <w:rPr/>
+            </w:pPr>
+            <w:r>
+              <w:rPr>
+                <w:rFonts w:ascii="Calibri" w:cs="Calibri" w:eastAsia="Calibri" w:hAnsi="Calibri"/>
+                <w:b w:val="1"/>
+                <w:bCs w:val="1"/>
+                <w:color w:val="ffffff"/>
+                <w:sz w:val="20"/>
+                <w:szCs w:val="20"/>
+                <w:rtl w:val="0"/>
+              </w:rPr>
+              <w:t xml:space="preserve">Plan</w:t>
+            </w:r>
+          </w:p>
+        </w:tc>
+        <w:tc>
+          <w:tcPr>
+            <w:tcW w:w="1400" w:type="dxa"/>
+            <w:shd w:fill="1e3a8a" w:val="clear"/>
+            <w:tcMar>
+              <w:top w:w="70.0" w:type="dxa"/>
+              <w:left w:w="90.0" w:type="dxa"/>
+              <w:bottom w:w="70.0" w:type="dxa"/>
+              <w:right w:w="90.0" w:type="dxa"/>
+            </w:tcMar>
+            <w:vAlign w:val="center"/>
+          </w:tcPr>
+          <w:p>
+            <w:pPr>
+              <w:jc w:val="center"/>
+              <w:spacing w:after="40" w:before="40" w:line="276" w:lineRule="auto"/>
+              <w:rPr/>
+            </w:pPr>
+            <w:r>
+              <w:rPr>
+                <w:rFonts w:ascii="Calibri" w:cs="Calibri" w:eastAsia="Calibri" w:hAnsi="Calibri"/>
+                <w:b w:val="1"/>
+                <w:bCs w:val="1"/>
+                <w:color w:val="ffffff"/>
+                <w:sz w:val="20"/>
+                <w:szCs w:val="20"/>
+                <w:rtl w:val="0"/>
+              </w:rPr>
+              <w:t xml:space="preserve">Status</w:t>
+            </w:r>
+          </w:p>
+        </w:tc>
+        <w:tc>
+          <w:tcPr>
+            <w:tcW w:w="7458" w:type="dxa"/>
+            <w:shd w:fill="1e3a8a" w:val="clear"/>
+            <w:tcMar>
+              <w:top w:w="70.0" w:type="dxa"/>
+              <w:left w:w="90.0" w:type="dxa"/>
+              <w:bottom w:w="70.0" w:type="dxa"/>
+              <w:right w:w="90.0" w:type="dxa"/>
+            </w:tcMar>
+            <w:vAlign w:val="center"/>
+          </w:tcPr>
+          <w:p>
+            <w:pPr>
+              <w:jc w:val="center"/>
+              <w:spacing w:after="40" w:before="40" w:line="276" w:lineRule="auto"/>
+              <w:rPr/>
+            </w:pPr>
+            <w:r>
+              <w:rPr>
+                <w:rFonts w:ascii="Calibri" w:cs="Calibri" w:eastAsia="Calibri" w:hAnsi="Calibri"/>
+                <w:b w:val="1"/>
+                <w:bCs w:val="1"/>
+                <w:color w:val="ffffff"/>
+                <w:sz w:val="20"/>
+                <w:szCs w:val="20"/>
+                <w:rtl w:val="0"/>
+              </w:rPr>
+              <w:t xml:space="preserve">Actual</w:t>
+            </w:r>
+          </w:p>
+        </w:tc>
+      </w:tr>
+      <w:tr>
+        <w:trPr>
+          <w:cantSplit w:val="0"/>
+          <w:tblHeader w:val="0"/>
+        </w:trPr>
+        <w:tc>
+          <w:tcPr>
+            <w:tcW w:w="800" w:type="dxa"/>
+            <w:shd w:fill="f8fafc" w:val="clear"/>
+            <w:tcMar>
+              <w:top w:w="70.0" w:type="dxa"/>
+              <w:left w:w="90.0" w:type="dxa"/>
+              <w:bottom w:w="70.0" w:type="dxa"/>
+              <w:right w:w="90.0" w:type="dxa"/>
+            </w:tcMar>
+            <w:vAlign w:val="center"/>
+          </w:tcPr>
+          <w:p>
+            <w:pPr>
+              <w:jc w:val="center"/>
+              <w:spacing w:after="40" w:before="40" w:line="276" w:lineRule="auto"/>
+              <w:rPr/>
+            </w:pPr>
+            <w:r>
+              <w:rPr>
+                <w:rFonts w:ascii="Calibri" w:cs="Calibri" w:eastAsia="Calibri" w:hAnsi="Calibri"/>
+                <w:b w:val="1"/>
+                <w:bCs w:val="1"/>
+                <w:color w:val="475569"/>
+                <w:sz w:val="20"/>
+                <w:szCs w:val="20"/>
+                <w:rtl w:val="0"/>
+              </w:rPr>
+              <w:t xml:space="preserve">1</w:t>
+            </w:r>
+          </w:p>
+        </w:tc>
+        <w:tc>
+          <w:tcPr>
+            <w:tcW w:w="4300" w:type="dxa"/>
+            <w:shd w:fill="f8fafc" w:val="clear"/>
+            <w:tcMar>
+              <w:top w:w="70.0" w:type="dxa"/>
+              <w:left w:w="90.0" w:type="dxa"/>
+              <w:bottom w:w="70.0" w:type="dxa"/>
+              <w:right w:w="90.0" w:type="dxa"/>
+            </w:tcMar>
+            <w:vAlign w:val="center"/>
+          </w:tcPr>
+          <w:p>
+            <w:pPr>
+              <w:jc w:val="left"/>
+              <w:spacing w:after="40" w:before="40" w:line="276" w:lineRule="auto"/>
+              <w:rPr/>
+            </w:pPr>
+            <w:r>
+              <w:rPr>
+                <w:rFonts w:ascii="Calibri" w:cs="Calibri" w:eastAsia="Calibri" w:hAnsi="Calibri"/>
+                <w:color w:val="0f172a"/>
+                <w:sz w:val="20"/>
+                <w:szCs w:val="20"/>
+                <w:rtl w:val="0"/>
+              </w:rPr>
+              <w:t xml:space="preserve">Điều tra và xử lý dứt điểm lỗi tồn kho âm (Bug #215)</w:t>
+            </w:r>
+          </w:p>
+        </w:tc>
+        <w:tc>
+          <w:tcPr>
+            <w:tcW w:w="1400" w:type="dxa"/>
+            <w:shd w:fill="f8fafc" w:val="clear"/>
+            <w:tcMar>
+              <w:top w:w="70.0" w:type="dxa"/>
+              <w:left w:w="90.0" w:type="dxa"/>
+              <w:bottom w:w="70.0" w:type="dxa"/>
+              <w:right w:w="90.0" w:type="dxa"/>
+            </w:tcMar>
+            <w:vAlign w:val="center"/>
+          </w:tcPr>
+          <w:p>
+            <w:pPr>
+              <w:jc w:val="center"/>
+              <w:spacing w:after="40" w:before="40" w:line="276" w:lineRule="auto"/>
+              <w:rPr/>
+            </w:pPr>
+            <w:r>
+              <w:rPr>
+                <w:rFonts w:ascii="Calibri" w:cs="Calibri" w:eastAsia="Calibri" w:hAnsi="Calibri"/>
+                <w:b w:val="1"/>
+                <w:bCs w:val="1"/>
+                <w:color w:val="15803d"/>
+                <w:sz w:val="20"/>
+                <w:szCs w:val="20"/>
+                <w:rtl w:val="0"/>
+              </w:rPr>
+              <w:t xml:space="preserve">Done</w:t>
+            </w:r>
+          </w:p>
+        </w:tc>
+        <w:tc>
+          <w:tcPr>
+            <w:tcW w:w="7458" w:type="dxa"/>
+            <w:shd w:fill="f8fafc" w:val="clear"/>
+            <w:tcMar>
+              <w:top w:w="70.0" w:type="dxa"/>
+              <w:left w:w="90.0" w:type="dxa"/>
+              <w:bottom w:w="70.0" w:type="dxa"/>
+              <w:right w:w="90.0" w:type="dxa"/>
+            </w:tcMar>
+            <w:vAlign w:val="center"/>
+          </w:tcPr>
+          <w:p>
+            <w:pPr>
+              <w:jc w:val="left"/>
+              <w:spacing w:after="40" w:before="40" w:line="276" w:lineRule="auto"/>
+              <w:rPr/>
+            </w:pPr>
+            <w:r>
+              <w:rPr>
+                <w:rFonts w:ascii="Calibri" w:cs="Calibri" w:eastAsia="Calibri" w:hAnsi="Calibri"/>
+                <w:color w:val="0f172a"/>
+                <w:sz w:val="20"/>
+                <w:szCs w:val="20"/>
+                <w:rtl w:val="0"/>
+              </w:rPr>
+              <w:t xml:space="preserve">Đồng bộ tồn kho chi nhánh theo lô vật lý thực tế, bọc Math.max(0, ...) và tự động làm sạch số dư âm ở Backend theo chuẩn ACID (Phước - commit 47fada2).</w:t>
+            </w:r>
+          </w:p>
+        </w:tc>
+      </w:tr>
+      <w:tr>
+        <w:trPr>
+          <w:cantSplit w:val="0"/>
+          <w:tblHeader w:val="0"/>
+        </w:trPr>
+        <w:tc>
+          <w:tcPr>
+            <w:tcW w:w="800" w:type="dxa"/>
+            <w:shd w:fill="ffffff" w:val="clear"/>
+            <w:tcMar>
+              <w:top w:w="70.0" w:type="dxa"/>
+              <w:left w:w="90.0" w:type="dxa"/>
+              <w:bottom w:w="70.0" w:type="dxa"/>
+              <w:right w:w="90.0" w:type="dxa"/>
+            </w:tcMar>
+            <w:vAlign w:val="center"/>
+          </w:tcPr>
+          <w:p>
+            <w:pPr>
+              <w:jc w:val="center"/>
+              <w:spacing w:after="40" w:before="40" w:line="276" w:lineRule="auto"/>
+              <w:rPr/>
+            </w:pPr>
+            <w:r>
+              <w:rPr>
+                <w:rFonts w:ascii="Calibri" w:cs="Calibri" w:eastAsia="Calibri" w:hAnsi="Calibri"/>
+                <w:b w:val="1"/>
+                <w:bCs w:val="1"/>
+                <w:color w:val="475569"/>
+                <w:sz w:val="20"/>
+                <w:szCs w:val="20"/>
+                <w:rtl w:val="0"/>
+              </w:rPr>
+              <w:t xml:space="preserve">2</w:t>
+            </w:r>
+          </w:p>
+        </w:tc>
+        <w:tc>
+          <w:tcPr>
+            <w:tcW w:w="4300" w:type="dxa"/>
+            <w:shd w:fill="ffffff" w:val="clear"/>
+            <w:tcMar>
+              <w:top w:w="70.0" w:type="dxa"/>
+              <w:left w:w="90.0" w:type="dxa"/>
+              <w:bottom w:w="70.0" w:type="dxa"/>
+              <w:right w:w="90.0" w:type="dxa"/>
+            </w:tcMar>
+            <w:vAlign w:val="center"/>
+          </w:tcPr>
+          <w:p>
+            <w:pPr>
+              <w:jc w:val="left"/>
+              <w:spacing w:after="40" w:before="40" w:line="276" w:lineRule="auto"/>
+              <w:rPr/>
+            </w:pPr>
+            <w:r>
+              <w:rPr>
+                <w:rFonts w:ascii="Calibri" w:cs="Calibri" w:eastAsia="Calibri" w:hAnsi="Calibri"/>
+                <w:color w:val="0f172a"/>
+                <w:sz w:val="20"/>
+                <w:szCs w:val="20"/>
+                <w:rtl w:val="0"/>
+              </w:rPr>
+              <w:t xml:space="preserve">Vá lỗ hổng bảo mật VoucherController (SCRUM-92 / UC-68, UC-72)</w:t>
+            </w:r>
+          </w:p>
+        </w:tc>
+        <w:tc>
+          <w:tcPr>
+            <w:tcW w:w="1400" w:type="dxa"/>
+            <w:shd w:fill="ffffff" w:val="clear"/>
+            <w:tcMar>
+              <w:top w:w="70.0" w:type="dxa"/>
+              <w:left w:w="90.0" w:type="dxa"/>
+              <w:bottom w:w="70.0" w:type="dxa"/>
+              <w:right w:w="90.0" w:type="dxa"/>
+            </w:tcMar>
+            <w:vAlign w:val="center"/>
+          </w:tcPr>
+          <w:p>
+            <w:pPr>
+              <w:jc w:val="center"/>
+              <w:spacing w:after="40" w:before="40" w:line="276" w:lineRule="auto"/>
+              <w:rPr/>
+            </w:pPr>
+            <w:r>
+              <w:rPr>
+                <w:rFonts w:ascii="Calibri" w:cs="Calibri" w:eastAsia="Calibri" w:hAnsi="Calibri"/>
+                <w:b w:val="1"/>
+                <w:bCs w:val="1"/>
+                <w:color w:val="15803d"/>
+                <w:sz w:val="20"/>
+                <w:szCs w:val="20"/>
+                <w:rtl w:val="0"/>
+              </w:rPr>
+              <w:t xml:space="preserve">Done</w:t>
+            </w:r>
+          </w:p>
+        </w:tc>
+        <w:tc>
+          <w:tcPr>
+            <w:tcW w:w="7458" w:type="dxa"/>
+            <w:shd w:fill="ffffff" w:val="clear"/>
+            <w:tcMar>
+              <w:top w:w="70.0" w:type="dxa"/>
+              <w:left w:w="90.0" w:type="dxa"/>
+              <w:bottom w:w="70.0" w:type="dxa"/>
+              <w:right w:w="90.0" w:type="dxa"/>
+            </w:tcMar>
+            <w:vAlign w:val="center"/>
+          </w:tcPr>
+          <w:p>
+            <w:pPr>
+              <w:jc w:val="left"/>
+              <w:spacing w:after="40" w:before="40" w:line="276" w:lineRule="auto"/>
+              <w:rPr/>
+            </w:pPr>
+            <w:r>
+              <w:rPr>
+                <w:rFonts w:ascii="Calibri" w:cs="Calibri" w:eastAsia="Calibri" w:hAnsi="Calibri"/>
+                <w:color w:val="0f172a"/>
+                <w:sz w:val="20"/>
+                <w:szCs w:val="20"/>
+                <w:rtl w:val="0"/>
+              </w:rPr>
+              <w:t xml:space="preserve">Bổ sung RBAC guards và validate điều kiện áp dụng voucher nghiêm ngặt tại Backend orders-service &amp; api-gateway, ngăn chặn triệt để nguy cơ IDOR (Phước - PR #223).</w:t>
+            </w:r>
+          </w:p>
+        </w:tc>
+      </w:tr>
+      <w:tr>
+        <w:trPr>
+          <w:cantSplit w:val="0"/>
+          <w:tblHeader w:val="0"/>
+        </w:trPr>
+        <w:tc>
+          <w:tcPr>
+            <w:tcW w:w="800" w:type="dxa"/>
+            <w:shd w:fill="f8fafc" w:val="clear"/>
+            <w:tcMar>
+              <w:top w:w="70.0" w:type="dxa"/>
+              <w:left w:w="90.0" w:type="dxa"/>
+              <w:bottom w:w="70.0" w:type="dxa"/>
+              <w:right w:w="90.0" w:type="dxa"/>
+            </w:tcMar>
+            <w:vAlign w:val="center"/>
+          </w:tcPr>
+          <w:p>
+            <w:pPr>
+              <w:jc w:val="center"/>
+              <w:spacing w:after="40" w:before="40" w:line="276" w:lineRule="auto"/>
+              <w:rPr/>
+            </w:pPr>
+            <w:r>
+              <w:rPr>
+                <w:rFonts w:ascii="Calibri" w:cs="Calibri" w:eastAsia="Calibri" w:hAnsi="Calibri"/>
+                <w:b w:val="1"/>
+                <w:bCs w:val="1"/>
+                <w:color w:val="475569"/>
+                <w:sz w:val="20"/>
+                <w:szCs w:val="20"/>
+                <w:rtl w:val="0"/>
+              </w:rPr>
+              <w:t xml:space="preserve">3</w:t>
+            </w:r>
+          </w:p>
+        </w:tc>
+        <w:tc>
+          <w:tcPr>
+            <w:tcW w:w="4300" w:type="dxa"/>
+            <w:shd w:fill="f8fafc" w:val="clear"/>
+            <w:tcMar>
+              <w:top w:w="70.0" w:type="dxa"/>
+              <w:left w:w="90.0" w:type="dxa"/>
+              <w:bottom w:w="70.0" w:type="dxa"/>
+              <w:right w:w="90.0" w:type="dxa"/>
+            </w:tcMar>
+            <w:vAlign w:val="center"/>
+          </w:tcPr>
+          <w:p>
+            <w:pPr>
+              <w:jc w:val="left"/>
+              <w:spacing w:after="40" w:before="40" w:line="276" w:lineRule="auto"/>
+              <w:rPr/>
+            </w:pPr>
+            <w:r>
+              <w:rPr>
+                <w:rFonts w:ascii="Calibri" w:cs="Calibri" w:eastAsia="Calibri" w:hAnsi="Calibri"/>
+                <w:color w:val="0f172a"/>
+                <w:sz w:val="20"/>
+                <w:szCs w:val="20"/>
+                <w:rtl w:val="0"/>
+              </w:rPr>
+              <w:t xml:space="preserve">Dọn dẹp Mock Data trên ứng dụng Mobile</w:t>
+            </w:r>
+          </w:p>
+        </w:tc>
+        <w:tc>
+          <w:tcPr>
+            <w:tcW w:w="1400" w:type="dxa"/>
+            <w:shd w:fill="f8fafc" w:val="clear"/>
+            <w:tcMar>
+              <w:top w:w="70.0" w:type="dxa"/>
+              <w:left w:w="90.0" w:type="dxa"/>
+              <w:bottom w:w="70.0" w:type="dxa"/>
+              <w:right w:w="90.0" w:type="dxa"/>
+            </w:tcMar>
+            <w:vAlign w:val="center"/>
+          </w:tcPr>
+          <w:p>
+            <w:pPr>
+              <w:jc w:val="center"/>
+              <w:spacing w:after="40" w:before="40" w:line="276" w:lineRule="auto"/>
+              <w:rPr/>
+            </w:pPr>
+            <w:r>
+              <w:rPr>
+                <w:rFonts w:ascii="Calibri" w:cs="Calibri" w:eastAsia="Calibri" w:hAnsi="Calibri"/>
+                <w:b w:val="1"/>
+                <w:bCs w:val="1"/>
+                <w:color w:val="15803d"/>
+                <w:sz w:val="20"/>
+                <w:szCs w:val="20"/>
+                <w:rtl w:val="0"/>
+              </w:rPr>
+              <w:t xml:space="preserve">Done</w:t>
+            </w:r>
+          </w:p>
+        </w:tc>
+        <w:tc>
+          <w:tcPr>
+            <w:tcW w:w="7458" w:type="dxa"/>
+            <w:shd w:fill="f8fafc" w:val="clear"/>
+            <w:tcMar>
+              <w:top w:w="70.0" w:type="dxa"/>
+              <w:left w:w="90.0" w:type="dxa"/>
+              <w:bottom w:w="70.0" w:type="dxa"/>
+              <w:right w:w="90.0" w:type="dxa"/>
+            </w:tcMar>
+            <w:vAlign w:val="center"/>
+          </w:tcPr>
+          <w:p>
+            <w:pPr>
+              <w:jc w:val="left"/>
+              <w:spacing w:after="40" w:before="40" w:line="276" w:lineRule="auto"/>
+              <w:rPr/>
+            </w:pPr>
+            <w:r>
+              <w:rPr>
+                <w:rFonts w:ascii="Calibri" w:cs="Calibri" w:eastAsia="Calibri" w:hAnsi="Calibri"/>
+                <w:color w:val="0f172a"/>
+                <w:sz w:val="20"/>
+                <w:szCs w:val="20"/>
+                <w:rtl w:val="0"/>
+              </w:rPr>
+              <w:t xml:space="preserve">Dọn sạch 100% Mock Data, kết nối trực tiếp API Gateway và phân quyền dynamic RBAC linh hoạt theo chi nhánh (Phúc - PR #216, PR #228).</w:t>
+            </w:r>
+          </w:p>
+        </w:tc>
+      </w:tr>
+      <w:tr>
+        <w:trPr>
+          <w:cantSplit w:val="0"/>
+          <w:tblHeader w:val="0"/>
+        </w:trPr>
+        <w:tc>
+          <w:tcPr>
+            <w:tcW w:w="800" w:type="dxa"/>
+            <w:shd w:fill="ffffff" w:val="clear"/>
+            <w:tcMar>
+              <w:top w:w="70.0" w:type="dxa"/>
+              <w:left w:w="90.0" w:type="dxa"/>
+              <w:bottom w:w="70.0" w:type="dxa"/>
+              <w:right w:w="90.0" w:type="dxa"/>
+            </w:tcMar>
+            <w:vAlign w:val="center"/>
+          </w:tcPr>
+          <w:p>
+            <w:pPr>
+              <w:jc w:val="center"/>
+              <w:spacing w:after="40" w:before="40" w:line="276" w:lineRule="auto"/>
+              <w:rPr/>
+            </w:pPr>
+            <w:r>
+              <w:rPr>
+                <w:rFonts w:ascii="Calibri" w:cs="Calibri" w:eastAsia="Calibri" w:hAnsi="Calibri"/>
+                <w:b w:val="1"/>
+                <w:bCs w:val="1"/>
+                <w:color w:val="475569"/>
+                <w:sz w:val="20"/>
+                <w:szCs w:val="20"/>
+                <w:rtl w:val="0"/>
+              </w:rPr>
+              <w:t xml:space="preserve">4</w:t>
+            </w:r>
+          </w:p>
+        </w:tc>
+        <w:tc>
+          <w:tcPr>
+            <w:tcW w:w="4300" w:type="dxa"/>
+            <w:shd w:fill="ffffff" w:val="clear"/>
+            <w:tcMar>
+              <w:top w:w="70.0" w:type="dxa"/>
+              <w:left w:w="90.0" w:type="dxa"/>
+              <w:bottom w:w="70.0" w:type="dxa"/>
+              <w:right w:w="90.0" w:type="dxa"/>
+            </w:tcMar>
+            <w:vAlign w:val="center"/>
+          </w:tcPr>
+          <w:p>
+            <w:pPr>
+              <w:jc w:val="left"/>
+              <w:spacing w:after="40" w:before="40" w:line="276" w:lineRule="auto"/>
+              <w:rPr/>
+            </w:pPr>
+            <w:r>
+              <w:rPr>
+                <w:rFonts w:ascii="Calibri" w:cs="Calibri" w:eastAsia="Calibri" w:hAnsi="Calibri"/>
+                <w:color w:val="0f172a"/>
+                <w:sz w:val="20"/>
+                <w:szCs w:val="20"/>
+                <w:rtl w:val="0"/>
+              </w:rPr>
+              <w:t xml:space="preserve">Chống lỗi tràn URL HTTP 414 từ AI Demand Forecast sang RFQ</w:t>
+            </w:r>
+          </w:p>
+        </w:tc>
+        <w:tc>
+          <w:tcPr>
+            <w:tcW w:w="1400" w:type="dxa"/>
+            <w:shd w:fill="ffffff" w:val="clear"/>
+            <w:tcMar>
+              <w:top w:w="70.0" w:type="dxa"/>
+              <w:left w:w="90.0" w:type="dxa"/>
+              <w:bottom w:w="70.0" w:type="dxa"/>
+              <w:right w:w="90.0" w:type="dxa"/>
+            </w:tcMar>
+            <w:vAlign w:val="center"/>
+          </w:tcPr>
+          <w:p>
+            <w:pPr>
+              <w:jc w:val="center"/>
+              <w:spacing w:after="40" w:before="40" w:line="276" w:lineRule="auto"/>
+              <w:rPr/>
+            </w:pPr>
+            <w:r>
+              <w:rPr>
+                <w:rFonts w:ascii="Calibri" w:cs="Calibri" w:eastAsia="Calibri" w:hAnsi="Calibri"/>
+                <w:b w:val="1"/>
+                <w:bCs w:val="1"/>
+                <w:color w:val="15803d"/>
+                <w:sz w:val="20"/>
+                <w:szCs w:val="20"/>
+                <w:rtl w:val="0"/>
+              </w:rPr>
+              <w:t xml:space="preserve">Done</w:t>
+            </w:r>
+          </w:p>
+        </w:tc>
+        <w:tc>
+          <w:tcPr>
+            <w:tcW w:w="7458" w:type="dxa"/>
+            <w:shd w:fill="ffffff" w:val="clear"/>
+            <w:tcMar>
+              <w:top w:w="70.0" w:type="dxa"/>
+              <w:left w:w="90.0" w:type="dxa"/>
+              <w:bottom w:w="70.0" w:type="dxa"/>
+              <w:right w:w="90.0" w:type="dxa"/>
+            </w:tcMar>
+            <w:vAlign w:val="center"/>
+          </w:tcPr>
+          <w:p>
+            <w:pPr>
+              <w:jc w:val="left"/>
+              <w:spacing w:after="40" w:before="40" w:line="276" w:lineRule="auto"/>
+              <w:rPr/>
+            </w:pPr>
+            <w:r>
+              <w:rPr>
+                <w:rFonts w:ascii="Calibri" w:cs="Calibri" w:eastAsia="Calibri" w:hAnsi="Calibri"/>
+                <w:color w:val="0f172a"/>
+                <w:sz w:val="20"/>
+                <w:szCs w:val="20"/>
+                <w:rtl w:val="0"/>
+              </w:rPr>
+              <w:t xml:space="preserve">Chuyển đổi cơ chế truyền danh sách SKU thuốc từ query URL parameters sang router state nội bộ và POST body (Nam - PR #227).</w:t>
+            </w:r>
+          </w:p>
+        </w:tc>
+      </w:tr>
+      <w:tr>
+        <w:trPr>
+          <w:cantSplit w:val="0"/>
+          <w:tblHeader w:val="0"/>
+        </w:trPr>
+        <w:tc>
+          <w:tcPr>
+            <w:tcW w:w="800" w:type="dxa"/>
+            <w:shd w:fill="f8fafc" w:val="clear"/>
+            <w:tcMar>
+              <w:top w:w="70.0" w:type="dxa"/>
+              <w:left w:w="90.0" w:type="dxa"/>
+              <w:bottom w:w="70.0" w:type="dxa"/>
+              <w:right w:w="90.0" w:type="dxa"/>
+            </w:tcMar>
+            <w:vAlign w:val="center"/>
+          </w:tcPr>
+          <w:p>
+            <w:pPr>
+              <w:jc w:val="center"/>
+              <w:spacing w:after="40" w:before="40" w:line="276" w:lineRule="auto"/>
+              <w:rPr/>
+            </w:pPr>
+            <w:r>
+              <w:rPr>
+                <w:rFonts w:ascii="Calibri" w:cs="Calibri" w:eastAsia="Calibri" w:hAnsi="Calibri"/>
+                <w:b w:val="1"/>
+                <w:bCs w:val="1"/>
+                <w:color w:val="475569"/>
+                <w:sz w:val="20"/>
+                <w:szCs w:val="20"/>
+                <w:rtl w:val="0"/>
+              </w:rPr>
+              <w:t xml:space="preserve">5</w:t>
+            </w:r>
+          </w:p>
+        </w:tc>
+        <w:tc>
+          <w:tcPr>
+            <w:tcW w:w="4300" w:type="dxa"/>
+            <w:shd w:fill="f8fafc" w:val="clear"/>
+            <w:tcMar>
+              <w:top w:w="70.0" w:type="dxa"/>
+              <w:left w:w="90.0" w:type="dxa"/>
+              <w:bottom w:w="70.0" w:type="dxa"/>
+              <w:right w:w="90.0" w:type="dxa"/>
+            </w:tcMar>
+            <w:vAlign w:val="center"/>
+          </w:tcPr>
+          <w:p>
+            <w:pPr>
+              <w:jc w:val="left"/>
+              <w:spacing w:after="40" w:before="40" w:line="276" w:lineRule="auto"/>
+              <w:rPr/>
+            </w:pPr>
+            <w:r>
+              <w:rPr>
+                <w:rFonts w:ascii="Calibri" w:cs="Calibri" w:eastAsia="Calibri" w:hAnsi="Calibri"/>
+                <w:color w:val="0f172a"/>
+                <w:sz w:val="20"/>
+                <w:szCs w:val="20"/>
+                <w:rtl w:val="0"/>
+              </w:rPr>
+              <w:t xml:space="preserve">Sửa logic hiển thị tồn kho và hoàn thiện UI tìm kiếm CustomerHeader</w:t>
+            </w:r>
+          </w:p>
+        </w:tc>
+        <w:tc>
+          <w:tcPr>
+            <w:tcW w:w="1400" w:type="dxa"/>
+            <w:shd w:fill="f8fafc" w:val="clear"/>
+            <w:tcMar>
+              <w:top w:w="70.0" w:type="dxa"/>
+              <w:left w:w="90.0" w:type="dxa"/>
+              <w:bottom w:w="70.0" w:type="dxa"/>
+              <w:right w:w="90.0" w:type="dxa"/>
+            </w:tcMar>
+            <w:vAlign w:val="center"/>
+          </w:tcPr>
+          <w:p>
+            <w:pPr>
+              <w:jc w:val="center"/>
+              <w:spacing w:after="40" w:before="40" w:line="276" w:lineRule="auto"/>
+              <w:rPr/>
+            </w:pPr>
+            <w:r>
+              <w:rPr>
+                <w:rFonts w:ascii="Calibri" w:cs="Calibri" w:eastAsia="Calibri" w:hAnsi="Calibri"/>
+                <w:b w:val="1"/>
+                <w:bCs w:val="1"/>
+                <w:color w:val="15803d"/>
+                <w:sz w:val="20"/>
+                <w:szCs w:val="20"/>
+                <w:rtl w:val="0"/>
+              </w:rPr>
+              <w:t xml:space="preserve">Done</w:t>
+            </w:r>
+          </w:p>
+        </w:tc>
+        <w:tc>
+          <w:tcPr>
+            <w:tcW w:w="7458" w:type="dxa"/>
+            <w:shd w:fill="f8fafc" w:val="clear"/>
+            <w:tcMar>
+              <w:top w:w="70.0" w:type="dxa"/>
+              <w:left w:w="90.0" w:type="dxa"/>
+              <w:bottom w:w="70.0" w:type="dxa"/>
+              <w:right w:w="90.0" w:type="dxa"/>
+            </w:tcMar>
+            <w:vAlign w:val="center"/>
+          </w:tcPr>
+          <w:p>
+            <w:pPr>
+              <w:jc w:val="left"/>
+              <w:spacing w:after="40" w:before="40" w:line="276" w:lineRule="auto"/>
+              <w:rPr/>
+            </w:pPr>
+            <w:r>
+              <w:rPr>
+                <w:rFonts w:ascii="Calibri" w:cs="Calibri" w:eastAsia="Calibri" w:hAnsi="Calibri"/>
+                <w:color w:val="0f172a"/>
+                <w:sz w:val="20"/>
+                <w:szCs w:val="20"/>
+                <w:rtl w:val="0"/>
+              </w:rPr>
+              <w:t xml:space="preserve">Hiển thị chính xác cảnh báo "Lệch kho" và "Hết hàng"; thanh tìm kiếm tràn viền mega dropdown không bị lộ nền xanh; thêm sticky footer modal chi tiết thuốc và fallback ảnh 404 (Phước).</w:t>
+            </w:r>
+          </w:p>
+        </w:tc>
+      </w:tr>
+    </w:tbl>
+    <w:p>
+      <w:pPr>
+        <w:pStyle w:val="Heading4"/>
+        <w:spacing w:after="40" w:before="120" w:line="276" w:lineRule="auto"/>
+        <w:rPr/>
+      </w:pPr>
+      <w:r>
+        <w:rPr>
+          <w:rFonts w:ascii="Calibri" w:cs="Calibri" w:eastAsia="Calibri" w:hAnsi="Calibri"/>
+          <w:b w:val="1"/>
+          <w:bCs w:val="1"/>
+          <w:color w:val="1e3a8a"/>
+          <w:sz w:val="22"/>
+          <w:szCs w:val="22"/>
+          <w:rtl w:val="0"/>
+        </w:rPr>
+        <w:t xml:space="preserve">Master plan</w:t>
+      </w:r>
+    </w:p>
+    <w:tbl>
+      <w:tblPr>
+        <w:tblStyle w:val="Table1"/>
+        <w:tblW w:w="13958.0" w:type="dxa"/>
+        <w:jc w:val="center"/>
+        <w:tblBorders>
+          <w:top w:color="cbd5e1" w:space="0" w:sz="4" w:val="single"/>
+          <w:left w:color="cbd5e1" w:space="0" w:sz="4" w:val="single"/>
+          <w:bottom w:color="cbd5e1" w:space="0" w:sz="4" w:val="single"/>
+          <w:right w:color="cbd5e1" w:space="0" w:sz="4" w:val="single"/>
+          <w:insideH w:color="cbd5e1" w:space="0" w:sz="4" w:val="single"/>
+          <w:insideV w:color="cbd5e1" w:space="0" w:sz="4" w:val="single"/>
+        </w:tblBorders>
+        <w:tblLayout w:type="fixed"/>
+        <w:tblLook w:val="0400"/>
+      </w:tblPr>
+      <w:tblGrid>
+        <w:gridCol w:w="800"/>
+        <w:gridCol w:w="4300"/>
+        <w:gridCol w:w="1400"/>
+        <w:gridCol w:w="7458"/>
+      </w:tblGrid>
+      <w:tr>
+        <w:trPr>
+          <w:cantSplit w:val="0"/>
+          <w:tblHeader w:val="1"/>
+        </w:trPr>
+        <w:tc>
+          <w:tcPr>
+            <w:tcW w:w="800" w:type="dxa"/>
+            <w:shd w:fill="1e3a8a" w:val="clear"/>
+            <w:tcMar>
+              <w:top w:w="70.0" w:type="dxa"/>
+              <w:left w:w="90.0" w:type="dxa"/>
+              <w:bottom w:w="70.0" w:type="dxa"/>
+              <w:right w:w="90.0" w:type="dxa"/>
+            </w:tcMar>
+            <w:vAlign w:val="center"/>
+          </w:tcPr>
+          <w:p>
+            <w:pPr>
+              <w:jc w:val="center"/>
+              <w:spacing w:after="40" w:before="40" w:line="276" w:lineRule="auto"/>
+              <w:rPr/>
+            </w:pPr>
+            <w:r>
+              <w:rPr>
+                <w:rFonts w:ascii="Calibri" w:cs="Calibri" w:eastAsia="Calibri" w:hAnsi="Calibri"/>
+                <w:b w:val="1"/>
+                <w:bCs w:val="1"/>
+                <w:color w:val="ffffff"/>
+                <w:sz w:val="20"/>
+                <w:szCs w:val="20"/>
+                <w:rtl w:val="0"/>
+              </w:rPr>
+              <w:t xml:space="preserve">#</w:t>
+            </w:r>
+          </w:p>
+        </w:tc>
+        <w:tc>
+          <w:tcPr>
+            <w:tcW w:w="4300" w:type="dxa"/>
+            <w:shd w:fill="1e3a8a" w:val="clear"/>
+            <w:tcMar>
+              <w:top w:w="70.0" w:type="dxa"/>
+              <w:left w:w="90.0" w:type="dxa"/>
+              <w:bottom w:w="70.0" w:type="dxa"/>
+              <w:right w:w="90.0" w:type="dxa"/>
+            </w:tcMar>
+            <w:vAlign w:val="center"/>
+          </w:tcPr>
+          <w:p>
+            <w:pPr>
+              <w:jc w:val="center"/>
+              <w:spacing w:after="40" w:before="40" w:line="276" w:lineRule="auto"/>
+              <w:rPr/>
+            </w:pPr>
+            <w:r>
+              <w:rPr>
+                <w:rFonts w:ascii="Calibri" w:cs="Calibri" w:eastAsia="Calibri" w:hAnsi="Calibri"/>
+                <w:b w:val="1"/>
+                <w:bCs w:val="1"/>
+                <w:color w:val="ffffff"/>
+                <w:sz w:val="20"/>
+                <w:szCs w:val="20"/>
+                <w:rtl w:val="0"/>
+              </w:rPr>
+              <w:t xml:space="preserve">Plan</w:t>
+            </w:r>
+          </w:p>
+        </w:tc>
+        <w:tc>
+          <w:tcPr>
+            <w:tcW w:w="1400" w:type="dxa"/>
+            <w:shd w:fill="1e3a8a" w:val="clear"/>
+            <w:tcMar>
+              <w:top w:w="70.0" w:type="dxa"/>
+              <w:left w:w="90.0" w:type="dxa"/>
+              <w:bottom w:w="70.0" w:type="dxa"/>
+              <w:right w:w="90.0" w:type="dxa"/>
+            </w:tcMar>
+            <w:vAlign w:val="center"/>
+          </w:tcPr>
+          <w:p>
+            <w:pPr>
+              <w:jc w:val="center"/>
+              <w:spacing w:after="40" w:before="40" w:line="276" w:lineRule="auto"/>
+              <w:rPr/>
+            </w:pPr>
+            <w:r>
+              <w:rPr>
+                <w:rFonts w:ascii="Calibri" w:cs="Calibri" w:eastAsia="Calibri" w:hAnsi="Calibri"/>
+                <w:b w:val="1"/>
+                <w:bCs w:val="1"/>
+                <w:color w:val="ffffff"/>
+                <w:sz w:val="20"/>
+                <w:szCs w:val="20"/>
+                <w:rtl w:val="0"/>
+              </w:rPr>
+              <w:t xml:space="preserve">Status</w:t>
+            </w:r>
+          </w:p>
+        </w:tc>
+        <w:tc>
+          <w:tcPr>
+            <w:tcW w:w="7458" w:type="dxa"/>
+            <w:shd w:fill="1e3a8a" w:val="clear"/>
+            <w:tcMar>
+              <w:top w:w="70.0" w:type="dxa"/>
+              <w:left w:w="90.0" w:type="dxa"/>
+              <w:bottom w:w="70.0" w:type="dxa"/>
+              <w:right w:w="90.0" w:type="dxa"/>
+            </w:tcMar>
+            <w:vAlign w:val="center"/>
+          </w:tcPr>
+          <w:p>
+            <w:pPr>
+              <w:jc w:val="center"/>
+              <w:spacing w:after="40" w:before="40" w:line="276" w:lineRule="auto"/>
+              <w:rPr/>
+            </w:pPr>
+            <w:r>
+              <w:rPr>
+                <w:rFonts w:ascii="Calibri" w:cs="Calibri" w:eastAsia="Calibri" w:hAnsi="Calibri"/>
+                <w:b w:val="1"/>
+                <w:bCs w:val="1"/>
+                <w:color w:val="ffffff"/>
+                <w:sz w:val="20"/>
+                <w:szCs w:val="20"/>
+                <w:rtl w:val="0"/>
+              </w:rPr>
+              <w:t xml:space="preserve">Actual</w:t>
+            </w:r>
+          </w:p>
+        </w:tc>
+      </w:tr>
+      <w:tr>
+        <w:trPr>
+          <w:cantSplit w:val="0"/>
+          <w:tblHeader w:val="0"/>
+        </w:trPr>
+        <w:tc>
+          <w:tcPr>
+            <w:tcW w:w="800" w:type="dxa"/>
+            <w:shd w:fill="f8fafc" w:val="clear"/>
+            <w:tcMar>
+              <w:top w:w="70.0" w:type="dxa"/>
+              <w:left w:w="90.0" w:type="dxa"/>
+              <w:bottom w:w="70.0" w:type="dxa"/>
+              <w:right w:w="90.0" w:type="dxa"/>
+            </w:tcMar>
+            <w:vAlign w:val="center"/>
+          </w:tcPr>
+          <w:p>
+            <w:pPr>
+              <w:jc w:val="center"/>
+              <w:spacing w:after="40" w:before="40" w:line="276" w:lineRule="auto"/>
+              <w:rPr/>
+            </w:pPr>
+            <w:r>
+              <w:rPr>
+                <w:rFonts w:ascii="Calibri" w:cs="Calibri" w:eastAsia="Calibri" w:hAnsi="Calibri"/>
+                <w:b w:val="1"/>
+                <w:bCs w:val="1"/>
+                <w:color w:val="475569"/>
+                <w:sz w:val="20"/>
+                <w:szCs w:val="20"/>
+                <w:rtl w:val="0"/>
+              </w:rPr>
+              <w:t xml:space="preserve">1</w:t>
+            </w:r>
+          </w:p>
+        </w:tc>
+        <w:tc>
+          <w:tcPr>
+            <w:tcW w:w="4300" w:type="dxa"/>
+            <w:shd w:fill="f8fafc" w:val="clear"/>
+            <w:tcMar>
+              <w:top w:w="70.0" w:type="dxa"/>
+              <w:left w:w="90.0" w:type="dxa"/>
+              <w:bottom w:w="70.0" w:type="dxa"/>
+              <w:right w:w="90.0" w:type="dxa"/>
+            </w:tcMar>
+            <w:vAlign w:val="center"/>
+          </w:tcPr>
+          <w:p>
+            <w:pPr>
+              <w:jc w:val="left"/>
+              <w:spacing w:after="40" w:before="40" w:line="276" w:lineRule="auto"/>
+              <w:rPr/>
+            </w:pPr>
+            <w:r>
+              <w:rPr>
+                <w:rFonts w:ascii="Calibri" w:cs="Calibri" w:eastAsia="Calibri" w:hAnsi="Calibri"/>
+                <w:color w:val="0f172a"/>
+                <w:sz w:val="20"/>
+                <w:szCs w:val="20"/>
+                <w:rtl w:val="0"/>
+              </w:rPr>
+              <w:t xml:space="preserve">Chấm công GPS Geofencing Mobile (SCRUM-97)</w:t>
+            </w:r>
+          </w:p>
+        </w:tc>
+        <w:tc>
+          <w:tcPr>
+            <w:tcW w:w="1400" w:type="dxa"/>
+            <w:shd w:fill="f8fafc" w:val="clear"/>
+            <w:tcMar>
+              <w:top w:w="70.0" w:type="dxa"/>
+              <w:left w:w="90.0" w:type="dxa"/>
+              <w:bottom w:w="70.0" w:type="dxa"/>
+              <w:right w:w="90.0" w:type="dxa"/>
+            </w:tcMar>
+            <w:vAlign w:val="center"/>
+          </w:tcPr>
+          <w:p>
+            <w:pPr>
+              <w:jc w:val="center"/>
+              <w:spacing w:after="40" w:before="40" w:line="276" w:lineRule="auto"/>
+              <w:rPr/>
+            </w:pPr>
+            <w:r>
+              <w:rPr>
+                <w:rFonts w:ascii="Calibri" w:cs="Calibri" w:eastAsia="Calibri" w:hAnsi="Calibri"/>
+                <w:b w:val="1"/>
+                <w:bCs w:val="1"/>
+                <w:color w:val="15803d"/>
+                <w:sz w:val="20"/>
+                <w:szCs w:val="20"/>
+                <w:rtl w:val="0"/>
+              </w:rPr>
+              <w:t xml:space="preserve">Done</w:t>
+            </w:r>
+          </w:p>
+        </w:tc>
+        <w:tc>
+          <w:tcPr>
+            <w:tcW w:w="7458" w:type="dxa"/>
+            <w:shd w:fill="f8fafc" w:val="clear"/>
+            <w:tcMar>
+              <w:top w:w="70.0" w:type="dxa"/>
+              <w:left w:w="90.0" w:type="dxa"/>
+              <w:bottom w:w="70.0" w:type="dxa"/>
+              <w:right w:w="90.0" w:type="dxa"/>
+            </w:tcMar>
+            <w:vAlign w:val="center"/>
+          </w:tcPr>
+          <w:p>
+            <w:pPr>
+              <w:jc w:val="left"/>
+              <w:spacing w:after="40" w:before="40" w:line="276" w:lineRule="auto"/>
+              <w:rPr/>
+            </w:pPr>
+            <w:r>
+              <w:rPr>
+                <w:rFonts w:ascii="Calibri" w:cs="Calibri" w:eastAsia="Calibri" w:hAnsi="Calibri"/>
+                <w:color w:val="0f172a"/>
+                <w:sz w:val="20"/>
+                <w:szCs w:val="20"/>
+                <w:rtl w:val="0"/>
+              </w:rPr>
+              <w:t xml:space="preserve">Triển khai chấm công di động xác thực vị trí chi nhánh nhà thuốc qua GPS Geofencing, kiểm tra bán kính tọa độ hợp lệ và chống gian lận (Phúc).</w:t>
+            </w:r>
+          </w:p>
+        </w:tc>
+      </w:tr>
+      <w:tr>
+        <w:trPr>
+          <w:cantSplit w:val="0"/>
+          <w:tblHeader w:val="0"/>
+        </w:trPr>
+        <w:tc>
+          <w:tcPr>
+            <w:tcW w:w="800" w:type="dxa"/>
+            <w:shd w:fill="ffffff" w:val="clear"/>
+            <w:tcMar>
+              <w:top w:w="70.0" w:type="dxa"/>
+              <w:left w:w="90.0" w:type="dxa"/>
+              <w:bottom w:w="70.0" w:type="dxa"/>
+              <w:right w:w="90.0" w:type="dxa"/>
+            </w:tcMar>
+            <w:vAlign w:val="center"/>
+          </w:tcPr>
+          <w:p>
+            <w:pPr>
+              <w:jc w:val="center"/>
+              <w:spacing w:after="40" w:before="40" w:line="276" w:lineRule="auto"/>
+              <w:rPr/>
+            </w:pPr>
+            <w:r>
+              <w:rPr>
+                <w:rFonts w:ascii="Calibri" w:cs="Calibri" w:eastAsia="Calibri" w:hAnsi="Calibri"/>
+                <w:b w:val="1"/>
+                <w:bCs w:val="1"/>
+                <w:color w:val="475569"/>
+                <w:sz w:val="20"/>
+                <w:szCs w:val="20"/>
+                <w:rtl w:val="0"/>
+              </w:rPr>
+              <w:t xml:space="preserve">2</w:t>
+            </w:r>
+          </w:p>
+        </w:tc>
+        <w:tc>
+          <w:tcPr>
+            <w:tcW w:w="4300" w:type="dxa"/>
+            <w:shd w:fill="ffffff" w:val="clear"/>
+            <w:tcMar>
+              <w:top w:w="70.0" w:type="dxa"/>
+              <w:left w:w="90.0" w:type="dxa"/>
+              <w:bottom w:w="70.0" w:type="dxa"/>
+              <w:right w:w="90.0" w:type="dxa"/>
+            </w:tcMar>
+            <w:vAlign w:val="center"/>
+          </w:tcPr>
+          <w:p>
+            <w:pPr>
+              <w:jc w:val="left"/>
+              <w:spacing w:after="40" w:before="40" w:line="276" w:lineRule="auto"/>
+              <w:rPr/>
+            </w:pPr>
+            <w:r>
+              <w:rPr>
+                <w:rFonts w:ascii="Calibri" w:cs="Calibri" w:eastAsia="Calibri" w:hAnsi="Calibri"/>
+                <w:color w:val="0f172a"/>
+                <w:sz w:val="20"/>
+                <w:szCs w:val="20"/>
+                <w:rtl w:val="0"/>
+              </w:rPr>
+              <w:t xml:space="preserve">Tính Lương theo ca trực &amp; Xuất phiếu lương Mobile (SCRUM-98)</w:t>
+            </w:r>
+          </w:p>
+        </w:tc>
+        <w:tc>
+          <w:tcPr>
+            <w:tcW w:w="1400" w:type="dxa"/>
+            <w:shd w:fill="ffffff" w:val="clear"/>
+            <w:tcMar>
+              <w:top w:w="70.0" w:type="dxa"/>
+              <w:left w:w="90.0" w:type="dxa"/>
+              <w:bottom w:w="70.0" w:type="dxa"/>
+              <w:right w:w="90.0" w:type="dxa"/>
+            </w:tcMar>
+            <w:vAlign w:val="center"/>
+          </w:tcPr>
+          <w:p>
+            <w:pPr>
+              <w:jc w:val="center"/>
+              <w:spacing w:after="40" w:before="40" w:line="276" w:lineRule="auto"/>
+              <w:rPr/>
+            </w:pPr>
+            <w:r>
+              <w:rPr>
+                <w:rFonts w:ascii="Calibri" w:cs="Calibri" w:eastAsia="Calibri" w:hAnsi="Calibri"/>
+                <w:b w:val="1"/>
+                <w:bCs w:val="1"/>
+                <w:color w:val="15803d"/>
+                <w:sz w:val="20"/>
+                <w:szCs w:val="20"/>
+                <w:rtl w:val="0"/>
+              </w:rPr>
+              <w:t xml:space="preserve">Done</w:t>
+            </w:r>
+          </w:p>
+        </w:tc>
+        <w:tc>
+          <w:tcPr>
+            <w:tcW w:w="7458" w:type="dxa"/>
+            <w:shd w:fill="ffffff" w:val="clear"/>
+            <w:tcMar>
+              <w:top w:w="70.0" w:type="dxa"/>
+              <w:left w:w="90.0" w:type="dxa"/>
+              <w:bottom w:w="70.0" w:type="dxa"/>
+              <w:right w:w="90.0" w:type="dxa"/>
+            </w:tcMar>
+            <w:vAlign w:val="center"/>
+          </w:tcPr>
+          <w:p>
+            <w:pPr>
+              <w:jc w:val="left"/>
+              <w:spacing w:after="40" w:before="40" w:line="276" w:lineRule="auto"/>
+              <w:rPr/>
+            </w:pPr>
+            <w:r>
+              <w:rPr>
+                <w:rFonts w:ascii="Calibri" w:cs="Calibri" w:eastAsia="Calibri" w:hAnsi="Calibri"/>
+                <w:color w:val="0f172a"/>
+                <w:sz w:val="20"/>
+                <w:szCs w:val="20"/>
+                <w:rtl w:val="0"/>
+              </w:rPr>
+              <w:t xml:space="preserve">Tính toán tự động lương theo ca trực, phụ cấp, giảm trừ và cho phép nhân viên xem phiếu lương (payslips) chi tiết trên mobile (Phúc).</w:t>
+            </w:r>
+          </w:p>
+        </w:tc>
+      </w:tr>
+      <w:tr>
+        <w:trPr>
+          <w:cantSplit w:val="0"/>
+          <w:tblHeader w:val="0"/>
+        </w:trPr>
+        <w:tc>
+          <w:tcPr>
+            <w:tcW w:w="800" w:type="dxa"/>
+            <w:shd w:fill="f8fafc" w:val="clear"/>
+            <w:tcMar>
+              <w:top w:w="70.0" w:type="dxa"/>
+              <w:left w:w="90.0" w:type="dxa"/>
+              <w:bottom w:w="70.0" w:type="dxa"/>
+              <w:right w:w="90.0" w:type="dxa"/>
+            </w:tcMar>
+            <w:vAlign w:val="center"/>
+          </w:tcPr>
+          <w:p>
+            <w:pPr>
+              <w:jc w:val="center"/>
+              <w:spacing w:after="40" w:before="40" w:line="276" w:lineRule="auto"/>
+              <w:rPr/>
+            </w:pPr>
+            <w:r>
+              <w:rPr>
+                <w:rFonts w:ascii="Calibri" w:cs="Calibri" w:eastAsia="Calibri" w:hAnsi="Calibri"/>
+                <w:b w:val="1"/>
+                <w:bCs w:val="1"/>
+                <w:color w:val="475569"/>
+                <w:sz w:val="20"/>
+                <w:szCs w:val="20"/>
+                <w:rtl w:val="0"/>
+              </w:rPr>
+              <w:t xml:space="preserve">3</w:t>
+            </w:r>
+          </w:p>
+        </w:tc>
+        <w:tc>
+          <w:tcPr>
+            <w:tcW w:w="4300" w:type="dxa"/>
+            <w:shd w:fill="f8fafc" w:val="clear"/>
+            <w:tcMar>
+              <w:top w:w="70.0" w:type="dxa"/>
+              <w:left w:w="90.0" w:type="dxa"/>
+              <w:bottom w:w="70.0" w:type="dxa"/>
+              <w:right w:w="90.0" w:type="dxa"/>
+            </w:tcMar>
+            <w:vAlign w:val="center"/>
+          </w:tcPr>
+          <w:p>
+            <w:pPr>
+              <w:jc w:val="left"/>
+              <w:spacing w:after="40" w:before="40" w:line="276" w:lineRule="auto"/>
+              <w:rPr/>
+            </w:pPr>
+            <w:r>
+              <w:rPr>
+                <w:rFonts w:ascii="Calibri" w:cs="Calibri" w:eastAsia="Calibri" w:hAnsi="Calibri"/>
+                <w:color w:val="0f172a"/>
+                <w:sz w:val="20"/>
+                <w:szCs w:val="20"/>
+                <w:rtl w:val="0"/>
+              </w:rPr>
+              <w:t xml:space="preserve">Quản lý Chứng chỉ Dược sĩ GPP &amp; Đăng nhập Vân tay (SCRUM-96, SCRUM-99)</w:t>
+            </w:r>
+          </w:p>
+        </w:tc>
+        <w:tc>
+          <w:tcPr>
+            <w:tcW w:w="1400" w:type="dxa"/>
+            <w:shd w:fill="f8fafc" w:val="clear"/>
+            <w:tcMar>
+              <w:top w:w="70.0" w:type="dxa"/>
+              <w:left w:w="90.0" w:type="dxa"/>
+              <w:bottom w:w="70.0" w:type="dxa"/>
+              <w:right w:w="90.0" w:type="dxa"/>
+            </w:tcMar>
+            <w:vAlign w:val="center"/>
+          </w:tcPr>
+          <w:p>
+            <w:pPr>
+              <w:jc w:val="center"/>
+              <w:spacing w:after="40" w:before="40" w:line="276" w:lineRule="auto"/>
+              <w:rPr/>
+            </w:pPr>
+            <w:r>
+              <w:rPr>
+                <w:rFonts w:ascii="Calibri" w:cs="Calibri" w:eastAsia="Calibri" w:hAnsi="Calibri"/>
+                <w:b w:val="1"/>
+                <w:bCs w:val="1"/>
+                <w:color w:val="15803d"/>
+                <w:sz w:val="20"/>
+                <w:szCs w:val="20"/>
+                <w:rtl w:val="0"/>
+              </w:rPr>
+              <w:t xml:space="preserve">Done</w:t>
+            </w:r>
+          </w:p>
+        </w:tc>
+        <w:tc>
+          <w:tcPr>
+            <w:tcW w:w="7458" w:type="dxa"/>
+            <w:shd w:fill="f8fafc" w:val="clear"/>
+            <w:tcMar>
+              <w:top w:w="70.0" w:type="dxa"/>
+              <w:left w:w="90.0" w:type="dxa"/>
+              <w:bottom w:w="70.0" w:type="dxa"/>
+              <w:right w:w="90.0" w:type="dxa"/>
+            </w:tcMar>
+            <w:vAlign w:val="center"/>
+          </w:tcPr>
+          <w:p>
+            <w:pPr>
+              <w:jc w:val="left"/>
+              <w:spacing w:after="40" w:before="40" w:line="276" w:lineRule="auto"/>
+              <w:rPr/>
+            </w:pPr>
+            <w:r>
+              <w:rPr>
+                <w:rFonts w:ascii="Calibri" w:cs="Calibri" w:eastAsia="Calibri" w:hAnsi="Calibri"/>
+                <w:color w:val="0f172a"/>
+                <w:sz w:val="20"/>
+                <w:szCs w:val="20"/>
+                <w:rtl w:val="0"/>
+              </w:rPr>
+              <w:t xml:space="preserve">Nộp và duyệt chứng chỉ hành nghề GPP; tích hợp đăng nhập bảo mật bằng sinh trắc học vân tay / FaceID (SCRUM-99); tự động gửi email khi tạo nhân viên mới (Phúc).</w:t>
+            </w:r>
+          </w:p>
+        </w:tc>
+      </w:tr>
+      <w:tr>
+        <w:trPr>
+          <w:cantSplit w:val="0"/>
+          <w:tblHeader w:val="0"/>
+        </w:trPr>
+        <w:tc>
+          <w:tcPr>
+            <w:tcW w:w="800" w:type="dxa"/>
+            <w:shd w:fill="ffffff" w:val="clear"/>
+            <w:tcMar>
+              <w:top w:w="70.0" w:type="dxa"/>
+              <w:left w:w="90.0" w:type="dxa"/>
+              <w:bottom w:w="70.0" w:type="dxa"/>
+              <w:right w:w="90.0" w:type="dxa"/>
+            </w:tcMar>
+            <w:vAlign w:val="center"/>
+          </w:tcPr>
+          <w:p>
+            <w:pPr>
+              <w:jc w:val="center"/>
+              <w:spacing w:after="40" w:before="40" w:line="276" w:lineRule="auto"/>
+              <w:rPr/>
+            </w:pPr>
+            <w:r>
+              <w:rPr>
+                <w:rFonts w:ascii="Calibri" w:cs="Calibri" w:eastAsia="Calibri" w:hAnsi="Calibri"/>
+                <w:b w:val="1"/>
+                <w:bCs w:val="1"/>
+                <w:color w:val="475569"/>
+                <w:sz w:val="20"/>
+                <w:szCs w:val="20"/>
+                <w:rtl w:val="0"/>
+              </w:rPr>
+              <w:t xml:space="preserve">4</w:t>
+            </w:r>
+          </w:p>
+        </w:tc>
+        <w:tc>
+          <w:tcPr>
+            <w:tcW w:w="4300" w:type="dxa"/>
+            <w:shd w:fill="ffffff" w:val="clear"/>
+            <w:tcMar>
+              <w:top w:w="70.0" w:type="dxa"/>
+              <w:left w:w="90.0" w:type="dxa"/>
+              <w:bottom w:w="70.0" w:type="dxa"/>
+              <w:right w:w="90.0" w:type="dxa"/>
+            </w:tcMar>
+            <w:vAlign w:val="center"/>
+          </w:tcPr>
+          <w:p>
+            <w:pPr>
+              <w:jc w:val="left"/>
+              <w:spacing w:after="40" w:before="40" w:line="276" w:lineRule="auto"/>
+              <w:rPr/>
+            </w:pPr>
+            <w:r>
+              <w:rPr>
+                <w:rFonts w:ascii="Calibri" w:cs="Calibri" w:eastAsia="Calibri" w:hAnsi="Calibri"/>
+                <w:color w:val="0f172a"/>
+                <w:sz w:val="20"/>
+                <w:szCs w:val="20"/>
+                <w:rtl w:val="0"/>
+              </w:rPr>
+              <w:t xml:space="preserve">Quản lý Kho GSP 2D/3D &amp; Lưu trữ FEFO (feat/2d-3d_warehouse)</w:t>
+            </w:r>
+          </w:p>
+        </w:tc>
+        <w:tc>
+          <w:tcPr>
+            <w:tcW w:w="1400" w:type="dxa"/>
+            <w:shd w:fill="ffffff" w:val="clear"/>
+            <w:tcMar>
+              <w:top w:w="70.0" w:type="dxa"/>
+              <w:left w:w="90.0" w:type="dxa"/>
+              <w:bottom w:w="70.0" w:type="dxa"/>
+              <w:right w:w="90.0" w:type="dxa"/>
+            </w:tcMar>
+            <w:vAlign w:val="center"/>
+          </w:tcPr>
+          <w:p>
+            <w:pPr>
+              <w:jc w:val="center"/>
+              <w:spacing w:after="40" w:before="40" w:line="276" w:lineRule="auto"/>
+              <w:rPr/>
+            </w:pPr>
+            <w:r>
+              <w:rPr>
+                <w:rFonts w:ascii="Calibri" w:cs="Calibri" w:eastAsia="Calibri" w:hAnsi="Calibri"/>
+                <w:b w:val="1"/>
+                <w:bCs w:val="1"/>
+                <w:color w:val="15803d"/>
+                <w:sz w:val="20"/>
+                <w:szCs w:val="20"/>
+                <w:rtl w:val="0"/>
+              </w:rPr>
+              <w:t xml:space="preserve">Done</w:t>
+            </w:r>
+          </w:p>
+        </w:tc>
+        <w:tc>
+          <w:tcPr>
+            <w:tcW w:w="7458" w:type="dxa"/>
+            <w:shd w:fill="ffffff" w:val="clear"/>
+            <w:tcMar>
+              <w:top w:w="70.0" w:type="dxa"/>
+              <w:left w:w="90.0" w:type="dxa"/>
+              <w:bottom w:w="70.0" w:type="dxa"/>
+              <w:right w:w="90.0" w:type="dxa"/>
+            </w:tcMar>
+            <w:vAlign w:val="center"/>
+          </w:tcPr>
+          <w:p>
+            <w:pPr>
+              <w:jc w:val="left"/>
+              <w:spacing w:after="40" w:before="40" w:line="276" w:lineRule="auto"/>
+              <w:rPr/>
+            </w:pPr>
+            <w:r>
+              <w:rPr>
+                <w:rFonts w:ascii="Calibri" w:cs="Calibri" w:eastAsia="Calibri" w:hAnsi="Calibri"/>
+                <w:color w:val="0f172a"/>
+                <w:sz w:val="20"/>
+                <w:szCs w:val="20"/>
+                <w:rtl w:val="0"/>
+              </w:rPr>
+              <w:t xml:space="preserve">Bổ sung kệ dự trữ RES4, đồng bộ layout 4 dãy (RES1 – RES4) chuẩn FEFO; tự động gán ô kệ (Auto Bin Location); highlight đỏ lô quá hạn; modal Reserve Bin Detail; xuất hủy thuốc quá hạn; tích hợp hoàn chỉnh Sơ đồ kho 3D tương tác (WarehouseMap3D.tsx) (Đạt - PR #226).</w:t>
+            </w:r>
+          </w:p>
+        </w:tc>
+      </w:tr>
+      <w:tr>
+        <w:trPr>
+          <w:cantSplit w:val="0"/>
+          <w:tblHeader w:val="0"/>
+        </w:trPr>
+        <w:tc>
+          <w:tcPr>
+            <w:tcW w:w="800" w:type="dxa"/>
+            <w:shd w:fill="f8fafc" w:val="clear"/>
+            <w:tcMar>
+              <w:top w:w="70.0" w:type="dxa"/>
+              <w:left w:w="90.0" w:type="dxa"/>
+              <w:bottom w:w="70.0" w:type="dxa"/>
+              <w:right w:w="90.0" w:type="dxa"/>
+            </w:tcMar>
+            <w:vAlign w:val="center"/>
+          </w:tcPr>
+          <w:p>
+            <w:pPr>
+              <w:jc w:val="center"/>
+              <w:spacing w:after="40" w:before="40" w:line="276" w:lineRule="auto"/>
+              <w:rPr/>
+            </w:pPr>
+            <w:r>
+              <w:rPr>
+                <w:rFonts w:ascii="Calibri" w:cs="Calibri" w:eastAsia="Calibri" w:hAnsi="Calibri"/>
+                <w:b w:val="1"/>
+                <w:bCs w:val="1"/>
+                <w:color w:val="475569"/>
+                <w:sz w:val="20"/>
+                <w:szCs w:val="20"/>
+                <w:rtl w:val="0"/>
+              </w:rPr>
+              <w:t xml:space="preserve">5</w:t>
+            </w:r>
+          </w:p>
+        </w:tc>
+        <w:tc>
+          <w:tcPr>
+            <w:tcW w:w="4300" w:type="dxa"/>
+            <w:shd w:fill="f8fafc" w:val="clear"/>
+            <w:tcMar>
+              <w:top w:w="70.0" w:type="dxa"/>
+              <w:left w:w="90.0" w:type="dxa"/>
+              <w:bottom w:w="70.0" w:type="dxa"/>
+              <w:right w:w="90.0" w:type="dxa"/>
+            </w:tcMar>
+            <w:vAlign w:val="center"/>
+          </w:tcPr>
+          <w:p>
+            <w:pPr>
+              <w:jc w:val="left"/>
+              <w:spacing w:after="40" w:before="40" w:line="276" w:lineRule="auto"/>
+              <w:rPr/>
+            </w:pPr>
+            <w:r>
+              <w:rPr>
+                <w:rFonts w:ascii="Calibri" w:cs="Calibri" w:eastAsia="Calibri" w:hAnsi="Calibri"/>
+                <w:color w:val="0f172a"/>
+                <w:sz w:val="20"/>
+                <w:szCs w:val="20"/>
+                <w:rtl w:val="0"/>
+              </w:rPr>
+              <w:t xml:space="preserve">Hệ thống Khuyến mãi Voucher Mua X Tặng Y (Buy X Get Y)</w:t>
+            </w:r>
+          </w:p>
+        </w:tc>
+        <w:tc>
+          <w:tcPr>
+            <w:tcW w:w="1400" w:type="dxa"/>
+            <w:shd w:fill="f8fafc" w:val="clear"/>
+            <w:tcMar>
+              <w:top w:w="70.0" w:type="dxa"/>
+              <w:left w:w="90.0" w:type="dxa"/>
+              <w:bottom w:w="70.0" w:type="dxa"/>
+              <w:right w:w="90.0" w:type="dxa"/>
+            </w:tcMar>
+            <w:vAlign w:val="center"/>
+          </w:tcPr>
+          <w:p>
+            <w:pPr>
+              <w:jc w:val="center"/>
+              <w:spacing w:after="40" w:before="40" w:line="276" w:lineRule="auto"/>
+              <w:rPr/>
+            </w:pPr>
+            <w:r>
+              <w:rPr>
+                <w:rFonts w:ascii="Calibri" w:cs="Calibri" w:eastAsia="Calibri" w:hAnsi="Calibri"/>
+                <w:b w:val="1"/>
+                <w:bCs w:val="1"/>
+                <w:color w:val="15803d"/>
+                <w:sz w:val="20"/>
+                <w:szCs w:val="20"/>
+                <w:rtl w:val="0"/>
+              </w:rPr>
+              <w:t xml:space="preserve">Done</w:t>
+            </w:r>
+          </w:p>
+        </w:tc>
+        <w:tc>
+          <w:tcPr>
+            <w:tcW w:w="7458" w:type="dxa"/>
+            <w:shd w:fill="f8fafc" w:val="clear"/>
+            <w:tcMar>
+              <w:top w:w="70.0" w:type="dxa"/>
+              <w:left w:w="90.0" w:type="dxa"/>
+              <w:bottom w:w="70.0" w:type="dxa"/>
+              <w:right w:w="90.0" w:type="dxa"/>
+            </w:tcMar>
+            <w:vAlign w:val="center"/>
+          </w:tcPr>
+          <w:p>
+            <w:pPr>
+              <w:jc w:val="left"/>
+              <w:spacing w:after="40" w:before="40" w:line="276" w:lineRule="auto"/>
+              <w:rPr/>
+            </w:pPr>
+            <w:r>
+              <w:rPr>
+                <w:rFonts w:ascii="Calibri" w:cs="Calibri" w:eastAsia="Calibri" w:hAnsi="Calibri"/>
+                <w:color w:val="0f172a"/>
+                <w:sz w:val="20"/>
+                <w:szCs w:val="20"/>
+                <w:rtl w:val="0"/>
+              </w:rPr>
+              <w:t xml:space="preserve">Mở rộng Schema Voucher, tích hợp khuyến mãi Mua X Tặng Y đồng bộ POS và Giỏ hàng Online; tự động trừ kho Online từ Kho Tổng GSP (CENTRAL_WH) và gán quà tặng (isGiftItem: true) (Đạt).</w:t>
+            </w:r>
+          </w:p>
+        </w:tc>
+      </w:tr>
+      <w:tr>
+        <w:trPr>
+          <w:cantSplit w:val="0"/>
+          <w:tblHeader w:val="0"/>
+        </w:trPr>
+        <w:tc>
+          <w:tcPr>
+            <w:tcW w:w="800" w:type="dxa"/>
+            <w:shd w:fill="ffffff" w:val="clear"/>
+            <w:tcMar>
+              <w:top w:w="70.0" w:type="dxa"/>
+              <w:left w:w="90.0" w:type="dxa"/>
+              <w:bottom w:w="70.0" w:type="dxa"/>
+              <w:right w:w="90.0" w:type="dxa"/>
+            </w:tcMar>
+            <w:vAlign w:val="center"/>
+          </w:tcPr>
+          <w:p>
+            <w:pPr>
+              <w:jc w:val="center"/>
+              <w:spacing w:after="40" w:before="40" w:line="276" w:lineRule="auto"/>
+              <w:rPr/>
+            </w:pPr>
+            <w:r>
+              <w:rPr>
+                <w:rFonts w:ascii="Calibri" w:cs="Calibri" w:eastAsia="Calibri" w:hAnsi="Calibri"/>
+                <w:b w:val="1"/>
+                <w:bCs w:val="1"/>
+                <w:color w:val="475569"/>
+                <w:sz w:val="20"/>
+                <w:szCs w:val="20"/>
+                <w:rtl w:val="0"/>
+              </w:rPr>
+              <w:t xml:space="preserve">6</w:t>
+            </w:r>
+          </w:p>
+        </w:tc>
+        <w:tc>
+          <w:tcPr>
+            <w:tcW w:w="4300" w:type="dxa"/>
+            <w:shd w:fill="ffffff" w:val="clear"/>
+            <w:tcMar>
+              <w:top w:w="70.0" w:type="dxa"/>
+              <w:left w:w="90.0" w:type="dxa"/>
+              <w:bottom w:w="70.0" w:type="dxa"/>
+              <w:right w:w="90.0" w:type="dxa"/>
+            </w:tcMar>
+            <w:vAlign w:val="center"/>
+          </w:tcPr>
+          <w:p>
+            <w:pPr>
+              <w:jc w:val="left"/>
+              <w:spacing w:after="40" w:before="40" w:line="276" w:lineRule="auto"/>
+              <w:rPr/>
+            </w:pPr>
+            <w:r>
+              <w:rPr>
+                <w:rFonts w:ascii="Calibri" w:cs="Calibri" w:eastAsia="Calibri" w:hAnsi="Calibri"/>
+                <w:color w:val="0f172a"/>
+                <w:sz w:val="20"/>
+                <w:szCs w:val="20"/>
+                <w:rtl w:val="0"/>
+              </w:rPr>
+              <w:t xml:space="preserve">Hệ thống Email Marketing Tự Động (Newsletter &amp; Khuyến mãi - UC-76)</w:t>
+            </w:r>
+          </w:p>
+        </w:tc>
+        <w:tc>
+          <w:tcPr>
+            <w:tcW w:w="1400" w:type="dxa"/>
+            <w:shd w:fill="ffffff" w:val="clear"/>
+            <w:tcMar>
+              <w:top w:w="70.0" w:type="dxa"/>
+              <w:left w:w="90.0" w:type="dxa"/>
+              <w:bottom w:w="70.0" w:type="dxa"/>
+              <w:right w:w="90.0" w:type="dxa"/>
+            </w:tcMar>
+            <w:vAlign w:val="center"/>
+          </w:tcPr>
+          <w:p>
+            <w:pPr>
+              <w:jc w:val="center"/>
+              <w:spacing w:after="40" w:before="40" w:line="276" w:lineRule="auto"/>
+              <w:rPr/>
+            </w:pPr>
+            <w:r>
+              <w:rPr>
+                <w:rFonts w:ascii="Calibri" w:cs="Calibri" w:eastAsia="Calibri" w:hAnsi="Calibri"/>
+                <w:b w:val="1"/>
+                <w:bCs w:val="1"/>
+                <w:color w:val="15803d"/>
+                <w:sz w:val="20"/>
+                <w:szCs w:val="20"/>
+                <w:rtl w:val="0"/>
+              </w:rPr>
+              <w:t xml:space="preserve">Done</w:t>
+            </w:r>
+          </w:p>
+        </w:tc>
+        <w:tc>
+          <w:tcPr>
+            <w:tcW w:w="7458" w:type="dxa"/>
+            <w:shd w:fill="ffffff" w:val="clear"/>
+            <w:tcMar>
+              <w:top w:w="70.0" w:type="dxa"/>
+              <w:left w:w="90.0" w:type="dxa"/>
+              <w:bottom w:w="70.0" w:type="dxa"/>
+              <w:right w:w="90.0" w:type="dxa"/>
+            </w:tcMar>
+            <w:vAlign w:val="center"/>
+          </w:tcPr>
+          <w:p>
+            <w:pPr>
+              <w:jc w:val="left"/>
+              <w:spacing w:after="40" w:before="40" w:line="276" w:lineRule="auto"/>
+              <w:rPr/>
+            </w:pPr>
+            <w:r>
+              <w:rPr>
+                <w:rFonts w:ascii="Calibri" w:cs="Calibri" w:eastAsia="Calibri" w:hAnsi="Calibri"/>
+                <w:color w:val="0f172a"/>
+                <w:sz w:val="20"/>
+                <w:szCs w:val="20"/>
+                <w:rtl w:val="0"/>
+              </w:rPr>
+              <w:t xml:space="preserve">Hoàn tất soạn thảo chiến dịch, gửi thử SMTP thật, phân nhóm thực tế ALL &amp; VIP, bộ thao tác Sửa/Hủy lịch/Xóa kèm Optimistic UI; viết xong tài liệu đặc tả UC76_HE_THONG_EMAIL_MARKETING_TU_DONG.md (Đạt).</w:t>
+            </w:r>
+          </w:p>
+        </w:tc>
+      </w:tr>
+      <w:tr>
+        <w:trPr>
+          <w:cantSplit w:val="0"/>
+          <w:tblHeader w:val="0"/>
+        </w:trPr>
+        <w:tc>
+          <w:tcPr>
+            <w:tcW w:w="800" w:type="dxa"/>
+            <w:shd w:fill="f8fafc" w:val="clear"/>
+            <w:tcMar>
+              <w:top w:w="70.0" w:type="dxa"/>
+              <w:left w:w="90.0" w:type="dxa"/>
+              <w:bottom w:w="70.0" w:type="dxa"/>
+              <w:right w:w="90.0" w:type="dxa"/>
+            </w:tcMar>
+            <w:vAlign w:val="center"/>
+          </w:tcPr>
+          <w:p>
+            <w:pPr>
+              <w:jc w:val="center"/>
+              <w:spacing w:after="40" w:before="40" w:line="276" w:lineRule="auto"/>
+              <w:rPr/>
+            </w:pPr>
+            <w:r>
+              <w:rPr>
+                <w:rFonts w:ascii="Calibri" w:cs="Calibri" w:eastAsia="Calibri" w:hAnsi="Calibri"/>
+                <w:b w:val="1"/>
+                <w:bCs w:val="1"/>
+                <w:color w:val="475569"/>
+                <w:sz w:val="20"/>
+                <w:szCs w:val="20"/>
+                <w:rtl w:val="0"/>
+              </w:rPr>
+              <w:t xml:space="preserve">7</w:t>
+            </w:r>
+          </w:p>
+        </w:tc>
+        <w:tc>
+          <w:tcPr>
+            <w:tcW w:w="4300" w:type="dxa"/>
+            <w:shd w:fill="f8fafc" w:val="clear"/>
+            <w:tcMar>
+              <w:top w:w="70.0" w:type="dxa"/>
+              <w:left w:w="90.0" w:type="dxa"/>
+              <w:bottom w:w="70.0" w:type="dxa"/>
+              <w:right w:w="90.0" w:type="dxa"/>
+            </w:tcMar>
+            <w:vAlign w:val="center"/>
+          </w:tcPr>
+          <w:p>
+            <w:pPr>
+              <w:jc w:val="left"/>
+              <w:spacing w:after="40" w:before="40" w:line="276" w:lineRule="auto"/>
+              <w:rPr/>
+            </w:pPr>
+            <w:r>
+              <w:rPr>
+                <w:rFonts w:ascii="Calibri" w:cs="Calibri" w:eastAsia="Calibri" w:hAnsi="Calibri"/>
+                <w:color w:val="0f172a"/>
+                <w:sz w:val="20"/>
+                <w:szCs w:val="20"/>
+                <w:rtl w:val="0"/>
+              </w:rPr>
+              <w:t xml:space="preserve">Báo giá NCC (RFQ) &amp; Phân nhóm khách hàng RFM đa kênh</w:t>
+            </w:r>
+          </w:p>
+        </w:tc>
+        <w:tc>
+          <w:tcPr>
+            <w:tcW w:w="1400" w:type="dxa"/>
+            <w:shd w:fill="f8fafc" w:val="clear"/>
+            <w:tcMar>
+              <w:top w:w="70.0" w:type="dxa"/>
+              <w:left w:w="90.0" w:type="dxa"/>
+              <w:bottom w:w="70.0" w:type="dxa"/>
+              <w:right w:w="90.0" w:type="dxa"/>
+            </w:tcMar>
+            <w:vAlign w:val="center"/>
+          </w:tcPr>
+          <w:p>
+            <w:pPr>
+              <w:jc w:val="center"/>
+              <w:spacing w:after="40" w:before="40" w:line="276" w:lineRule="auto"/>
+              <w:rPr/>
+            </w:pPr>
+            <w:r>
+              <w:rPr>
+                <w:rFonts w:ascii="Calibri" w:cs="Calibri" w:eastAsia="Calibri" w:hAnsi="Calibri"/>
+                <w:b w:val="1"/>
+                <w:bCs w:val="1"/>
+                <w:color w:val="15803d"/>
+                <w:sz w:val="20"/>
+                <w:szCs w:val="20"/>
+                <w:rtl w:val="0"/>
+              </w:rPr>
+              <w:t xml:space="preserve">Done</w:t>
+            </w:r>
+          </w:p>
+        </w:tc>
+        <w:tc>
+          <w:tcPr>
+            <w:tcW w:w="7458" w:type="dxa"/>
+            <w:shd w:fill="f8fafc" w:val="clear"/>
+            <w:tcMar>
+              <w:top w:w="70.0" w:type="dxa"/>
+              <w:left w:w="90.0" w:type="dxa"/>
+              <w:bottom w:w="70.0" w:type="dxa"/>
+              <w:right w:w="90.0" w:type="dxa"/>
+            </w:tcMar>
+            <w:vAlign w:val="center"/>
+          </w:tcPr>
+          <w:p>
+            <w:pPr>
+              <w:jc w:val="left"/>
+              <w:spacing w:after="40" w:before="40" w:line="276" w:lineRule="auto"/>
+              <w:rPr/>
+            </w:pPr>
+            <w:r>
+              <w:rPr>
+                <w:rFonts w:ascii="Calibri" w:cs="Calibri" w:eastAsia="Calibri" w:hAnsi="Calibri"/>
+                <w:color w:val="0f172a"/>
+                <w:sz w:val="20"/>
+                <w:szCs w:val="20"/>
+                <w:rtl w:val="0"/>
+              </w:rPr>
+              <w:t xml:space="preserve">So sánh báo giá NCC realtime qua Socket.IO, áp trần giá CSDL Dược Quốc gia; thuật toán RFM tổng hợp dữ liệu cả POS và Online, tự động map voucher; khắc phục nghẽn tồn kho đa chi nhánh trong AI Personalize (Nam - PR #224, PR #227).</w:t>
+            </w:r>
+          </w:p>
+        </w:tc>
+      </w:tr>
+      <w:tr>
+        <w:trPr>
+          <w:cantSplit w:val="0"/>
+          <w:tblHeader w:val="0"/>
+        </w:trPr>
+        <w:tc>
+          <w:tcPr>
+            <w:tcW w:w="800" w:type="dxa"/>
+            <w:shd w:fill="ffffff" w:val="clear"/>
+            <w:tcMar>
+              <w:top w:w="70.0" w:type="dxa"/>
+              <w:left w:w="90.0" w:type="dxa"/>
+              <w:bottom w:w="70.0" w:type="dxa"/>
+              <w:right w:w="90.0" w:type="dxa"/>
+            </w:tcMar>
+            <w:vAlign w:val="center"/>
+          </w:tcPr>
+          <w:p>
+            <w:pPr>
+              <w:jc w:val="center"/>
+              <w:spacing w:after="40" w:before="40" w:line="276" w:lineRule="auto"/>
+              <w:rPr/>
+            </w:pPr>
+            <w:r>
+              <w:rPr>
+                <w:rFonts w:ascii="Calibri" w:cs="Calibri" w:eastAsia="Calibri" w:hAnsi="Calibri"/>
+                <w:b w:val="1"/>
+                <w:bCs w:val="1"/>
+                <w:color w:val="475569"/>
+                <w:sz w:val="20"/>
+                <w:szCs w:val="20"/>
+                <w:rtl w:val="0"/>
+              </w:rPr>
+              <w:t xml:space="preserve">8</w:t>
+            </w:r>
+          </w:p>
+        </w:tc>
+        <w:tc>
+          <w:tcPr>
+            <w:tcW w:w="4300" w:type="dxa"/>
+            <w:shd w:fill="ffffff" w:val="clear"/>
+            <w:tcMar>
+              <w:top w:w="70.0" w:type="dxa"/>
+              <w:left w:w="90.0" w:type="dxa"/>
+              <w:bottom w:w="70.0" w:type="dxa"/>
+              <w:right w:w="90.0" w:type="dxa"/>
+            </w:tcMar>
+            <w:vAlign w:val="center"/>
+          </w:tcPr>
+          <w:p>
+            <w:pPr>
+              <w:jc w:val="left"/>
+              <w:spacing w:after="40" w:before="40" w:line="276" w:lineRule="auto"/>
+              <w:rPr/>
+            </w:pPr>
+            <w:r>
+              <w:rPr>
+                <w:rFonts w:ascii="Calibri" w:cs="Calibri" w:eastAsia="Calibri" w:hAnsi="Calibri"/>
+                <w:color w:val="0f172a"/>
+                <w:sz w:val="20"/>
+                <w:szCs w:val="20"/>
+                <w:rtl w:val="0"/>
+              </w:rPr>
+              <w:t xml:space="preserve">Kiểm nhận Hàng Hóa qua QR Purchase Order &amp; AI Roboflow</w:t>
+            </w:r>
+          </w:p>
+        </w:tc>
+        <w:tc>
+          <w:tcPr>
+            <w:tcW w:w="1400" w:type="dxa"/>
+            <w:shd w:fill="ffffff" w:val="clear"/>
+            <w:tcMar>
+              <w:top w:w="70.0" w:type="dxa"/>
+              <w:left w:w="90.0" w:type="dxa"/>
+              <w:bottom w:w="70.0" w:type="dxa"/>
+              <w:right w:w="90.0" w:type="dxa"/>
+            </w:tcMar>
+            <w:vAlign w:val="center"/>
+          </w:tcPr>
+          <w:p>
+            <w:pPr>
+              <w:jc w:val="center"/>
+              <w:spacing w:after="40" w:before="40" w:line="276" w:lineRule="auto"/>
+              <w:rPr/>
+            </w:pPr>
+            <w:r>
+              <w:rPr>
+                <w:rFonts w:ascii="Calibri" w:cs="Calibri" w:eastAsia="Calibri" w:hAnsi="Calibri"/>
+                <w:b w:val="1"/>
+                <w:bCs w:val="1"/>
+                <w:color w:val="c2410c"/>
+                <w:sz w:val="20"/>
+                <w:szCs w:val="20"/>
+                <w:rtl w:val="0"/>
+              </w:rPr>
+              <w:t xml:space="preserve">Doing</w:t>
+            </w:r>
+          </w:p>
+        </w:tc>
+        <w:tc>
+          <w:tcPr>
+            <w:tcW w:w="7458" w:type="dxa"/>
+            <w:shd w:fill="ffffff" w:val="clear"/>
+            <w:tcMar>
+              <w:top w:w="70.0" w:type="dxa"/>
+              <w:left w:w="90.0" w:type="dxa"/>
+              <w:bottom w:w="70.0" w:type="dxa"/>
+              <w:right w:w="90.0" w:type="dxa"/>
+            </w:tcMar>
+            <w:vAlign w:val="center"/>
+          </w:tcPr>
+          <w:p>
+            <w:pPr>
+              <w:jc w:val="left"/>
+              <w:spacing w:after="40" w:before="40" w:line="276" w:lineRule="auto"/>
+              <w:rPr/>
+            </w:pPr>
+            <w:r>
+              <w:rPr>
+                <w:rFonts w:ascii="Calibri" w:cs="Calibri" w:eastAsia="Calibri" w:hAnsi="Calibri"/>
+                <w:color w:val="0f172a"/>
+                <w:sz w:val="20"/>
+                <w:szCs w:val="20"/>
+                <w:rtl w:val="0"/>
+              </w:rPr>
+              <w:t xml:space="preserve">Tạo mã QR PO trên Web, màn hình quét QR trên Mobile; API Gateway chuyển ảnh sang AI Roboflow. Đang tiếp tục kiểm thử ảnh thực tế và cấu hình phân biệt cờ fallback (Nam).</w:t>
+            </w:r>
+          </w:p>
+        </w:tc>
+      </w:tr>
+      <w:tr>
+        <w:trPr>
+          <w:cantSplit w:val="0"/>
+          <w:tblHeader w:val="0"/>
+        </w:trPr>
+        <w:tc>
+          <w:tcPr>
+            <w:tcW w:w="800" w:type="dxa"/>
+            <w:shd w:fill="f8fafc" w:val="clear"/>
+            <w:tcMar>
+              <w:top w:w="70.0" w:type="dxa"/>
+              <w:left w:w="90.0" w:type="dxa"/>
+              <w:bottom w:w="70.0" w:type="dxa"/>
+              <w:right w:w="90.0" w:type="dxa"/>
+            </w:tcMar>
+            <w:vAlign w:val="center"/>
+          </w:tcPr>
+          <w:p>
+            <w:pPr>
+              <w:jc w:val="center"/>
+              <w:spacing w:after="40" w:before="40" w:line="276" w:lineRule="auto"/>
+              <w:rPr/>
+            </w:pPr>
+            <w:r>
+              <w:rPr>
+                <w:rFonts w:ascii="Calibri" w:cs="Calibri" w:eastAsia="Calibri" w:hAnsi="Calibri"/>
+                <w:b w:val="1"/>
+                <w:bCs w:val="1"/>
+                <w:color w:val="475569"/>
+                <w:sz w:val="20"/>
+                <w:szCs w:val="20"/>
+                <w:rtl w:val="0"/>
+              </w:rPr>
+              <w:t xml:space="preserve">9</w:t>
+            </w:r>
+          </w:p>
+        </w:tc>
+        <w:tc>
+          <w:tcPr>
+            <w:tcW w:w="4300" w:type="dxa"/>
+            <w:shd w:fill="f8fafc" w:val="clear"/>
+            <w:tcMar>
+              <w:top w:w="70.0" w:type="dxa"/>
+              <w:left w:w="90.0" w:type="dxa"/>
+              <w:bottom w:w="70.0" w:type="dxa"/>
+              <w:right w:w="90.0" w:type="dxa"/>
+            </w:tcMar>
+            <w:vAlign w:val="center"/>
+          </w:tcPr>
+          <w:p>
+            <w:pPr>
+              <w:jc w:val="left"/>
+              <w:spacing w:after="40" w:before="40" w:line="276" w:lineRule="auto"/>
+              <w:rPr/>
+            </w:pPr>
+            <w:r>
+              <w:rPr>
+                <w:rFonts w:ascii="Calibri" w:cs="Calibri" w:eastAsia="Calibri" w:hAnsi="Calibri"/>
+                <w:color w:val="0f172a"/>
+                <w:sz w:val="20"/>
+                <w:szCs w:val="20"/>
+                <w:rtl w:val="0"/>
+              </w:rPr>
+              <w:t xml:space="preserve">Tư vấn Đơn thuốc bằng Giọng nói AI tại POS &amp; PayOS VietQR</w:t>
+            </w:r>
+          </w:p>
+        </w:tc>
+        <w:tc>
+          <w:tcPr>
+            <w:tcW w:w="1400" w:type="dxa"/>
+            <w:shd w:fill="f8fafc" w:val="clear"/>
+            <w:tcMar>
+              <w:top w:w="70.0" w:type="dxa"/>
+              <w:left w:w="90.0" w:type="dxa"/>
+              <w:bottom w:w="70.0" w:type="dxa"/>
+              <w:right w:w="90.0" w:type="dxa"/>
+            </w:tcMar>
+            <w:vAlign w:val="center"/>
+          </w:tcPr>
+          <w:p>
+            <w:pPr>
+              <w:jc w:val="center"/>
+              <w:spacing w:after="40" w:before="40" w:line="276" w:lineRule="auto"/>
+              <w:rPr/>
+            </w:pPr>
+            <w:r>
+              <w:rPr>
+                <w:rFonts w:ascii="Calibri" w:cs="Calibri" w:eastAsia="Calibri" w:hAnsi="Calibri"/>
+                <w:b w:val="1"/>
+                <w:bCs w:val="1"/>
+                <w:color w:val="c2410c"/>
+                <w:sz w:val="20"/>
+                <w:szCs w:val="20"/>
+                <w:rtl w:val="0"/>
+              </w:rPr>
+              <w:t xml:space="preserve">Doing</w:t>
+            </w:r>
+          </w:p>
+        </w:tc>
+        <w:tc>
+          <w:tcPr>
+            <w:tcW w:w="7458" w:type="dxa"/>
+            <w:shd w:fill="f8fafc" w:val="clear"/>
+            <w:tcMar>
+              <w:top w:w="70.0" w:type="dxa"/>
+              <w:left w:w="90.0" w:type="dxa"/>
+              <w:bottom w:w="70.0" w:type="dxa"/>
+              <w:right w:w="90.0" w:type="dxa"/>
+            </w:tcMar>
+            <w:vAlign w:val="center"/>
+          </w:tcPr>
+          <w:p>
+            <w:pPr>
+              <w:jc w:val="left"/>
+              <w:spacing w:after="40" w:before="40" w:line="276" w:lineRule="auto"/>
+              <w:rPr/>
+            </w:pPr>
+            <w:r>
+              <w:rPr>
+                <w:rFonts w:ascii="Calibri" w:cs="Calibri" w:eastAsia="Calibri" w:hAnsi="Calibri"/>
+                <w:color w:val="0f172a"/>
+                <w:sz w:val="20"/>
+                <w:szCs w:val="20"/>
+                <w:rtl w:val="0"/>
+              </w:rPr>
+              <w:t xml:space="preserve">Tích hợp thanh toán PayOS VietQR và chiết khấu VIP; đang hoàn thiện hook useVoiceInput tại quầy POS và tự động giải phóng đơn hàng treo qua PayOS webhook (Phước).</w:t>
+            </w:r>
+          </w:p>
+        </w:tc>
+      </w:tr>
+      <w:tr>
+        <w:trPr>
+          <w:cantSplit w:val="0"/>
+          <w:tblHeader w:val="0"/>
+        </w:trPr>
+        <w:tc>
+          <w:tcPr>
+            <w:tcW w:w="800" w:type="dxa"/>
+            <w:shd w:fill="ffffff" w:val="clear"/>
+            <w:tcMar>
+              <w:top w:w="70.0" w:type="dxa"/>
+              <w:left w:w="90.0" w:type="dxa"/>
+              <w:bottom w:w="70.0" w:type="dxa"/>
+              <w:right w:w="90.0" w:type="dxa"/>
+            </w:tcMar>
+            <w:vAlign w:val="center"/>
+          </w:tcPr>
+          <w:p>
+            <w:pPr>
+              <w:jc w:val="center"/>
+              <w:spacing w:after="40" w:before="40" w:line="276" w:lineRule="auto"/>
+              <w:rPr/>
+            </w:pPr>
+            <w:r>
+              <w:rPr>
+                <w:rFonts w:ascii="Calibri" w:cs="Calibri" w:eastAsia="Calibri" w:hAnsi="Calibri"/>
+                <w:b w:val="1"/>
+                <w:bCs w:val="1"/>
+                <w:color w:val="475569"/>
+                <w:sz w:val="20"/>
+                <w:szCs w:val="20"/>
+                <w:rtl w:val="0"/>
+              </w:rPr>
+              <w:t xml:space="preserve">10</w:t>
+            </w:r>
+          </w:p>
+        </w:tc>
+        <w:tc>
+          <w:tcPr>
+            <w:tcW w:w="4300" w:type="dxa"/>
+            <w:shd w:fill="ffffff" w:val="clear"/>
+            <w:tcMar>
+              <w:top w:w="70.0" w:type="dxa"/>
+              <w:left w:w="90.0" w:type="dxa"/>
+              <w:bottom w:w="70.0" w:type="dxa"/>
+              <w:right w:w="90.0" w:type="dxa"/>
+            </w:tcMar>
+            <w:vAlign w:val="center"/>
+          </w:tcPr>
+          <w:p>
+            <w:pPr>
+              <w:jc w:val="left"/>
+              <w:spacing w:after="40" w:before="40" w:line="276" w:lineRule="auto"/>
+              <w:rPr/>
+            </w:pPr>
+            <w:r>
+              <w:rPr>
+                <w:rFonts w:ascii="Calibri" w:cs="Calibri" w:eastAsia="Calibri" w:hAnsi="Calibri"/>
+                <w:color w:val="0f172a"/>
+                <w:sz w:val="20"/>
+                <w:szCs w:val="20"/>
+                <w:rtl w:val="0"/>
+              </w:rPr>
+              <w:t xml:space="preserve">Tối ưu Pipeline CI/CD VPS &amp; Báo cáo Kiểm thử Report 5</w:t>
+            </w:r>
+          </w:p>
+        </w:tc>
+        <w:tc>
+          <w:tcPr>
+            <w:tcW w:w="1400" w:type="dxa"/>
+            <w:shd w:fill="ffffff" w:val="clear"/>
+            <w:tcMar>
+              <w:top w:w="70.0" w:type="dxa"/>
+              <w:left w:w="90.0" w:type="dxa"/>
+              <w:bottom w:w="70.0" w:type="dxa"/>
+              <w:right w:w="90.0" w:type="dxa"/>
+            </w:tcMar>
+            <w:vAlign w:val="center"/>
+          </w:tcPr>
+          <w:p>
+            <w:pPr>
+              <w:jc w:val="center"/>
+              <w:spacing w:after="40" w:before="40" w:line="276" w:lineRule="auto"/>
+              <w:rPr/>
+            </w:pPr>
+            <w:r>
+              <w:rPr>
+                <w:rFonts w:ascii="Calibri" w:cs="Calibri" w:eastAsia="Calibri" w:hAnsi="Calibri"/>
+                <w:b w:val="1"/>
+                <w:bCs w:val="1"/>
+                <w:color w:val="15803d"/>
+                <w:sz w:val="20"/>
+                <w:szCs w:val="20"/>
+                <w:rtl w:val="0"/>
+              </w:rPr>
+              <w:t xml:space="preserve">Done</w:t>
+            </w:r>
+          </w:p>
+        </w:tc>
+        <w:tc>
+          <w:tcPr>
+            <w:tcW w:w="7458" w:type="dxa"/>
+            <w:shd w:fill="ffffff" w:val="clear"/>
+            <w:tcMar>
+              <w:top w:w="70.0" w:type="dxa"/>
+              <w:left w:w="90.0" w:type="dxa"/>
+              <w:bottom w:w="70.0" w:type="dxa"/>
+              <w:right w:w="90.0" w:type="dxa"/>
+            </w:tcMar>
+            <w:vAlign w:val="center"/>
+          </w:tcPr>
+          <w:p>
+            <w:pPr>
+              <w:jc w:val="left"/>
+              <w:spacing w:after="40" w:before="40" w:line="276" w:lineRule="auto"/>
+              <w:rPr/>
+            </w:pPr>
+            <w:r>
+              <w:rPr>
+                <w:rFonts w:ascii="Calibri" w:cs="Calibri" w:eastAsia="Calibri" w:hAnsi="Calibri"/>
+                <w:color w:val="0f172a"/>
+                <w:sz w:val="20"/>
+                <w:szCs w:val="20"/>
+                <w:rtl w:val="0"/>
+              </w:rPr>
+              <w:t xml:space="preserve">Cơ chế Docker build cache (build-prod-images.sh - PR #225) giảm thời gian deploy VPS xuống &lt; 3 phút; chuẩn hóa 100% 360 test cases qua 8 phân hệ Report 5 đồng bộ Google Drive (Phước).</w:t>
+            </w:r>
+          </w:p>
+        </w:tc>
+      </w:tr>
+    </w:tbl>
+    <w:p>
+      <w:pPr>
+        <w:pStyle w:val="Heading3"/>
+        <w:spacing w:after="40" w:before="120" w:line="276" w:lineRule="auto"/>
+        <w:rPr/>
+      </w:pPr>
+      <w:r>
+        <w:rPr>
+          <w:rFonts w:ascii="Calibri" w:cs="Calibri" w:eastAsia="Calibri" w:hAnsi="Calibri"/>
+          <w:b w:val="1"/>
+          <w:bCs w:val="1"/>
+          <w:color w:val="1e3a8a"/>
+          <w:sz w:val="24"/>
+          <w:szCs w:val="24"/>
+          <w:rtl w:val="0"/>
+        </w:rPr>
+        <w:t xml:space="preserve">Deliverables / Shipables this week</w:t>
+      </w:r>
+    </w:p>
+    <w:p>
+      <w:pPr>
+        <w:spacing w:after="40" w:before="0" w:line="276" w:lineRule="auto"/>
+        <w:rPr/>
+      </w:pPr>
+      <w:r>
+        <w:rPr>
+          <w:rFonts w:ascii="Calibri" w:cs="Calibri" w:eastAsia="Calibri" w:hAnsi="Calibri"/>
+          <w:i w:val="1"/>
+          <w:iCs w:val="1"/>
+          <w:color w:val="64748b"/>
+          <w:sz w:val="20"/>
+          <w:szCs w:val="20"/>
+          <w:rtl w:val="0"/>
+        </w:rPr>
+        <w:t xml:space="preserve">// tuần này làm “ra” được cái gì?</w:t>
+      </w:r>
+    </w:p>
+    <w:p>
+      <w:pPr>
+        <w:spacing w:after="40" w:before="40" w:line="276" w:lineRule="auto"/>
+        <w:rPr/>
+      </w:pPr>
+      <w:r>
+        <w:rPr>
+          <w:rFonts w:ascii="Calibri" w:cs="Calibri" w:eastAsia="Calibri" w:hAnsi="Calibri"/>
+          <w:b w:val="1"/>
+          <w:bCs w:val="1"/>
+          <w:color w:val="0f172a"/>
+          <w:rtl w:val="0"/>
+        </w:rPr>
+        <w:t xml:space="preserve">Code chạy được: </w:t>
+      </w:r>
+      <w:r>
+        <w:rPr>
+          <w:rFonts w:ascii="Calibri" w:cs="Calibri" w:eastAsia="Calibri" w:hAnsi="Calibri"/>
+          <w:rtl w:val="0"/>
+        </w:rPr>
+        <w:t xml:space="preserve">Web &amp; Backend: Sơ đồ kho 3D (WarehouseMap3D.tsx) và lưu trữ FEFO 4 dãy kệ (RES1 - RES4); Phân hệ Email Marketing tự động UC-76 (chiến dịch, gửi thử SMTP, tệp ALL/VIP); Nghiệp vụ khuyến mãi Voucher Mua X Tặng Y (Buy X Get Y) đồng bộ POS và Giỏ hàng Online; Tự động trừ tồn kho Online từ Kho Tổng GSP (CENTRAL_WH); Hệ thống so sánh báo giá NCC realtime áp trần giá CSDL Dược; Tích hợp PayOS VietQR và chiết khấu VIP; Pipeline CI/CD Docker build cache VPS siêu tốc | Mobile App: Chấm công GPS Geofencing (SCRUM-97), tính lương &amp; phiếu lương (SCRUM-98), chứng chỉ dược sĩ GPP (SCRUM-96), đăng nhập sinh trắc học vân tay (SCRUM-99), quét QR Purchase Order kiểm nhận hàng hóa AI Roboflow; Dọn sạch 100% mock data.</w:t>
+      </w:r>
+    </w:p>
+    <w:p>
+      <w:pPr>
+        <w:spacing w:after="40" w:before="40" w:line="276" w:lineRule="auto"/>
+        <w:rPr/>
+      </w:pPr>
+      <w:r>
+        <w:rPr>
+          <w:rFonts w:ascii="Calibri" w:cs="Calibri" w:eastAsia="Calibri" w:hAnsi="Calibri"/>
+          <w:b w:val="1"/>
+          <w:bCs w:val="1"/>
+          <w:color w:val="0f172a"/>
+          <w:rtl w:val="0"/>
+        </w:rPr>
+        <w:t xml:space="preserve">Tài liệu: </w:t>
+      </w:r>
+      <w:r>
+        <w:rPr>
+          <w:rFonts w:ascii="Calibri" w:cs="Calibri" w:eastAsia="Calibri" w:hAnsi="Calibri"/>
+          <w:rtl w:val="0"/>
+        </w:rPr>
+        <w:t xml:space="preserve">Tài liệu đặc tả kỹ thuật UC-76 Hệ thống Email Marketing Tự Động (UC76_HE_THONG_EMAIL_MARKETING_TU_DONG.md); Báo cáo kiểm thử phần mềm Report 5 hoàn chỉnh 100% (Report5_Test_Report.xlsx - 360 test cases 8 phân hệ); Kịch bản demo Review 2 và bảng đối chiếu góp ý từ Review 1.</w:t>
+      </w:r>
+    </w:p>
+    <w:p>
+      <w:pPr>
+        <w:pStyle w:val="Heading3"/>
+        <w:spacing w:after="40" w:before="120" w:line="276" w:lineRule="auto"/>
+        <w:rPr/>
+      </w:pPr>
+      <w:r>
+        <w:rPr>
+          <w:rFonts w:ascii="Calibri" w:cs="Calibri" w:eastAsia="Calibri" w:hAnsi="Calibri"/>
+          <w:b w:val="1"/>
+          <w:bCs w:val="1"/>
+          <w:color w:val="1e3a8a"/>
+          <w:sz w:val="24"/>
+          <w:szCs w:val="24"/>
+          <w:rtl w:val="0"/>
+        </w:rPr>
+        <w:t xml:space="preserve">Issue</w:t>
+      </w:r>
+    </w:p>
+    <w:p>
+      <w:pPr>
+        <w:spacing w:after="40" w:before="0" w:line="276" w:lineRule="auto"/>
+        <w:rPr/>
+      </w:pPr>
+      <w:r>
+        <w:rPr>
+          <w:rFonts w:ascii="Calibri" w:cs="Calibri" w:eastAsia="Calibri" w:hAnsi="Calibri"/>
+          <w:i w:val="1"/>
+          <w:iCs w:val="1"/>
+          <w:color w:val="64748b"/>
+          <w:sz w:val="20"/>
+          <w:szCs w:val="20"/>
+          <w:rtl w:val="0"/>
+        </w:rPr>
+        <w:t xml:space="preserve">Team dự án Đang gặp trở ngại &amp; vướng mắc gì?</w:t>
+      </w:r>
+    </w:p>
+    <w:tbl>
+      <w:tblPr>
+        <w:tblStyle w:val="Table1"/>
+        <w:tblW w:w="13956.0" w:type="dxa"/>
+        <w:jc w:val="center"/>
+        <w:tblBorders>
+          <w:top w:color="cbd5e1" w:space="0" w:sz="4" w:val="single"/>
+          <w:left w:color="cbd5e1" w:space="0" w:sz="4" w:val="single"/>
+          <w:bottom w:color="cbd5e1" w:space="0" w:sz="4" w:val="single"/>
+          <w:right w:color="cbd5e1" w:space="0" w:sz="4" w:val="single"/>
+          <w:insideH w:color="cbd5e1" w:space="0" w:sz="4" w:val="single"/>
+          <w:insideV w:color="cbd5e1" w:space="0" w:sz="4" w:val="single"/>
+        </w:tblBorders>
+        <w:tblLayout w:type="fixed"/>
+        <w:tblLook w:val="0400"/>
+      </w:tblPr>
+      <w:tblGrid>
+        <w:gridCol w:w="2512"/>
+        <w:gridCol w:w="3070"/>
+        <w:gridCol w:w="2512"/>
+        <w:gridCol w:w="3070"/>
+        <w:gridCol w:w="1396"/>
+        <w:gridCol w:w="1396"/>
+      </w:tblGrid>
+      <w:tr>
+        <w:trPr>
+          <w:cantSplit w:val="0"/>
+          <w:tblHeader w:val="1"/>
+        </w:trPr>
+        <w:tc>
+          <w:tcPr>
+            <w:tcW w:w="2512" w:type="dxa"/>
+            <w:shd w:fill="1e3a8a" w:val="clear"/>
+            <w:tcMar>
+              <w:top w:w="70.0" w:type="dxa"/>
+              <w:left w:w="90.0" w:type="dxa"/>
+              <w:bottom w:w="70.0" w:type="dxa"/>
+              <w:right w:w="90.0" w:type="dxa"/>
+            </w:tcMar>
+            <w:vAlign w:val="center"/>
+          </w:tcPr>
+          <w:p>
+            <w:pPr>
+              <w:jc w:val="center"/>
+              <w:spacing w:after="40" w:before="40" w:line="276" w:lineRule="auto"/>
+              <w:rPr/>
+            </w:pPr>
+            <w:r>
+              <w:rPr>
+                <w:rFonts w:ascii="Calibri" w:cs="Calibri" w:eastAsia="Calibri" w:hAnsi="Calibri"/>
+                <w:b w:val="1"/>
+                <w:bCs w:val="1"/>
+                <w:color w:val="ffffff"/>
+                <w:sz w:val="20"/>
+                <w:szCs w:val="20"/>
+                <w:rtl w:val="0"/>
+              </w:rPr>
+              <w:t xml:space="preserve">Issue</w:t>
+            </w:r>
+          </w:p>
+        </w:tc>
+        <w:tc>
+          <w:tcPr>
+            <w:tcW w:w="3070" w:type="dxa"/>
+            <w:shd w:fill="1e3a8a" w:val="clear"/>
+            <w:tcMar>
+              <w:top w:w="70.0" w:type="dxa"/>
+              <w:left w:w="90.0" w:type="dxa"/>
+              <w:bottom w:w="70.0" w:type="dxa"/>
+              <w:right w:w="90.0" w:type="dxa"/>
+            </w:tcMar>
+            <w:vAlign w:val="center"/>
+          </w:tcPr>
+          <w:p>
+            <w:pPr>
+              <w:jc w:val="center"/>
+              <w:spacing w:after="40" w:before="40" w:line="276" w:lineRule="auto"/>
+              <w:rPr/>
+            </w:pPr>
+            <w:r>
+              <w:rPr>
+                <w:rFonts w:ascii="Calibri" w:cs="Calibri" w:eastAsia="Calibri" w:hAnsi="Calibri"/>
+                <w:b w:val="1"/>
+                <w:bCs w:val="1"/>
+                <w:color w:val="ffffff"/>
+                <w:sz w:val="20"/>
+                <w:szCs w:val="20"/>
+                <w:rtl w:val="0"/>
+              </w:rPr>
+              <w:t xml:space="preserve">Chi tiết</w:t>
+            </w:r>
+          </w:p>
+        </w:tc>
+        <w:tc>
+          <w:tcPr>
+            <w:tcW w:w="2512" w:type="dxa"/>
+            <w:shd w:fill="1e3a8a" w:val="clear"/>
+            <w:tcMar>
+              <w:top w:w="70.0" w:type="dxa"/>
+              <w:left w:w="90.0" w:type="dxa"/>
+              <w:bottom w:w="70.0" w:type="dxa"/>
+              <w:right w:w="90.0" w:type="dxa"/>
+            </w:tcMar>
+            <w:vAlign w:val="center"/>
+          </w:tcPr>
+          <w:p>
+            <w:pPr>
+              <w:jc w:val="center"/>
+              <w:spacing w:after="40" w:before="40" w:line="276" w:lineRule="auto"/>
+              <w:rPr/>
+            </w:pPr>
+            <w:r>
+              <w:rPr>
+                <w:rFonts w:ascii="Calibri" w:cs="Calibri" w:eastAsia="Calibri" w:hAnsi="Calibri"/>
+                <w:b w:val="1"/>
+                <w:bCs w:val="1"/>
+                <w:color w:val="ffffff"/>
+                <w:sz w:val="20"/>
+                <w:szCs w:val="20"/>
+                <w:rtl w:val="0"/>
+              </w:rPr>
+              <w:t xml:space="preserve">Impact</w:t>
+            </w:r>
+          </w:p>
+        </w:tc>
+        <w:tc>
+          <w:tcPr>
+            <w:tcW w:w="3070" w:type="dxa"/>
+            <w:shd w:fill="1e3a8a" w:val="clear"/>
+            <w:tcMar>
+              <w:top w:w="70.0" w:type="dxa"/>
+              <w:left w:w="90.0" w:type="dxa"/>
+              <w:bottom w:w="70.0" w:type="dxa"/>
+              <w:right w:w="90.0" w:type="dxa"/>
+            </w:tcMar>
+            <w:vAlign w:val="center"/>
+          </w:tcPr>
+          <w:p>
+            <w:pPr>
+              <w:jc w:val="center"/>
+              <w:spacing w:after="40" w:before="40" w:line="276" w:lineRule="auto"/>
+              <w:rPr/>
+            </w:pPr>
+            <w:r>
+              <w:rPr>
+                <w:rFonts w:ascii="Calibri" w:cs="Calibri" w:eastAsia="Calibri" w:hAnsi="Calibri"/>
+                <w:b w:val="1"/>
+                <w:bCs w:val="1"/>
+                <w:color w:val="ffffff"/>
+                <w:sz w:val="20"/>
+                <w:szCs w:val="20"/>
+                <w:rtl w:val="0"/>
+              </w:rPr>
+              <w:t xml:space="preserve">Action</w:t>
+            </w:r>
+          </w:p>
+        </w:tc>
+        <w:tc>
+          <w:tcPr>
+            <w:tcW w:w="1396" w:type="dxa"/>
+            <w:shd w:fill="1e3a8a" w:val="clear"/>
+            <w:tcMar>
+              <w:top w:w="70.0" w:type="dxa"/>
+              <w:left w:w="90.0" w:type="dxa"/>
+              <w:bottom w:w="70.0" w:type="dxa"/>
+              <w:right w:w="90.0" w:type="dxa"/>
+            </w:tcMar>
+            <w:vAlign w:val="center"/>
+          </w:tcPr>
+          <w:p>
+            <w:pPr>
+              <w:jc w:val="center"/>
+              <w:spacing w:after="40" w:before="40" w:line="276" w:lineRule="auto"/>
+              <w:rPr/>
+            </w:pPr>
+            <w:r>
+              <w:rPr>
+                <w:rFonts w:ascii="Calibri" w:cs="Calibri" w:eastAsia="Calibri" w:hAnsi="Calibri"/>
+                <w:b w:val="1"/>
+                <w:bCs w:val="1"/>
+                <w:color w:val="ffffff"/>
+                <w:sz w:val="20"/>
+                <w:szCs w:val="20"/>
+                <w:rtl w:val="0"/>
+              </w:rPr>
+              <w:t xml:space="preserve">Commit deadline</w:t>
+            </w:r>
+          </w:p>
+        </w:tc>
+        <w:tc>
+          <w:tcPr>
+            <w:tcW w:w="1396" w:type="dxa"/>
+            <w:shd w:fill="1e3a8a" w:val="clear"/>
+            <w:tcMar>
+              <w:top w:w="70.0" w:type="dxa"/>
+              <w:left w:w="90.0" w:type="dxa"/>
+              <w:bottom w:w="70.0" w:type="dxa"/>
+              <w:right w:w="90.0" w:type="dxa"/>
+            </w:tcMar>
+            <w:vAlign w:val="center"/>
+          </w:tcPr>
+          <w:p>
+            <w:pPr>
+              <w:jc w:val="center"/>
+              <w:spacing w:after="40" w:before="40" w:line="276" w:lineRule="auto"/>
+              <w:rPr/>
+            </w:pPr>
+            <w:r>
+              <w:rPr>
+                <w:rFonts w:ascii="Calibri" w:cs="Calibri" w:eastAsia="Calibri" w:hAnsi="Calibri"/>
+                <w:b w:val="1"/>
+                <w:bCs w:val="1"/>
+                <w:color w:val="ffffff"/>
+                <w:sz w:val="20"/>
+                <w:szCs w:val="20"/>
+                <w:rtl w:val="0"/>
+              </w:rPr>
+              <w:t xml:space="preserve">Note</w:t>
+            </w:r>
+          </w:p>
+        </w:tc>
+      </w:tr>
+      <w:tr>
+        <w:trPr>
+          <w:cantSplit w:val="0"/>
+          <w:tblHeader w:val="0"/>
+        </w:trPr>
+        <w:tc>
+          <w:tcPr>
+            <w:tcW w:w="2512" w:type="dxa"/>
+            <w:shd w:fill="f8fafc" w:val="clear"/>
+            <w:tcMar>
+              <w:top w:w="70.0" w:type="dxa"/>
+              <w:left w:w="90.0" w:type="dxa"/>
+              <w:bottom w:w="70.0" w:type="dxa"/>
+              <w:right w:w="90.0" w:type="dxa"/>
+            </w:tcMar>
+            <w:vAlign w:val="center"/>
+          </w:tcPr>
+          <w:p>
+            <w:pPr>
+              <w:jc w:val="left"/>
+              <w:spacing w:after="40" w:before="40" w:line="276" w:lineRule="auto"/>
+              <w:rPr/>
+            </w:pPr>
+            <w:r>
+              <w:rPr>
+                <w:rFonts w:ascii="Calibri" w:cs="Calibri" w:eastAsia="Calibri" w:hAnsi="Calibri"/>
+                <w:color w:val="0f172a"/>
+                <w:sz w:val="20"/>
+                <w:szCs w:val="20"/>
+                <w:rtl w:val="0"/>
+              </w:rPr>
+              <w:t xml:space="preserve">Lỗi tồn kho âm (Bug #215)</w:t>
+            </w:r>
+          </w:p>
+        </w:tc>
+        <w:tc>
+          <w:tcPr>
+            <w:tcW w:w="3070" w:type="dxa"/>
+            <w:shd w:fill="f8fafc" w:val="clear"/>
+            <w:tcMar>
+              <w:top w:w="70.0" w:type="dxa"/>
+              <w:left w:w="90.0" w:type="dxa"/>
+              <w:bottom w:w="70.0" w:type="dxa"/>
+              <w:right w:w="90.0" w:type="dxa"/>
+            </w:tcMar>
+            <w:vAlign w:val="center"/>
+          </w:tcPr>
+          <w:p>
+            <w:pPr>
+              <w:jc w:val="left"/>
+              <w:spacing w:after="40" w:before="40" w:line="276" w:lineRule="auto"/>
+              <w:rPr/>
+            </w:pPr>
+            <w:r>
+              <w:rPr>
+                <w:rFonts w:ascii="Calibri" w:cs="Calibri" w:eastAsia="Calibri" w:hAnsi="Calibri"/>
+                <w:color w:val="0f172a"/>
+                <w:sz w:val="20"/>
+                <w:szCs w:val="20"/>
+                <w:rtl w:val="0"/>
+              </w:rPr>
+              <w:t xml:space="preserve">Số lượng tồn kho bị âm khi nhiều giao dịch bán đồng thời hoặc lệch lô chi nhánh.</w:t>
+            </w:r>
+          </w:p>
+        </w:tc>
+        <w:tc>
+          <w:tcPr>
+            <w:tcW w:w="2512" w:type="dxa"/>
+            <w:shd w:fill="f8fafc" w:val="clear"/>
+            <w:tcMar>
+              <w:top w:w="70.0" w:type="dxa"/>
+              <w:left w:w="90.0" w:type="dxa"/>
+              <w:bottom w:w="70.0" w:type="dxa"/>
+              <w:right w:w="90.0" w:type="dxa"/>
+            </w:tcMar>
+            <w:vAlign w:val="center"/>
+          </w:tcPr>
+          <w:p>
+            <w:pPr>
+              <w:jc w:val="left"/>
+              <w:spacing w:after="40" w:before="40" w:line="276" w:lineRule="auto"/>
+              <w:rPr/>
+            </w:pPr>
+            <w:r>
+              <w:rPr>
+                <w:rFonts w:ascii="Calibri" w:cs="Calibri" w:eastAsia="Calibri" w:hAnsi="Calibri"/>
+                <w:color w:val="0f172a"/>
+                <w:sz w:val="20"/>
+                <w:szCs w:val="20"/>
+                <w:rtl w:val="0"/>
+              </w:rPr>
+              <w:t xml:space="preserve">Sai lệch dữ liệu kiểm kê và vi phạm nguyên tắc quản lý kho dược GSP.</w:t>
+            </w:r>
+          </w:p>
+        </w:tc>
+        <w:tc>
+          <w:tcPr>
+            <w:tcW w:w="3070" w:type="dxa"/>
+            <w:shd w:fill="f8fafc" w:val="clear"/>
+            <w:tcMar>
+              <w:top w:w="70.0" w:type="dxa"/>
+              <w:left w:w="90.0" w:type="dxa"/>
+              <w:bottom w:w="70.0" w:type="dxa"/>
+              <w:right w:w="90.0" w:type="dxa"/>
+            </w:tcMar>
+            <w:vAlign w:val="center"/>
+          </w:tcPr>
+          <w:p>
+            <w:pPr>
+              <w:jc w:val="left"/>
+              <w:spacing w:after="40" w:before="40" w:line="276" w:lineRule="auto"/>
+              <w:rPr/>
+            </w:pPr>
+            <w:r>
+              <w:rPr>
+                <w:rFonts w:ascii="Calibri" w:cs="Calibri" w:eastAsia="Calibri" w:hAnsi="Calibri"/>
+                <w:color w:val="0f172a"/>
+                <w:sz w:val="20"/>
+                <w:szCs w:val="20"/>
+                <w:rtl w:val="0"/>
+              </w:rPr>
+              <w:t xml:space="preserve">Đồng bộ tồn kho theo lô vật lý, bọc Math.max(0, ...) và chạy script làm sạch số dư âm theo chuẩn ACID.</w:t>
+            </w:r>
+          </w:p>
+        </w:tc>
+        <w:tc>
+          <w:tcPr>
+            <w:tcW w:w="1396" w:type="dxa"/>
+            <w:shd w:fill="f8fafc" w:val="clear"/>
+            <w:tcMar>
+              <w:top w:w="70.0" w:type="dxa"/>
+              <w:left w:w="90.0" w:type="dxa"/>
+              <w:bottom w:w="70.0" w:type="dxa"/>
+              <w:right w:w="90.0" w:type="dxa"/>
+            </w:tcMar>
+            <w:vAlign w:val="center"/>
+          </w:tcPr>
+          <w:p>
+            <w:pPr>
+              <w:jc w:val="left"/>
+              <w:spacing w:after="40" w:before="40" w:line="276" w:lineRule="auto"/>
+              <w:rPr/>
+            </w:pPr>
+            <w:r>
+              <w:rPr>
+                <w:rFonts w:ascii="Calibri" w:cs="Calibri" w:eastAsia="Calibri" w:hAnsi="Calibri"/>
+                <w:color w:val="0f172a"/>
+                <w:sz w:val="20"/>
+                <w:szCs w:val="20"/>
+                <w:rtl w:val="0"/>
+              </w:rPr>
+              <w:t xml:space="preserve">14/10/2026</w:t>
+            </w:r>
+          </w:p>
+        </w:tc>
+        <w:tc>
+          <w:tcPr>
+            <w:tcW w:w="1396" w:type="dxa"/>
+            <w:shd w:fill="f8fafc" w:val="clear"/>
+            <w:tcMar>
+              <w:top w:w="70.0" w:type="dxa"/>
+              <w:left w:w="90.0" w:type="dxa"/>
+              <w:bottom w:w="70.0" w:type="dxa"/>
+              <w:right w:w="90.0" w:type="dxa"/>
+            </w:tcMar>
+            <w:vAlign w:val="center"/>
+          </w:tcPr>
+          <w:p>
+            <w:pPr>
+              <w:jc w:val="left"/>
+              <w:spacing w:after="40" w:before="40" w:line="276" w:lineRule="auto"/>
+              <w:rPr/>
+            </w:pPr>
+            <w:r>
+              <w:rPr>
+                <w:rFonts w:ascii="Calibri" w:cs="Calibri" w:eastAsia="Calibri" w:hAnsi="Calibri"/>
+                <w:color w:val="0f172a"/>
+                <w:sz w:val="20"/>
+                <w:szCs w:val="20"/>
+                <w:rtl w:val="0"/>
+              </w:rPr>
+              <w:t xml:space="preserve">Đã giải quyết (PR #215)</w:t>
+            </w:r>
+          </w:p>
+        </w:tc>
+      </w:tr>
+      <w:tr>
+        <w:trPr>
+          <w:cantSplit w:val="0"/>
+          <w:tblHeader w:val="0"/>
+        </w:trPr>
+        <w:tc>
+          <w:tcPr>
+            <w:tcW w:w="2512" w:type="dxa"/>
+            <w:shd w:fill="ffffff" w:val="clear"/>
+            <w:tcMar>
+              <w:top w:w="70.0" w:type="dxa"/>
+              <w:left w:w="90.0" w:type="dxa"/>
+              <w:bottom w:w="70.0" w:type="dxa"/>
+              <w:right w:w="90.0" w:type="dxa"/>
+            </w:tcMar>
+            <w:vAlign w:val="center"/>
+          </w:tcPr>
+          <w:p>
+            <w:pPr>
+              <w:jc w:val="left"/>
+              <w:spacing w:after="40" w:before="40" w:line="276" w:lineRule="auto"/>
+              <w:rPr/>
+            </w:pPr>
+            <w:r>
+              <w:rPr>
+                <w:rFonts w:ascii="Calibri" w:cs="Calibri" w:eastAsia="Calibri" w:hAnsi="Calibri"/>
+                <w:color w:val="0f172a"/>
+                <w:sz w:val="20"/>
+                <w:szCs w:val="20"/>
+                <w:rtl w:val="0"/>
+              </w:rPr>
+              <w:t xml:space="preserve">Lỗi tràn URL HTTP 414</w:t>
+            </w:r>
+          </w:p>
+        </w:tc>
+        <w:tc>
+          <w:tcPr>
+            <w:tcW w:w="3070" w:type="dxa"/>
+            <w:shd w:fill="ffffff" w:val="clear"/>
+            <w:tcMar>
+              <w:top w:w="70.0" w:type="dxa"/>
+              <w:left w:w="90.0" w:type="dxa"/>
+              <w:bottom w:w="70.0" w:type="dxa"/>
+              <w:right w:w="90.0" w:type="dxa"/>
+            </w:tcMar>
+            <w:vAlign w:val="center"/>
+          </w:tcPr>
+          <w:p>
+            <w:pPr>
+              <w:jc w:val="left"/>
+              <w:spacing w:after="40" w:before="40" w:line="276" w:lineRule="auto"/>
+              <w:rPr/>
+            </w:pPr>
+            <w:r>
+              <w:rPr>
+                <w:rFonts w:ascii="Calibri" w:cs="Calibri" w:eastAsia="Calibri" w:hAnsi="Calibri"/>
+                <w:color w:val="0f172a"/>
+                <w:sz w:val="20"/>
+                <w:szCs w:val="20"/>
+                <w:rtl w:val="0"/>
+              </w:rPr>
+              <w:t xml:space="preserve">Điều hướng từ AI Demand Forecast sang RFQ mang mảng SKU thuốc quá dài trên query URL.</w:t>
+            </w:r>
+          </w:p>
+        </w:tc>
+        <w:tc>
+          <w:tcPr>
+            <w:tcW w:w="2512" w:type="dxa"/>
+            <w:shd w:fill="ffffff" w:val="clear"/>
+            <w:tcMar>
+              <w:top w:w="70.0" w:type="dxa"/>
+              <w:left w:w="90.0" w:type="dxa"/>
+              <w:bottom w:w="70.0" w:type="dxa"/>
+              <w:right w:w="90.0" w:type="dxa"/>
+            </w:tcMar>
+            <w:vAlign w:val="center"/>
+          </w:tcPr>
+          <w:p>
+            <w:pPr>
+              <w:jc w:val="left"/>
+              <w:spacing w:after="40" w:before="40" w:line="276" w:lineRule="auto"/>
+              <w:rPr/>
+            </w:pPr>
+            <w:r>
+              <w:rPr>
+                <w:rFonts w:ascii="Calibri" w:cs="Calibri" w:eastAsia="Calibri" w:hAnsi="Calibri"/>
+                <w:color w:val="0f172a"/>
+                <w:sz w:val="20"/>
+                <w:szCs w:val="20"/>
+                <w:rtl w:val="0"/>
+              </w:rPr>
+              <w:t xml:space="preserve">Trình duyệt từ chối request, không tạo được RFQ hàng loạt từ AI.</w:t>
+            </w:r>
+          </w:p>
+        </w:tc>
+        <w:tc>
+          <w:tcPr>
+            <w:tcW w:w="3070" w:type="dxa"/>
+            <w:shd w:fill="ffffff" w:val="clear"/>
+            <w:tcMar>
+              <w:top w:w="70.0" w:type="dxa"/>
+              <w:left w:w="90.0" w:type="dxa"/>
+              <w:bottom w:w="70.0" w:type="dxa"/>
+              <w:right w:w="90.0" w:type="dxa"/>
+            </w:tcMar>
+            <w:vAlign w:val="center"/>
+          </w:tcPr>
+          <w:p>
+            <w:pPr>
+              <w:jc w:val="left"/>
+              <w:spacing w:after="40" w:before="40" w:line="276" w:lineRule="auto"/>
+              <w:rPr/>
+            </w:pPr>
+            <w:r>
+              <w:rPr>
+                <w:rFonts w:ascii="Calibri" w:cs="Calibri" w:eastAsia="Calibri" w:hAnsi="Calibri"/>
+                <w:color w:val="0f172a"/>
+                <w:sz w:val="20"/>
+                <w:szCs w:val="20"/>
+                <w:rtl w:val="0"/>
+              </w:rPr>
+              <w:t xml:space="preserve">Chuyển payload SKU qua React router state nội bộ và POST body.</w:t>
+            </w:r>
+          </w:p>
+        </w:tc>
+        <w:tc>
+          <w:tcPr>
+            <w:tcW w:w="1396" w:type="dxa"/>
+            <w:shd w:fill="ffffff" w:val="clear"/>
+            <w:tcMar>
+              <w:top w:w="70.0" w:type="dxa"/>
+              <w:left w:w="90.0" w:type="dxa"/>
+              <w:bottom w:w="70.0" w:type="dxa"/>
+              <w:right w:w="90.0" w:type="dxa"/>
+            </w:tcMar>
+            <w:vAlign w:val="center"/>
+          </w:tcPr>
+          <w:p>
+            <w:pPr>
+              <w:jc w:val="left"/>
+              <w:spacing w:after="40" w:before="40" w:line="276" w:lineRule="auto"/>
+              <w:rPr/>
+            </w:pPr>
+            <w:r>
+              <w:rPr>
+                <w:rFonts w:ascii="Calibri" w:cs="Calibri" w:eastAsia="Calibri" w:hAnsi="Calibri"/>
+                <w:color w:val="0f172a"/>
+                <w:sz w:val="20"/>
+                <w:szCs w:val="20"/>
+                <w:rtl w:val="0"/>
+              </w:rPr>
+              <w:t xml:space="preserve">15/10/2026</w:t>
+            </w:r>
+          </w:p>
+        </w:tc>
+        <w:tc>
+          <w:tcPr>
+            <w:tcW w:w="1396" w:type="dxa"/>
+            <w:shd w:fill="ffffff" w:val="clear"/>
+            <w:tcMar>
+              <w:top w:w="70.0" w:type="dxa"/>
+              <w:left w:w="90.0" w:type="dxa"/>
+              <w:bottom w:w="70.0" w:type="dxa"/>
+              <w:right w:w="90.0" w:type="dxa"/>
+            </w:tcMar>
+            <w:vAlign w:val="center"/>
+          </w:tcPr>
+          <w:p>
+            <w:pPr>
+              <w:jc w:val="left"/>
+              <w:spacing w:after="40" w:before="40" w:line="276" w:lineRule="auto"/>
+              <w:rPr/>
+            </w:pPr>
+            <w:r>
+              <w:rPr>
+                <w:rFonts w:ascii="Calibri" w:cs="Calibri" w:eastAsia="Calibri" w:hAnsi="Calibri"/>
+                <w:color w:val="0f172a"/>
+                <w:sz w:val="20"/>
+                <w:szCs w:val="20"/>
+                <w:rtl w:val="0"/>
+              </w:rPr>
+              <w:t xml:space="preserve">Đã merge PR #227</w:t>
+            </w:r>
+          </w:p>
+        </w:tc>
+      </w:tr>
+      <w:tr>
+        <w:trPr>
+          <w:cantSplit w:val="0"/>
+          <w:tblHeader w:val="0"/>
+        </w:trPr>
+        <w:tc>
+          <w:tcPr>
+            <w:tcW w:w="2512" w:type="dxa"/>
+            <w:shd w:fill="f8fafc" w:val="clear"/>
+            <w:tcMar>
+              <w:top w:w="70.0" w:type="dxa"/>
+              <w:left w:w="90.0" w:type="dxa"/>
+              <w:bottom w:w="70.0" w:type="dxa"/>
+              <w:right w:w="90.0" w:type="dxa"/>
+            </w:tcMar>
+            <w:vAlign w:val="center"/>
+          </w:tcPr>
+          <w:p>
+            <w:pPr>
+              <w:jc w:val="left"/>
+              <w:spacing w:after="40" w:before="40" w:line="276" w:lineRule="auto"/>
+              <w:rPr/>
+            </w:pPr>
+            <w:r>
+              <w:rPr>
+                <w:rFonts w:ascii="Calibri" w:cs="Calibri" w:eastAsia="Calibri" w:hAnsi="Calibri"/>
+                <w:color w:val="0f172a"/>
+                <w:sz w:val="20"/>
+                <w:szCs w:val="20"/>
+                <w:rtl w:val="0"/>
+              </w:rPr>
+              <w:t xml:space="preserve">Lỗ hổng bảo mật Voucher</w:t>
+            </w:r>
+          </w:p>
+        </w:tc>
+        <w:tc>
+          <w:tcPr>
+            <w:tcW w:w="3070" w:type="dxa"/>
+            <w:shd w:fill="f8fafc" w:val="clear"/>
+            <w:tcMar>
+              <w:top w:w="70.0" w:type="dxa"/>
+              <w:left w:w="90.0" w:type="dxa"/>
+              <w:bottom w:w="70.0" w:type="dxa"/>
+              <w:right w:w="90.0" w:type="dxa"/>
+            </w:tcMar>
+            <w:vAlign w:val="center"/>
+          </w:tcPr>
+          <w:p>
+            <w:pPr>
+              <w:jc w:val="left"/>
+              <w:spacing w:after="40" w:before="40" w:line="276" w:lineRule="auto"/>
+              <w:rPr/>
+            </w:pPr>
+            <w:r>
+              <w:rPr>
+                <w:rFonts w:ascii="Calibri" w:cs="Calibri" w:eastAsia="Calibri" w:hAnsi="Calibri"/>
+                <w:color w:val="0f172a"/>
+                <w:sz w:val="20"/>
+                <w:szCs w:val="20"/>
+                <w:rtl w:val="0"/>
+              </w:rPr>
+              <w:t xml:space="preserve">VoucherController thiếu kiểm tra quyền chi nhánh và đối tượng áp dụng (nguy cơ IDOR).</w:t>
+            </w:r>
+          </w:p>
+        </w:tc>
+        <w:tc>
+          <w:tcPr>
+            <w:tcW w:w="2512" w:type="dxa"/>
+            <w:shd w:fill="f8fafc" w:val="clear"/>
+            <w:tcMar>
+              <w:top w:w="70.0" w:type="dxa"/>
+              <w:left w:w="90.0" w:type="dxa"/>
+              <w:bottom w:w="70.0" w:type="dxa"/>
+              <w:right w:w="90.0" w:type="dxa"/>
+            </w:tcMar>
+            <w:vAlign w:val="center"/>
+          </w:tcPr>
+          <w:p>
+            <w:pPr>
+              <w:jc w:val="left"/>
+              <w:spacing w:after="40" w:before="40" w:line="276" w:lineRule="auto"/>
+              <w:rPr/>
+            </w:pPr>
+            <w:r>
+              <w:rPr>
+                <w:rFonts w:ascii="Calibri" w:cs="Calibri" w:eastAsia="Calibri" w:hAnsi="Calibri"/>
+                <w:color w:val="0f172a"/>
+                <w:sz w:val="20"/>
+                <w:szCs w:val="20"/>
+                <w:rtl w:val="0"/>
+              </w:rPr>
+              <w:t xml:space="preserve">Khách hàng có thể áp dụng mã giảm giá không thuộc thẩm quyền.</w:t>
+            </w:r>
+          </w:p>
+        </w:tc>
+        <w:tc>
+          <w:tcPr>
+            <w:tcW w:w="3070" w:type="dxa"/>
+            <w:shd w:fill="f8fafc" w:val="clear"/>
+            <w:tcMar>
+              <w:top w:w="70.0" w:type="dxa"/>
+              <w:left w:w="90.0" w:type="dxa"/>
+              <w:bottom w:w="70.0" w:type="dxa"/>
+              <w:right w:w="90.0" w:type="dxa"/>
+            </w:tcMar>
+            <w:vAlign w:val="center"/>
+          </w:tcPr>
+          <w:p>
+            <w:pPr>
+              <w:jc w:val="left"/>
+              <w:spacing w:after="40" w:before="40" w:line="276" w:lineRule="auto"/>
+              <w:rPr/>
+            </w:pPr>
+            <w:r>
+              <w:rPr>
+                <w:rFonts w:ascii="Calibri" w:cs="Calibri" w:eastAsia="Calibri" w:hAnsi="Calibri"/>
+                <w:color w:val="0f172a"/>
+                <w:sz w:val="20"/>
+                <w:szCs w:val="20"/>
+                <w:rtl w:val="0"/>
+              </w:rPr>
+              <w:t xml:space="preserve">Bổ sung RBAC guards và validate điều kiện voucher nghiêm ngặt tại Backend.</w:t>
+            </w:r>
+          </w:p>
+        </w:tc>
+        <w:tc>
+          <w:tcPr>
+            <w:tcW w:w="1396" w:type="dxa"/>
+            <w:shd w:fill="f8fafc" w:val="clear"/>
+            <w:tcMar>
+              <w:top w:w="70.0" w:type="dxa"/>
+              <w:left w:w="90.0" w:type="dxa"/>
+              <w:bottom w:w="70.0" w:type="dxa"/>
+              <w:right w:w="90.0" w:type="dxa"/>
+            </w:tcMar>
+            <w:vAlign w:val="center"/>
+          </w:tcPr>
+          <w:p>
+            <w:pPr>
+              <w:jc w:val="left"/>
+              <w:spacing w:after="40" w:before="40" w:line="276" w:lineRule="auto"/>
+              <w:rPr/>
+            </w:pPr>
+            <w:r>
+              <w:rPr>
+                <w:rFonts w:ascii="Calibri" w:cs="Calibri" w:eastAsia="Calibri" w:hAnsi="Calibri"/>
+                <w:color w:val="0f172a"/>
+                <w:sz w:val="20"/>
+                <w:szCs w:val="20"/>
+                <w:rtl w:val="0"/>
+              </w:rPr>
+              <w:t xml:space="preserve">16/10/2026</w:t>
+            </w:r>
+          </w:p>
+        </w:tc>
+        <w:tc>
+          <w:tcPr>
+            <w:tcW w:w="1396" w:type="dxa"/>
+            <w:shd w:fill="f8fafc" w:val="clear"/>
+            <w:tcMar>
+              <w:top w:w="70.0" w:type="dxa"/>
+              <w:left w:w="90.0" w:type="dxa"/>
+              <w:bottom w:w="70.0" w:type="dxa"/>
+              <w:right w:w="90.0" w:type="dxa"/>
+            </w:tcMar>
+            <w:vAlign w:val="center"/>
+          </w:tcPr>
+          <w:p>
+            <w:pPr>
+              <w:jc w:val="left"/>
+              <w:spacing w:after="40" w:before="40" w:line="276" w:lineRule="auto"/>
+              <w:rPr/>
+            </w:pPr>
+            <w:r>
+              <w:rPr>
+                <w:rFonts w:ascii="Calibri" w:cs="Calibri" w:eastAsia="Calibri" w:hAnsi="Calibri"/>
+                <w:color w:val="0f172a"/>
+                <w:sz w:val="20"/>
+                <w:szCs w:val="20"/>
+                <w:rtl w:val="0"/>
+              </w:rPr>
+              <w:t xml:space="preserve">Đã merge PR #223</w:t>
+            </w:r>
+          </w:p>
+        </w:tc>
+      </w:tr>
+      <w:tr>
+        <w:trPr>
+          <w:cantSplit w:val="0"/>
+          <w:tblHeader w:val="0"/>
+        </w:trPr>
+        <w:tc>
+          <w:tcPr>
+            <w:tcW w:w="2512" w:type="dxa"/>
+            <w:shd w:fill="ffffff" w:val="clear"/>
+            <w:tcMar>
+              <w:top w:w="70.0" w:type="dxa"/>
+              <w:left w:w="90.0" w:type="dxa"/>
+              <w:bottom w:w="70.0" w:type="dxa"/>
+              <w:right w:w="90.0" w:type="dxa"/>
+            </w:tcMar>
+            <w:vAlign w:val="center"/>
+          </w:tcPr>
+          <w:p>
+            <w:pPr>
+              <w:jc w:val="left"/>
+              <w:spacing w:after="40" w:before="40" w:line="276" w:lineRule="auto"/>
+              <w:rPr/>
+            </w:pPr>
+            <w:r>
+              <w:rPr>
+                <w:rFonts w:ascii="Calibri" w:cs="Calibri" w:eastAsia="Calibri" w:hAnsi="Calibri"/>
+                <w:color w:val="0f172a"/>
+                <w:sz w:val="20"/>
+                <w:szCs w:val="20"/>
+                <w:rtl w:val="0"/>
+              </w:rPr>
+              <w:t xml:space="preserve">Nhận diện ảnh AI Roboflow trả kết quả mặc định</w:t>
+            </w:r>
+          </w:p>
+        </w:tc>
+        <w:tc>
+          <w:tcPr>
+            <w:tcW w:w="3070" w:type="dxa"/>
+            <w:shd w:fill="ffffff" w:val="clear"/>
+            <w:tcMar>
+              <w:top w:w="70.0" w:type="dxa"/>
+              <w:left w:w="90.0" w:type="dxa"/>
+              <w:bottom w:w="70.0" w:type="dxa"/>
+              <w:right w:w="90.0" w:type="dxa"/>
+            </w:tcMar>
+            <w:vAlign w:val="center"/>
+          </w:tcPr>
+          <w:p>
+            <w:pPr>
+              <w:jc w:val="left"/>
+              <w:spacing w:after="40" w:before="40" w:line="276" w:lineRule="auto"/>
+              <w:rPr/>
+            </w:pPr>
+            <w:r>
+              <w:rPr>
+                <w:rFonts w:ascii="Calibri" w:cs="Calibri" w:eastAsia="Calibri" w:hAnsi="Calibri"/>
+                <w:color w:val="0f172a"/>
+                <w:sz w:val="20"/>
+                <w:szCs w:val="20"/>
+                <w:rtl w:val="0"/>
+              </w:rPr>
+              <w:t xml:space="preserve">Khi thiếu API key hoặc lỗi mạng, AI kiểm nhận trả số lượng dự kiến và độ tin cậy fallback.</w:t>
+            </w:r>
+          </w:p>
+        </w:tc>
+        <w:tc>
+          <w:tcPr>
+            <w:tcW w:w="2512" w:type="dxa"/>
+            <w:shd w:fill="ffffff" w:val="clear"/>
+            <w:tcMar>
+              <w:top w:w="70.0" w:type="dxa"/>
+              <w:left w:w="90.0" w:type="dxa"/>
+              <w:bottom w:w="70.0" w:type="dxa"/>
+              <w:right w:w="90.0" w:type="dxa"/>
+            </w:tcMar>
+            <w:vAlign w:val="center"/>
+          </w:tcPr>
+          <w:p>
+            <w:pPr>
+              <w:jc w:val="left"/>
+              <w:spacing w:after="40" w:before="40" w:line="276" w:lineRule="auto"/>
+              <w:rPr/>
+            </w:pPr>
+            <w:r>
+              <w:rPr>
+                <w:rFonts w:ascii="Calibri" w:cs="Calibri" w:eastAsia="Calibri" w:hAnsi="Calibri"/>
+                <w:color w:val="0f172a"/>
+                <w:sz w:val="20"/>
+                <w:szCs w:val="20"/>
+                <w:rtl w:val="0"/>
+              </w:rPr>
+              <w:t xml:space="preserve">Dễ gây nhầm lẫn giữa kết quả nhận diện AI thật và dữ liệu giả lập dự phòng.</w:t>
+            </w:r>
+          </w:p>
+        </w:tc>
+        <w:tc>
+          <w:tcPr>
+            <w:tcW w:w="3070" w:type="dxa"/>
+            <w:shd w:fill="ffffff" w:val="clear"/>
+            <w:tcMar>
+              <w:top w:w="70.0" w:type="dxa"/>
+              <w:left w:w="90.0" w:type="dxa"/>
+              <w:bottom w:w="70.0" w:type="dxa"/>
+              <w:right w:w="90.0" w:type="dxa"/>
+            </w:tcMar>
+            <w:vAlign w:val="center"/>
+          </w:tcPr>
+          <w:p>
+            <w:pPr>
+              <w:jc w:val="left"/>
+              <w:spacing w:after="40" w:before="40" w:line="276" w:lineRule="auto"/>
+              <w:rPr/>
+            </w:pPr>
+            <w:r>
+              <w:rPr>
+                <w:rFonts w:ascii="Calibri" w:cs="Calibri" w:eastAsia="Calibri" w:hAnsi="Calibri"/>
+                <w:color w:val="0f172a"/>
+                <w:sz w:val="20"/>
+                <w:szCs w:val="20"/>
+                <w:rtl w:val="0"/>
+              </w:rPr>
+              <w:t xml:space="preserve">Gắn cờ isFallback rõ ràng, hiển thị cảnh báo trên UI mobile/web để thủ kho đối soát thủ công.</w:t>
+            </w:r>
+          </w:p>
+        </w:tc>
+        <w:tc>
+          <w:tcPr>
+            <w:tcW w:w="1396" w:type="dxa"/>
+            <w:shd w:fill="ffffff" w:val="clear"/>
+            <w:tcMar>
+              <w:top w:w="70.0" w:type="dxa"/>
+              <w:left w:w="90.0" w:type="dxa"/>
+              <w:bottom w:w="70.0" w:type="dxa"/>
+              <w:right w:w="90.0" w:type="dxa"/>
+            </w:tcMar>
+            <w:vAlign w:val="center"/>
+          </w:tcPr>
+          <w:p>
+            <w:pPr>
+              <w:jc w:val="left"/>
+              <w:spacing w:after="40" w:before="40" w:line="276" w:lineRule="auto"/>
+              <w:rPr/>
+            </w:pPr>
+            <w:r>
+              <w:rPr>
+                <w:rFonts w:ascii="Calibri" w:cs="Calibri" w:eastAsia="Calibri" w:hAnsi="Calibri"/>
+                <w:color w:val="0f172a"/>
+                <w:sz w:val="20"/>
+                <w:szCs w:val="20"/>
+                <w:rtl w:val="0"/>
+              </w:rPr>
+              <w:t xml:space="preserve">20/10/2026</w:t>
+            </w:r>
+          </w:p>
+        </w:tc>
+        <w:tc>
+          <w:tcPr>
+            <w:tcW w:w="1396" w:type="dxa"/>
+            <w:shd w:fill="ffffff" w:val="clear"/>
+            <w:tcMar>
+              <w:top w:w="70.0" w:type="dxa"/>
+              <w:left w:w="90.0" w:type="dxa"/>
+              <w:bottom w:w="70.0" w:type="dxa"/>
+              <w:right w:w="90.0" w:type="dxa"/>
+            </w:tcMar>
+            <w:vAlign w:val="center"/>
+          </w:tcPr>
+          <w:p>
+            <w:pPr>
+              <w:jc w:val="left"/>
+              <w:spacing w:after="40" w:before="40" w:line="276" w:lineRule="auto"/>
+              <w:rPr/>
+            </w:pPr>
+            <w:r>
+              <w:rPr>
+                <w:rFonts w:ascii="Calibri" w:cs="Calibri" w:eastAsia="Calibri" w:hAnsi="Calibri"/>
+                <w:color w:val="0f172a"/>
+                <w:sz w:val="20"/>
+                <w:szCs w:val="20"/>
+                <w:rtl w:val="0"/>
+              </w:rPr>
+              <w:t xml:space="preserve">Đang xử lý</w:t>
+            </w:r>
+          </w:p>
+        </w:tc>
+      </w:tr>
+    </w:tbl>
+    <w:p>
+      <w:pPr>
+        <w:pStyle w:val="Heading3"/>
+        <w:spacing w:after="40" w:before="120" w:line="276" w:lineRule="auto"/>
+        <w:rPr/>
+      </w:pPr>
+      <w:r>
+        <w:rPr>
+          <w:rFonts w:ascii="Calibri" w:cs="Calibri" w:eastAsia="Calibri" w:hAnsi="Calibri"/>
+          <w:b w:val="1"/>
+          <w:bCs w:val="1"/>
+          <w:color w:val="1e3a8a"/>
+          <w:sz w:val="24"/>
+          <w:szCs w:val="24"/>
+          <w:rtl w:val="0"/>
+        </w:rPr>
+        <w:t xml:space="preserve">Plan next week</w:t>
+      </w:r>
+    </w:p>
+    <w:p>
+      <w:pPr>
+        <w:spacing w:after="40" w:before="0" w:line="276" w:lineRule="auto"/>
+        <w:rPr/>
+      </w:pPr>
+      <w:r>
+        <w:rPr>
+          <w:rFonts w:ascii="Calibri" w:cs="Calibri" w:eastAsia="Calibri" w:hAnsi="Calibri"/>
+          <w:i w:val="1"/>
+          <w:iCs w:val="1"/>
+          <w:color w:val="64748b"/>
+          <w:sz w:val="20"/>
+          <w:szCs w:val="20"/>
+          <w:rtl w:val="0"/>
+        </w:rPr>
+        <w:t xml:space="preserve">Tuần sau “dự kiến” làm gì?</w:t>
+      </w:r>
+    </w:p>
+    <w:tbl>
+      <w:tblPr>
+        <w:tblStyle w:val="Table1"/>
+        <w:tblW w:w="13958.0" w:type="dxa"/>
+        <w:jc w:val="center"/>
+        <w:tblBorders>
+          <w:top w:color="cbd5e1" w:space="0" w:sz="4" w:val="single"/>
+          <w:left w:color="cbd5e1" w:space="0" w:sz="4" w:val="single"/>
+          <w:bottom w:color="cbd5e1" w:space="0" w:sz="4" w:val="single"/>
+          <w:right w:color="cbd5e1" w:space="0" w:sz="4" w:val="single"/>
+          <w:insideH w:color="cbd5e1" w:space="0" w:sz="4" w:val="single"/>
+          <w:insideV w:color="cbd5e1" w:space="0" w:sz="4" w:val="single"/>
+        </w:tblBorders>
+        <w:tblLayout w:type="fixed"/>
+        <w:tblLook w:val="0400"/>
+      </w:tblPr>
+      <w:tblGrid>
+        <w:gridCol w:w="6979"/>
+        <w:gridCol w:w="6979"/>
+      </w:tblGrid>
+      <w:tr>
+        <w:trPr>
+          <w:cantSplit w:val="0"/>
+          <w:tblHeader w:val="0"/>
+        </w:trPr>
+        <w:tc>
+          <w:tcPr>
+            <w:tcW w:w="6979" w:type="dxa"/>
+            <w:shd w:fill="ffffff" w:val="clear"/>
+            <w:tcMar>
+              <w:top w:w="70.0" w:type="dxa"/>
+              <w:left w:w="90.0" w:type="dxa"/>
+              <w:bottom w:w="70.0" w:type="dxa"/>
+              <w:right w:w="90.0" w:type="dxa"/>
+            </w:tcMar>
+            <w:vAlign w:val="center"/>
+          </w:tcPr>
+          <w:p>
+            <w:pPr>
+              <w:jc w:val="left"/>
+              <w:spacing w:after="40" w:before="40" w:line="276" w:lineRule="auto"/>
+              <w:rPr/>
+            </w:pPr>
+            <w:r>
+              <w:rPr>
+                <w:rFonts w:ascii="Calibri" w:cs="Calibri" w:eastAsia="Calibri" w:hAnsi="Calibri"/>
+                <w:b w:val="1"/>
+                <w:bCs w:val="1"/>
+                <w:color w:val="1e3a8a"/>
+                <w:sz w:val="20"/>
+                <w:szCs w:val="20"/>
+                <w:rtl w:val="0"/>
+              </w:rPr>
+              <w:t xml:space="preserve">Recover</w:t>
+            </w:r>
+          </w:p>
+        </w:tc>
+        <w:tc>
+          <w:tcPr>
+            <w:tcW w:w="6979" w:type="dxa"/>
+            <w:shd w:fill="ffffff" w:val="clear"/>
+            <w:tcMar>
+              <w:top w:w="70.0" w:type="dxa"/>
+              <w:left w:w="90.0" w:type="dxa"/>
+              <w:bottom w:w="70.0" w:type="dxa"/>
+              <w:right w:w="90.0" w:type="dxa"/>
+            </w:tcMar>
+            <w:vAlign w:val="center"/>
+          </w:tcPr>
+          <w:p>
+            <w:pPr>
+              <w:jc w:val="left"/>
+              <w:spacing w:after="40" w:before="40" w:line="276" w:lineRule="auto"/>
+              <w:rPr/>
+            </w:pPr>
+            <w:r>
+              <w:rPr>
+                <w:rFonts w:ascii="Calibri" w:cs="Calibri" w:eastAsia="Calibri" w:hAnsi="Calibri"/>
+                <w:color w:val="0f172a"/>
+                <w:sz w:val="20"/>
+                <w:szCs w:val="20"/>
+                <w:rtl w:val="0"/>
+              </w:rPr>
+              <w:t xml:space="preserve">• Tiếp tục hoàn tất kiểm thử kịch bản biên của Email Marketing tự động (hủy lịch gửi, xóa chiến dịch, đo lường tỷ lệ thành công).</w:t>
+              <w:br/>
+              <w:t xml:space="preserve">• Kiểm tra thực tế ảnh hàng hóa với Roboflow AI và hoàn tất cập nhật số lô, hạn dùng vào tồn kho kho tổng.</w:t>
+              <w:br/>
+              <w:t xml:space="preserve">• Hoàn thiện tính năng tư vấn đơn thuốc bằng giọng nói AI (useVoiceInput) tại quầy POS.</w:t>
+            </w:r>
+          </w:p>
+        </w:tc>
+      </w:tr>
+      <w:tr>
+        <w:trPr>
+          <w:cantSplit w:val="0"/>
+          <w:tblHeader w:val="0"/>
+        </w:trPr>
+        <w:tc>
+          <w:tcPr>
+            <w:tcW w:w="6979" w:type="dxa"/>
+            <w:shd w:fill="f8fafc" w:val="clear"/>
+            <w:tcMar>
+              <w:top w:w="70.0" w:type="dxa"/>
+              <w:left w:w="90.0" w:type="dxa"/>
+              <w:bottom w:w="70.0" w:type="dxa"/>
+              <w:right w:w="90.0" w:type="dxa"/>
+            </w:tcMar>
+            <w:vAlign w:val="center"/>
+          </w:tcPr>
+          <w:p>
+            <w:pPr>
+              <w:jc w:val="left"/>
+              <w:spacing w:after="40" w:before="40" w:line="276" w:lineRule="auto"/>
+              <w:rPr/>
+            </w:pPr>
+            <w:r>
+              <w:rPr>
+                <w:rFonts w:ascii="Calibri" w:cs="Calibri" w:eastAsia="Calibri" w:hAnsi="Calibri"/>
+                <w:b w:val="1"/>
+                <w:bCs w:val="1"/>
+                <w:color w:val="1e3a8a"/>
+                <w:sz w:val="20"/>
+                <w:szCs w:val="20"/>
+                <w:rtl w:val="0"/>
+              </w:rPr>
+              <w:t xml:space="preserve">Master plan</w:t>
+            </w:r>
+          </w:p>
+        </w:tc>
+        <w:tc>
+          <w:tcPr>
+            <w:tcW w:w="6979" w:type="dxa"/>
+            <w:shd w:fill="f8fafc" w:val="clear"/>
+            <w:tcMar>
+              <w:top w:w="70.0" w:type="dxa"/>
+              <w:left w:w="90.0" w:type="dxa"/>
+              <w:bottom w:w="70.0" w:type="dxa"/>
+              <w:right w:w="90.0" w:type="dxa"/>
+            </w:tcMar>
+            <w:vAlign w:val="center"/>
+          </w:tcPr>
+          <w:p>
+            <w:pPr>
+              <w:jc w:val="left"/>
+              <w:spacing w:after="40" w:before="40" w:line="276" w:lineRule="auto"/>
+              <w:rPr/>
+            </w:pPr>
+            <w:r>
+              <w:rPr>
+                <w:rFonts w:ascii="Calibri" w:cs="Calibri" w:eastAsia="Calibri" w:hAnsi="Calibri"/>
+                <w:color w:val="0f172a"/>
+                <w:sz w:val="20"/>
+                <w:szCs w:val="20"/>
+                <w:rtl w:val="0"/>
+              </w:rPr>
+              <w:t xml:space="preserve">• Tổng duyệt và chạy thử toàn bộ kịch bản Demo Review 2 trên hệ thống staging/demo (luồng Bán hàng POS + Online VietQR, Sơ đồ kho 3D + FEFO, Báo giá RFQ + AI Forecast, Email Marketing UC-76, Mobile HR Chấm công GPS &amp; Vân tay).</w:t>
+              <w:br/>
+              <w:t xml:space="preserve">• Hoàn thiện bảng đối chiếu góp ý Review 1 và cập nhật tài liệu Software Design Document (SDD).</w:t>
+              <w:br/>
+              <w:t xml:space="preserve">• Chuẩn bị slide thuyết trình và phân công vai trò demo của từng thành viên trong buổi Review 2.</w:t>
+            </w:r>
+          </w:p>
+        </w:tc>
+      </w:tr>
+    </w:tbl>
+    <w:p>
+      <w:pPr>
+        <w:pStyle w:val="Heading2"/>
+        <w:spacing w:after="80" w:before="240" w:line="276" w:lineRule="auto"/>
+        <w:rPr/>
+      </w:pPr>
+      <w:r>
+        <w:rPr>
+          <w:rFonts w:ascii="Calibri" w:cs="Calibri" w:eastAsia="Calibri" w:hAnsi="Calibri"/>
+          <w:b w:val="1"/>
+          <w:bCs w:val="1"/>
+          <w:color w:val="1e3a8a"/>
+          <w:sz w:val="28"/>
+          <w:szCs w:val="28"/>
+          <w:rtl w:val="0"/>
+        </w:rPr>
+        <w:t xml:space="preserve">Meeting notes</w:t>
+      </w:r>
+    </w:p>
+    <w:p>
+      <w:pPr>
+        <w:spacing w:after="60" w:before="0" w:line="276" w:lineRule="auto"/>
+        <w:rPr/>
+      </w:pPr>
+      <w:r>
+        <w:rPr>
+          <w:rFonts w:ascii="Calibri" w:cs="Calibri" w:eastAsia="Calibri" w:hAnsi="Calibri"/>
+          <w:i w:val="1"/>
+          <w:iCs w:val="1"/>
+          <w:color w:val="64748b"/>
+          <w:sz w:val="20"/>
+          <w:szCs w:val="20"/>
+          <w:rtl w:val="0"/>
+        </w:rPr>
+        <w:t xml:space="preserve">// Cái phần này thì sẽ viết sau mỗi buổi họp</w:t>
+      </w:r>
+    </w:p>
+    <w:p>
+      <w:pPr>
+        <w:spacing w:after="60" w:before="0" w:line="276" w:lineRule="auto"/>
+        <w:rPr/>
+      </w:pPr>
+      <w:r>
+        <w:rPr>
+          <w:rFonts w:ascii="Calibri" w:cs="Calibri" w:eastAsia="Calibri" w:hAnsi="Calibri"/>
+          <w:i w:val="1"/>
+          <w:iCs w:val="1"/>
+          <w:color w:val="64748b"/>
+          <w:sz w:val="20"/>
+          <w:szCs w:val="20"/>
+          <w:rtl w:val="0"/>
+        </w:rPr>
+        <w:t xml:space="preserve">// gửi vào 2 chỗ</w:t>
+      </w:r>
+    </w:p>
+    <w:p>
+      <w:pPr>
+        <w:spacing w:after="60" w:before="0" w:line="276" w:lineRule="auto"/>
+        <w:rPr/>
+      </w:pPr>
+      <w:r>
+        <w:rPr>
+          <w:rFonts w:ascii="Calibri" w:cs="Calibri" w:eastAsia="Calibri" w:hAnsi="Calibri"/>
+          <w:i w:val="1"/>
+          <w:iCs w:val="1"/>
+          <w:color w:val="64748b"/>
+          <w:sz w:val="20"/>
+          <w:szCs w:val="20"/>
+          <w:rtl w:val="0"/>
+        </w:rPr>
+        <w:t xml:space="preserve">// 1 phần giữ lại trong file WORD này, sau này khi nộp bài thì copy&amp;paste cái file word ra là xong.</w:t>
+      </w:r>
+    </w:p>
+    <w:p>
+      <w:pPr>
+        <w:spacing w:after="60" w:before="0" w:line="276" w:lineRule="auto"/>
+        <w:rPr/>
+      </w:pPr>
+      <w:r>
+        <w:rPr>
+          <w:rFonts w:ascii="Calibri" w:cs="Calibri" w:eastAsia="Calibri" w:hAnsi="Calibri"/>
+          <w:i w:val="1"/>
+          <w:iCs w:val="1"/>
+          <w:color w:val="64748b"/>
+          <w:sz w:val="20"/>
+          <w:szCs w:val="20"/>
+          <w:rtl w:val="0"/>
+        </w:rPr>
+        <w:t xml:space="preserve">// nội dung meeting notes này thì copy&amp;paste lên trên discord, để tiện follow trao đổi</w:t>
+      </w:r>
+    </w:p>
+    <w:p>
+      <w:pPr>
+        <w:pStyle w:val="Heading3"/>
+        <w:spacing w:after="40" w:before="120" w:line="276" w:lineRule="auto"/>
+        <w:rPr/>
+      </w:pPr>
+      <w:r>
+        <w:rPr>
+          <w:rFonts w:ascii="Calibri" w:cs="Calibri" w:eastAsia="Calibri" w:hAnsi="Calibri"/>
+          <w:b w:val="1"/>
+          <w:bCs w:val="1"/>
+          <w:color w:val="1e3a8a"/>
+          <w:sz w:val="24"/>
+          <w:szCs w:val="24"/>
+          <w:rtl w:val="0"/>
+        </w:rPr>
+        <w:t xml:space="preserve">KEY NOTES</w:t>
+      </w:r>
+    </w:p>
+    <w:p>
+      <w:pPr>
+        <w:spacing w:after="60" w:before="0" w:line="276" w:lineRule="auto"/>
+        <w:rPr/>
+      </w:pPr>
+      <w:r>
+        <w:rPr>
+          <w:rFonts w:ascii="Calibri" w:cs="Calibri" w:eastAsia="Calibri" w:hAnsi="Calibri"/>
+          <w:i w:val="1"/>
+          <w:iCs w:val="1"/>
+          <w:color w:val="64748b"/>
+          <w:sz w:val="20"/>
+          <w:szCs w:val="20"/>
+          <w:rtl w:val="0"/>
+        </w:rPr>
+        <w:t xml:space="preserve">// các điểm đã thống nhất</w:t>
+      </w:r>
+    </w:p>
+    <w:p>
+      <w:pPr>
+        <w:spacing w:after="40" w:before="40" w:line="276" w:lineRule="auto"/>
+        <w:rPr/>
+      </w:pPr>
+      <w:r>
+        <w:rPr>
+          <w:rFonts w:ascii="Calibri" w:cs="Calibri" w:eastAsia="Calibri" w:hAnsi="Calibri"/>
+          <w:sz w:val="21"/>
+          <w:szCs w:val="21"/>
+          <w:rtl w:val="0"/>
+        </w:rPr>
+        <w:t xml:space="preserve">- Thống nhất đóng gói và khóa nhánh tính năng, tập trung 100% nguồn lực cho buổi Sprint Review 2 sắp tới.</w:t>
+        <w:br/>
+        <w:t xml:space="preserve">- Thống nhất luồng kiểm nhận hàng hóa qua mã QR PO: Web hiển thị QR -&gt; Mobile quét và chụp ảnh kiện hàng gửi AI Roboflow -&gt; Thủ kho xác nhận số lượng thực tế -&gt; Tự động nhập kho và gán kệ theo chuẩn FEFO.</w:t>
+        <w:br/>
+        <w:t xml:space="preserve">- Thống nhất phân nhóm Email Marketing (UC-76) tinh gọn thành 2 nhóm ALL (tất cả khách hàng hợp lệ) và VIP (hạng Gold/Platinum/điểm cao), đảm bảo tính thực tiễn cao khi demo.</w:t>
+        <w:br/>
+        <w:t xml:space="preserve">- Nghiệm thu thành công cơ chế lưu cache Docker build trên GitHub Actions giúp giảm thời gian restart server demo từ 15 phút xuống dưới 3 phút.</w:t>
+      </w:r>
+    </w:p>
+    <w:p>
+      <w:pPr>
+        <w:pStyle w:val="Heading3"/>
+        <w:spacing w:after="40" w:before="120" w:line="276" w:lineRule="auto"/>
+        <w:rPr/>
+      </w:pPr>
+      <w:r>
+        <w:rPr>
+          <w:rFonts w:ascii="Calibri" w:cs="Calibri" w:eastAsia="Calibri" w:hAnsi="Calibri"/>
+          <w:b w:val="1"/>
+          <w:bCs w:val="1"/>
+          <w:color w:val="1e3a8a"/>
+          <w:sz w:val="24"/>
+          <w:szCs w:val="24"/>
+          <w:rtl w:val="0"/>
+        </w:rPr>
+        <w:t xml:space="preserve">TODO</w:t>
+      </w:r>
+    </w:p>
+    <w:p>
+      <w:pPr>
+        <w:spacing w:after="60" w:before="0" w:line="276" w:lineRule="auto"/>
+        <w:rPr/>
+      </w:pPr>
+      <w:r>
+        <w:rPr>
+          <w:rFonts w:ascii="Calibri" w:cs="Calibri" w:eastAsia="Calibri" w:hAnsi="Calibri"/>
+          <w:i w:val="1"/>
+          <w:iCs w:val="1"/>
+          <w:color w:val="64748b"/>
+          <w:sz w:val="20"/>
+          <w:szCs w:val="20"/>
+          <w:rtl w:val="0"/>
+        </w:rPr>
+        <w:t xml:space="preserve">// các việc phải làm mới thảo luận trong cuộc họp</w:t>
+      </w:r>
+    </w:p>
+    <w:p>
+      <w:pPr>
+        <w:spacing w:after="40" w:before="40" w:line="276" w:lineRule="auto"/>
+        <w:rPr/>
+      </w:pPr>
+      <w:r>
+        <w:rPr>
+          <w:rFonts w:ascii="Calibri" w:cs="Calibri" w:eastAsia="Calibri" w:hAnsi="Calibri"/>
+          <w:sz w:val="21"/>
+          <w:szCs w:val="21"/>
+          <w:rtl w:val="0"/>
+        </w:rPr>
+        <w:t xml:space="preserve">- [Phước]: Hoàn thiện tính năng tư vấn đơn thuốc bằng giọng nói AI (useVoiceInput) tại quầy POS, rà soát đối soát PayOS VietQR và ổn định hệ thống demo.</w:t>
+        <w:br/>
+        <w:t xml:space="preserve">- [Đạt]: Kiểm thử các ca biên Email Marketing (UC-76), chuẩn bị dữ liệu mẫu các chiến dịch gửi email và kịch bản demo Sơ đồ kho 3D.</w:t>
+        <w:br/>
+        <w:t xml:space="preserve">- [Nam]: Kiểm thử kiểm nhận bằng ảnh thực tế với Roboflow AI, xử lý phân biệt cờ fallback và hoàn thiện bảng đối chiếu góp ý Review 1.</w:t>
+        <w:br/>
+        <w:t xml:space="preserve">- [Phúc]: Tinh chỉnh luồng nghiệp vụ trên mobile app, chuẩn bị demo chấm công GPS geofencing và đăng nhập vân tay.</w:t>
+        <w:br/>
+        <w:t xml:space="preserve">- [Cả team]: Họp tổng duyệt demo vào tối Thứ Năm, rà soát slide và kịch bản đối đáp câu hỏi của hội đồng đánh giá.</w:t>
+      </w:r>
+    </w:p>
+    <w:p>
+      <w:pPr>
+        <w:pStyle w:val="Heading3"/>
+        <w:spacing w:after="40" w:before="120" w:line="276" w:lineRule="auto"/>
+        <w:rPr/>
+      </w:pPr>
+      <w:r>
+        <w:rPr>
+          <w:rFonts w:ascii="Calibri" w:cs="Calibri" w:eastAsia="Calibri" w:hAnsi="Calibri"/>
+          <w:b w:val="1"/>
+          <w:bCs w:val="1"/>
+          <w:color w:val="1e3a8a"/>
+          <w:sz w:val="24"/>
+          <w:szCs w:val="24"/>
+          <w:rtl w:val="0"/>
+        </w:rPr>
+        <w:t xml:space="preserve">Thời gian, địa điểm, thành phần tham dự</w:t>
+      </w:r>
+    </w:p>
+    <w:p>
+      <w:pPr>
+        <w:spacing w:after="80" w:before="40" w:line="276" w:lineRule="auto"/>
+        <w:rPr/>
+      </w:pPr>
+      <w:r>
+        <w:rPr>
+          <w:rFonts w:ascii="Calibri" w:cs="Calibri" w:eastAsia="Calibri" w:hAnsi="Calibri"/>
+          <w:sz w:val="21"/>
+          <w:szCs w:val="21"/>
+          <w:rtl w:val="0"/>
+        </w:rPr>
+        <w:t xml:space="preserve">• Thời gian: 20h00, Thứ Hai ngày 19/10/2026</w:t>
+        <w:br/>
+        <w:t xml:space="preserve">• Địa điểm: Discord Voice Channel (Kênh Họp Team)</w:t>
+        <w:br/>
+        <w:t xml:space="preserve">• Thành phần: Phước (Leader), Đạt, Nam, Phúc, Rim.</w:t>
+      </w:r>
+    </w:p>
+    <w:p>
+      <w:pPr>
+        <w:spacing w:after="80" w:before="80" w:line="276" w:lineRule="auto"/>
+        <w:rPr/>
+      </w:pPr>
+      <w:r>
+        <w:rPr>
+          <w:rFonts w:ascii="Calibri" w:cs="Calibri" w:eastAsia="Calibri" w:hAnsi="Calibri"/>
+          <w:sz w:val="20"/>
+          <w:szCs w:val="20"/>
+          <w:rtl w:val="0"/>
+        </w:rPr>
+        <w:t xml:space="preserve"> </w:t>
       </w:r>
     </w:p>
     <w:p>

</xml_diff>

<commit_message>
docs(weekly-report): cap nhat bao cao tien do tuan 7 (19/10 - 25/10/2026) va bien ban hop doi chieu master plan
</commit_message>
<xml_diff>
--- a/docs/Template-Weekly-report-and-weekly-3-meeting-notes.docx
+++ b/docs/Template-Weekly-report-and-weekly-3-meeting-notes.docx
@@ -1,5 +1,27 @@
 
-<file path=word/document.xml><?xml version="1.0" encoding="utf-8"?>
+<file path=customXML\item1.xml><?xml version="1.0" encoding="utf-8"?>
+<go:gDocsCustomXmlDataStorage xmlns:go="http://customooxmlschemas.google.com/" xmlns:r="http://schemas.openxmlformats.org/officeDocument/2006/relationships" uri="GoogleDocsCustomDataVersion2">
+  <go:docsCustomData xmlns:go="http://customooxmlschemas.google.com/" roundtripDataSignature="AMtx7mg3vowUfzNy4186hycm1ZH7NrJLLg==">CgMxLjAyDWguaXlqbGMzd3dxa2kyDmguNGF2N3dzZ3k0ZDlsOAByITFJWURUUWNtZUM1YURha0Z5Tnk3NTBYaXpZNHJrZDVxRw==</go:docsCustomData>
+</go:gDocsCustomXmlDataStorage>
+</file>
+
+<file path=customXML\itemProps1.xml><?xml version="1.0" encoding="utf-8"?>
+<ds:datastoreItem xmlns:ds="http://schemas.openxmlformats.org/officeDocument/2006/customXml" ds:itemID="{11111111-1234-1234-1234-123412341234}">
+  <ds:schemaRefs>
+    <ds:schemaRef ds:uri="http://schemas.openxmlformats.org/officeDocument/2006/relationships"/>
+    <ds:schemaRef ds:uri="http://customooxmlschemas.google.com/"/>
+  </ds:schemaRefs>
+</ds:datastoreItem>
+</file>
+
+<file path=docProps\core.xml><?xml version="1.0" encoding="utf-8"?>
+<cp:coreProperties xmlns:cp="http://schemas.openxmlformats.org/package/2006/metadata/core-properties" xmlns:dc="http://purl.org/dc/elements/1.1/" xmlns:dcterms="http://purl.org/dc/terms/" xmlns:dcmitype="http://purl.org/dc/dcmitype/" xmlns:xsi="http://www.w3.org/2001/XMLSchema-instance">
+  <dcterms:created xsi:type="dcterms:W3CDTF">2025-11-25T15:45:00Z</dcterms:created>
+  <dc:creator>Long Nguyen Xuan</dc:creator>
+</cp:coreProperties>
+</file>
+
+<file path=word\document.xml><?xml version="1.0" encoding="utf-8"?>
 <w:document xmlns:mc="http://schemas.openxmlformats.org/markup-compatibility/2006" xmlns:o="urn:schemas-microsoft-com:office:office" xmlns:r="http://schemas.openxmlformats.org/officeDocument/2006/relationships" xmlns:m="http://schemas.openxmlformats.org/officeDocument/2006/math" xmlns:v="urn:schemas-microsoft-com:vml" xmlns:wp="http://schemas.openxmlformats.org/drawingml/2006/wordprocessingDrawing" xmlns:w10="urn:schemas-microsoft-com:office:word" xmlns:w="http://schemas.openxmlformats.org/wordprocessingml/2006/main" xmlns:wne="http://schemas.microsoft.com/office/word/2006/wordml" xmlns:sl="http://schemas.openxmlformats.org/schemaLibrary/2006/main" xmlns:a="http://schemas.openxmlformats.org/drawingml/2006/main" xmlns:pic="http://schemas.openxmlformats.org/drawingml/2006/picture" xmlns:c="http://schemas.openxmlformats.org/drawingml/2006/chart" xmlns:lc="http://schemas.openxmlformats.org/drawingml/2006/lockedCanvas" xmlns:dgm="http://schemas.openxmlformats.org/drawingml/2006/diagram" xmlns:wps="http://schemas.microsoft.com/office/word/2010/wordprocessingShape" xmlns:wpg="http://schemas.microsoft.com/office/word/2010/wordprocessingGroup" xmlns:w14="http://schemas.microsoft.com/office/word/2010/wordml" xmlns:w15="http://schemas.microsoft.com/office/word/2012/wordml" xmlns:w16="http://schemas.microsoft.com/office/word/2018/wordml" xmlns:w16cex="http://schemas.microsoft.com/office/word/2018/wordml/cex" xmlns:w16cid="http://schemas.microsoft.com/office/word/2016/wordml/cid" xmlns="http://schemas.microsoft.com/office/tasks/2019/documenttasks" xmlns:cr="http://schemas.microsoft.com/office/comments/2020/reactions">
   <w:body>
     <w:p>
@@ -86,6 +108,1558 @@
           <w:rtl w:val="0"/>
         </w:rPr>
         <w:t xml:space="preserve">// ví dụ họp vào tối thứ tư, thì báo cáo sẽ là kết quả công việc từ thứ tư tuần trước, tới thứ ba tuần này </w:t>
+      </w:r>
+    </w:p>
+    <w:p>
+      <w:pPr>
+        <w:pStyle w:val="Heading1"/>
+        <w:spacing w:after="80" w:before="120" w:line="276" w:lineRule="auto"/>
+      </w:pPr>
+      <w:r>
+        <w:rPr>
+          <w:rFonts w:ascii="Calibri" w:cs="Calibri" w:eastAsia="Calibri" w:hAnsi="Calibri"/>
+          <w:b w:val="1"/>
+          <w:bCs w:val="1"/>
+          <w:color w:val="1E3A8A"/>
+        </w:rPr>
+        <w:t xml:space="preserve">[Tuần 7] 2026-10-19 ~ 2026-10-25</w:t>
+      </w:r>
+    </w:p>
+    <w:p>
+      <w:pPr>
+        <w:pStyle w:val="Heading2"/>
+        <w:spacing w:after="80" w:before="120" w:line="276" w:lineRule="auto"/>
+      </w:pPr>
+      <w:r>
+        <w:rPr>
+          <w:rFonts w:ascii="Calibri" w:cs="Calibri" w:eastAsia="Calibri" w:hAnsi="Calibri"/>
+          <w:b w:val="1"/>
+          <w:bCs w:val="1"/>
+          <w:color w:val="1E3A8A"/>
+        </w:rPr>
+        <w:t xml:space="preserve">Project Report</w:t>
+      </w:r>
+    </w:p>
+    <w:p>
+      <w:pPr>
+        <w:pStyle w:val="Heading3"/>
+        <w:spacing w:after="80" w:before="120" w:line="276" w:lineRule="auto"/>
+      </w:pPr>
+      <w:r>
+        <w:rPr>
+          <w:rFonts w:ascii="Calibri" w:cs="Calibri" w:eastAsia="Calibri" w:hAnsi="Calibri"/>
+          <w:b w:val="1"/>
+          <w:bCs w:val="1"/>
+          <w:color w:val="1E3A8A"/>
+        </w:rPr>
+        <w:t xml:space="preserve">Overview</w:t>
+      </w:r>
+    </w:p>
+    <w:p>
+      <w:pPr>
+        <w:pStyle w:val="Heading4"/>
+        <w:spacing w:after="80" w:before="120" w:line="276" w:lineRule="auto"/>
+      </w:pPr>
+      <w:r>
+        <w:rPr>
+          <w:rFonts w:ascii="Calibri" w:cs="Calibri" w:eastAsia="Calibri" w:hAnsi="Calibri"/>
+          <w:b w:val="1"/>
+          <w:bCs w:val="1"/>
+          <w:color w:val="0F172A"/>
+        </w:rPr>
+        <w:t xml:space="preserve">Recover</w:t>
+      </w:r>
+    </w:p>
+    <w:tbl>
+      <w:tblPr>
+        <w:tblW w:w="9360" w:type="dxa"/>
+        <w:tblBorders>
+          <w:top w:val="single" w:sz="4" w:space="0" w:color="CBD5E1"/>
+          <w:left w:val="none"/>
+          <w:bottom w:val="single" w:sz="4" w:space="0" w:color="CBD5E1"/>
+          <w:right w:val="none"/>
+          <w:insideH w:val="single" w:sz="4" w:space="0" w:color="E2E8F0"/>
+          <w:insideV w:val="none"/>
+        </w:tblBorders>
+        <w:tblLayout w:type="fixed"/>
+      </w:tblPr>
+      <w:tr>
+        <w:trPr>
+          <w:tblHeader/>
+        </w:trPr>
+        <w:tc>
+          <w:tcPr>
+            <w:tcW w:w="3200" w:type="dxa"/>
+            <w:shd w:val="clear" w:color="auto" w:fill="E2E8F0"/>
+            <w:tcMar>
+              <w:top w:w="120" w:type="dxa"/>
+              <w:left w:w="160" w:type="dxa"/>
+              <w:bottom w:w="120" w:type="dxa"/>
+              <w:right w:w="160" w:type="dxa"/>
+            </w:tcMar>
+          </w:tcPr>
+          <w:p>
+            <w:pPr>
+              <w:spacing w:after="80" w:before="120" w:line="276" w:lineRule="auto"/>
+            </w:pPr>
+            <w:r>
+              <w:rPr>
+                <w:rFonts w:ascii="Calibri" w:cs="Calibri" w:eastAsia="Calibri" w:hAnsi="Calibri"/>
+                <w:b w:val="1"/>
+                <w:bCs w:val="1"/>
+                <w:color w:val="1E3A8A"/>
+              </w:rPr>
+              <w:t xml:space="preserve">Plan</w:t>
+            </w:r>
+          </w:p>
+        </w:tc>
+        <w:tc>
+          <w:tcPr>
+            <w:tcW w:w="6160" w:type="dxa"/>
+            <w:shd w:val="clear" w:color="auto" w:fill="E2E8F0"/>
+            <w:tcMar>
+              <w:top w:w="120" w:type="dxa"/>
+              <w:left w:w="160" w:type="dxa"/>
+              <w:bottom w:w="120" w:type="dxa"/>
+              <w:right w:w="160" w:type="dxa"/>
+            </w:tcMar>
+          </w:tcPr>
+          <w:p>
+            <w:pPr>
+              <w:spacing w:after="80" w:before="120" w:line="276" w:lineRule="auto"/>
+            </w:pPr>
+            <w:r>
+              <w:rPr>
+                <w:rFonts w:ascii="Calibri" w:cs="Calibri" w:eastAsia="Calibri" w:hAnsi="Calibri"/>
+                <w:b w:val="1"/>
+                <w:bCs w:val="1"/>
+                <w:color w:val="1E3A8A"/>
+              </w:rPr>
+              <w:t xml:space="preserve">Actual</w:t>
+            </w:r>
+          </w:p>
+        </w:tc>
+      </w:tr>
+      <w:tr>
+        <w:trPr/>
+        <w:tc>
+          <w:tcPr>
+            <w:tcW w:w="3200" w:type="dxa"/>
+            <w:tcMar>
+              <w:top w:w="120" w:type="dxa"/>
+              <w:left w:w="160" w:type="dxa"/>
+              <w:bottom w:w="120" w:type="dxa"/>
+              <w:right w:w="160" w:type="dxa"/>
+            </w:tcMar>
+          </w:tcPr>
+          <w:p>
+            <w:pPr>
+              <w:spacing w:after="80" w:before="120" w:line="276" w:lineRule="auto"/>
+            </w:pPr>
+            <w:r>
+              <w:rPr>
+                <w:rFonts w:ascii="Calibri" w:cs="Calibri" w:eastAsia="Calibri" w:hAnsi="Calibri"/>
+              </w:rPr>
+              <w:t xml:space="preserve">• Khắc phục triệt để lỗ hổng an ninh hạ tầng: Lộ trực tiếp Backend API và tài liệu Swagger qua IP VPS trên môi trường demo.</w:t>
+            </w:r>
+          </w:p>
+          <w:p>
+            <w:pPr>
+              <w:spacing w:after="80" w:before="120" w:line="276" w:lineRule="auto"/>
+            </w:pPr>
+            <w:r>
+              <w:rPr>
+                <w:rFonts w:ascii="Calibri" w:cs="Calibri" w:eastAsia="Calibri" w:hAnsi="Calibri"/>
+              </w:rPr>
+              <w:t xml:space="preserve">• Tinh chỉnh và tối ưu hóa phân hệ IoT &amp; Chatbot AI: Tối ưu hóa luồng viễn trắc nhiệt độ kho GSP và cô lập Chatbot DeepSeek.</w:t>
+            </w:r>
+          </w:p>
+          <w:p>
+            <w:pPr>
+              <w:spacing w:after="80" w:before="120" w:line="276" w:lineRule="auto"/>
+            </w:pPr>
+            <w:r>
+              <w:rPr>
+                <w:rFonts w:ascii="Calibri" w:cs="Calibri" w:eastAsia="Calibri" w:hAnsi="Calibri"/>
+              </w:rPr>
+              <w:t xml:space="preserve">• Chuẩn bị đặc tả kỹ thuật module Flash Sale (UC-74): Đầu việc tồn đọng từ tuần W6 cần hoàn thiện trước khi code.</w:t>
+            </w:r>
+          </w:p>
+        </w:tc>
+        <w:tc>
+          <w:tcPr>
+            <w:tcW w:w="6160" w:type="dxa"/>
+            <w:tcMar>
+              <w:top w:w="120" w:type="dxa"/>
+              <w:left w:w="160" w:type="dxa"/>
+              <w:bottom w:w="120" w:type="dxa"/>
+              <w:right w:w="160" w:type="dxa"/>
+            </w:tcMar>
+          </w:tcPr>
+          <w:p>
+            <w:pPr>
+              <w:spacing w:after="80" w:before="120" w:line="276" w:lineRule="auto"/>
+            </w:pPr>
+            <w:r>
+              <w:rPr>
+                <w:rFonts w:ascii="Calibri" w:cs="Calibri" w:eastAsia="Calibri" w:hAnsi="Calibri"/>
+              </w:rPr>
+              <w:t xml:space="preserve">• Hoàn tất 100% bảo mật hạ tầng: Cấu hình Nginx Reverse Proxy bắt buộc toàn bộ traffic phải đi qua Cloudflare, đóng các cổng nội bộ công khai, ngăn chặn lộ IP VPS và bảo vệ tài liệu Swagger (PR #250, PR #251, PR #252 - Phước).</w:t>
+            </w:r>
+          </w:p>
+          <w:p>
+            <w:pPr>
+              <w:spacing w:after="80" w:before="120" w:line="276" w:lineRule="auto"/>
+            </w:pPr>
+            <w:r>
+              <w:rPr>
+                <w:rFonts w:ascii="Calibri" w:cs="Calibri" w:eastAsia="Calibri" w:hAnsi="Calibri"/>
+              </w:rPr>
+              <w:t xml:space="preserve">• Hoàn tất tối ưu AI &amp; IoT: Cô lập hoàn toàn dịch vụ Chatbot DeepSeek, hỗ trợ thị giác máy tính (Vision), lưu giữ ngữ cảnh hội thoại đa lượt; triển khai luồng truyền dữ liệu viễn trắc liên tục (persistent stream) cho cảm biến nhiệt độ - độ ẩm kho GSP (PR #249 - Phúc).</w:t>
+            </w:r>
+          </w:p>
+          <w:p>
+            <w:pPr>
+              <w:spacing w:after="80" w:before="120" w:line="276" w:lineRule="auto"/>
+            </w:pPr>
+            <w:r>
+              <w:rPr>
+                <w:rFonts w:ascii="Calibri" w:cs="Calibri" w:eastAsia="Calibri" w:hAnsi="Calibri"/>
+              </w:rPr>
+              <w:t xml:space="preserve">• Hoàn thành đặc tả UC-74: Hoàn thành tài liệu đặc tả kỹ thuật tính năng Flash Sale &amp; Cron Job tự động (UC-74) và ma trận phân rã 11 tính năng cốt lõi (Phước).</w:t>
+            </w:r>
+          </w:p>
+        </w:tc>
+      </w:tr>
+    </w:tbl>
+    <w:p>
+      <w:pPr>
+        <w:pStyle w:val="Heading4"/>
+        <w:spacing w:after="80" w:before="120" w:line="276" w:lineRule="auto"/>
+      </w:pPr>
+      <w:r>
+        <w:rPr>
+          <w:rFonts w:ascii="Calibri" w:cs="Calibri" w:eastAsia="Calibri" w:hAnsi="Calibri"/>
+          <w:b w:val="1"/>
+          <w:bCs w:val="1"/>
+          <w:color w:val="0F172A"/>
+        </w:rPr>
+        <w:t xml:space="preserve">Master plan</w:t>
+      </w:r>
+    </w:p>
+    <w:tbl>
+      <w:tblPr>
+        <w:tblW w:w="9360" w:type="dxa"/>
+        <w:tblBorders>
+          <w:top w:val="single" w:sz="4" w:space="0" w:color="CBD5E1"/>
+          <w:left w:val="none"/>
+          <w:bottom w:val="single" w:sz="4" w:space="0" w:color="CBD5E1"/>
+          <w:right w:val="none"/>
+          <w:insideH w:val="single" w:sz="4" w:space="0" w:color="E2E8F0"/>
+          <w:insideV w:val="none"/>
+        </w:tblBorders>
+        <w:tblLayout w:type="fixed"/>
+      </w:tblPr>
+      <w:tr>
+        <w:trPr>
+          <w:tblHeader/>
+        </w:trPr>
+        <w:tc>
+          <w:tcPr>
+            <w:tcW w:w="3200" w:type="dxa"/>
+            <w:shd w:val="clear" w:color="auto" w:fill="E2E8F0"/>
+            <w:tcMar>
+              <w:top w:w="120" w:type="dxa"/>
+              <w:left w:w="160" w:type="dxa"/>
+              <w:bottom w:w="120" w:type="dxa"/>
+              <w:right w:w="160" w:type="dxa"/>
+            </w:tcMar>
+          </w:tcPr>
+          <w:p>
+            <w:pPr>
+              <w:spacing w:after="80" w:before="120" w:line="276" w:lineRule="auto"/>
+            </w:pPr>
+            <w:r>
+              <w:rPr>
+                <w:rFonts w:ascii="Calibri" w:cs="Calibri" w:eastAsia="Calibri" w:hAnsi="Calibri"/>
+                <w:b w:val="1"/>
+                <w:bCs w:val="1"/>
+                <w:color w:val="1E3A8A"/>
+              </w:rPr>
+              <w:t xml:space="preserve">Plan (Mục tiêu Master Plan W7)</w:t>
+            </w:r>
+          </w:p>
+        </w:tc>
+        <w:tc>
+          <w:tcPr>
+            <w:tcW w:w="6160" w:type="dxa"/>
+            <w:shd w:val="clear" w:color="auto" w:fill="E2E8F0"/>
+            <w:tcMar>
+              <w:top w:w="120" w:type="dxa"/>
+              <w:left w:w="160" w:type="dxa"/>
+              <w:bottom w:w="120" w:type="dxa"/>
+              <w:right w:w="160" w:type="dxa"/>
+            </w:tcMar>
+          </w:tcPr>
+          <w:p>
+            <w:pPr>
+              <w:spacing w:after="80" w:before="120" w:line="276" w:lineRule="auto"/>
+            </w:pPr>
+            <w:r>
+              <w:rPr>
+                <w:rFonts w:ascii="Calibri" w:cs="Calibri" w:eastAsia="Calibri" w:hAnsi="Calibri"/>
+                <w:b w:val="1"/>
+                <w:bCs w:val="1"/>
+                <w:color w:val="1E3A8A"/>
+              </w:rPr>
+              <w:t xml:space="preserve">Actual (Tiến độ thực tế &amp; Đánh giá)</w:t>
+            </w:r>
+          </w:p>
+        </w:tc>
+      </w:tr>
+      <w:tr>
+        <w:trPr/>
+        <w:tc>
+          <w:tcPr>
+            <w:tcW w:w="3200" w:type="dxa"/>
+            <w:tcMar>
+              <w:top w:w="120" w:type="dxa"/>
+              <w:left w:w="160" w:type="dxa"/>
+              <w:bottom w:w="120" w:type="dxa"/>
+              <w:right w:w="160" w:type="dxa"/>
+            </w:tcMar>
+          </w:tcPr>
+          <w:p>
+            <w:pPr>
+              <w:spacing w:after="80" w:before="120" w:line="276" w:lineRule="auto"/>
+            </w:pPr>
+            <w:r>
+              <w:rPr>
+                <w:rFonts w:ascii="Calibri" w:cs="Calibri" w:eastAsia="Calibri" w:hAnsi="Calibri"/>
+                <w:b w:val="1"/>
+                <w:bCs w:val="1"/>
+              </w:rPr>
+              <w:t xml:space="preserve">Trải nghiệm Khách hàng &amp; Email Marketing (UC-76, UC-77):
+• Triển khai UC-76: Tạo và gửi Email Marketing tự động - Newsletter.
+• Triển khai UC-77: Khách hàng đánh giá &amp; review sản phẩm trên App.</w:t>
+            </w:r>
+          </w:p>
+        </w:tc>
+        <w:tc>
+          <w:tcPr>
+            <w:tcW w:w="6160" w:type="dxa"/>
+            <w:tcMar>
+              <w:top w:w="120" w:type="dxa"/>
+              <w:left w:w="160" w:type="dxa"/>
+              <w:bottom w:w="120" w:type="dxa"/>
+              <w:right w:w="160" w:type="dxa"/>
+            </w:tcMar>
+          </w:tcPr>
+          <w:p>
+            <w:pPr>
+              <w:spacing w:after="80" w:before="120" w:line="276" w:lineRule="auto"/>
+            </w:pPr>
+            <w:r>
+              <w:rPr>
+                <w:rFonts w:ascii="Calibri" w:cs="Calibri" w:eastAsia="Calibri" w:hAnsi="Calibri"/>
+              </w:rPr>
+              <w:t xml:space="preserve">Hoàn thành 100% trọn gói UC-76 Email Marketing (Đạt - On Track):</w:t>
+            </w:r>
+          </w:p>
+          <w:p>
+            <w:pPr>
+              <w:spacing w:after="80" w:before="120" w:line="276" w:lineRule="auto"/>
+            </w:pPr>
+            <w:r>
+              <w:rPr>
+                <w:rFonts w:ascii="Calibri" w:cs="Calibri" w:eastAsia="Calibri" w:hAnsi="Calibri"/>
+              </w:rPr>
+              <w:t xml:space="preserve">• Tích hợp dịch vụ gửi mail qua Resend API, thiết kế template HTML responsive cho tin tức và khuyến mãi.</w:t>
+            </w:r>
+          </w:p>
+          <w:p>
+            <w:pPr>
+              <w:spacing w:after="80" w:before="120" w:line="276" w:lineRule="auto"/>
+            </w:pPr>
+            <w:r>
+              <w:rPr>
+                <w:rFonts w:ascii="Calibri" w:cs="Calibri" w:eastAsia="Calibri" w:hAnsi="Calibri"/>
+              </w:rPr>
+              <w:t xml:space="preserve">• Thiết lập bộ lập lịch Cron Job ngầm tự động quét chiến dịch đến lịch và kích hoạt gửi thư.</w:t>
+            </w:r>
+          </w:p>
+          <w:p>
+            <w:pPr>
+              <w:spacing w:after="80" w:before="120" w:line="276" w:lineRule="auto"/>
+            </w:pPr>
+            <w:r>
+              <w:rPr>
+                <w:rFonts w:ascii="Calibri" w:cs="Calibri" w:eastAsia="Calibri" w:hAnsi="Calibri"/>
+              </w:rPr>
+              <w:t xml:space="preserve">• Xây dựng giao diện danh sách chiến dịch và bộ soạn thảo Split-Screen Editor kèm Live Preview thời gian thực trên cả Desktop và Mobile.</w:t>
+            </w:r>
+          </w:p>
+          <w:p>
+            <w:pPr>
+              <w:spacing w:after="80" w:before="120" w:line="276" w:lineRule="auto"/>
+            </w:pPr>
+            <w:r>
+              <w:rPr>
+                <w:rFonts w:ascii="Calibri" w:cs="Calibri" w:eastAsia="Calibri" w:hAnsi="Calibri"/>
+              </w:rPr>
+              <w:t xml:space="preserve">• Triển khai trang công khai Hủy đăng ký nhận tin (/unsubscribe/:token), tự động đồng bộ trạng thái người dùng.</w:t>
+            </w:r>
+          </w:p>
+          <w:p>
+            <w:pPr>
+              <w:spacing w:after="80" w:before="120" w:line="276" w:lineRule="auto"/>
+            </w:pPr>
+            <w:r>
+              <w:rPr>
+                <w:rFonts w:ascii="Calibri" w:cs="Calibri" w:eastAsia="Calibri" w:hAnsi="Calibri"/>
+              </w:rPr>
+              <w:t xml:space="preserve">• Tích hợp Custom Hook useEmailCampaignManagement, kết nối tầng Service gọi qua API Gateway và liên kết DTO mã Voucher khuyến mãi (create-order.dto). Đã kiểm thử toàn diện (Đạt).</w:t>
+            </w:r>
+          </w:p>
+        </w:tc>
+      </w:tr>
+      <w:tr>
+        <w:trPr/>
+        <w:tc>
+          <w:tcPr>
+            <w:tcW w:w="3200" w:type="dxa"/>
+            <w:tcMar>
+              <w:top w:w="120" w:type="dxa"/>
+              <w:left w:w="160" w:type="dxa"/>
+              <w:bottom w:w="120" w:type="dxa"/>
+              <w:right w:w="160" w:type="dxa"/>
+            </w:tcMar>
+          </w:tcPr>
+          <w:p>
+            <w:pPr>
+              <w:spacing w:after="80" w:before="120" w:line="276" w:lineRule="auto"/>
+            </w:pPr>
+            <w:r>
+              <w:rPr>
+                <w:rFonts w:ascii="Calibri" w:cs="Calibri" w:eastAsia="Calibri" w:hAnsi="Calibri"/>
+                <w:b w:val="1"/>
+                <w:bCs w:val="1"/>
+              </w:rPr>
+              <w:t xml:space="preserve">Y tế số nâng cao (UC-107, UC-108, UC-109, UC-99):
+• Triển khai UC-107: Gợi ý thuốc theo tiền sử dị ứng || bệnh nền || thuốc dị ứng.
+• Chuẩn bị hồ sơ y tế &amp; quản lý tuân thủ điều trị.</w:t>
+            </w:r>
+          </w:p>
+        </w:tc>
+        <w:tc>
+          <w:tcPr>
+            <w:tcW w:w="6160" w:type="dxa"/>
+            <w:tcMar>
+              <w:top w:w="120" w:type="dxa"/>
+              <w:left w:w="160" w:type="dxa"/>
+              <w:bottom w:w="120" w:type="dxa"/>
+              <w:right w:w="160" w:type="dxa"/>
+            </w:tcMar>
+          </w:tcPr>
+          <w:p>
+            <w:pPr>
+              <w:spacing w:after="80" w:before="120" w:line="276" w:lineRule="auto"/>
+            </w:pPr>
+            <w:r>
+              <w:rPr>
+                <w:rFonts w:ascii="Calibri" w:cs="Calibri" w:eastAsia="Calibri" w:hAnsi="Calibri"/>
+              </w:rPr>
+              <w:t xml:space="preserve">Đang triển khai đúng tiến độ UC-107 (Đạt - On Track):</w:t>
+            </w:r>
+          </w:p>
+          <w:p>
+            <w:pPr>
+              <w:spacing w:after="80" w:before="120" w:line="276" w:lineRule="auto"/>
+            </w:pPr>
+            <w:r>
+              <w:rPr>
+                <w:rFonts w:ascii="Calibri" w:cs="Calibri" w:eastAsia="Calibri" w:hAnsi="Calibri"/>
+              </w:rPr>
+              <w:t xml:space="preserve">• Đã hoàn thành tài liệu kế hoạch Hồ sơ bệnh án điện tử (EMR) và đặc tả chi tiết UC-107.</w:t>
+            </w:r>
+          </w:p>
+          <w:p>
+            <w:pPr>
+              <w:spacing w:after="80" w:before="120" w:line="276" w:lineRule="auto"/>
+            </w:pPr>
+            <w:r>
+              <w:rPr>
+                <w:rFonts w:ascii="Calibri" w:cs="Calibri" w:eastAsia="Calibri" w:hAnsi="Calibri"/>
+              </w:rPr>
+              <w:t xml:space="preserve">• Backend: Bổ sung Schema bệnh án điện tử (dị ứng, bệnh nền mạn tính, nhóm máu), thiết kế API/Kafka cập nhật hồ sơ y tế.</w:t>
+            </w:r>
+          </w:p>
+          <w:p>
+            <w:pPr>
+              <w:spacing w:after="80" w:before="120" w:line="276" w:lineRule="auto"/>
+            </w:pPr>
+            <w:r>
+              <w:rPr>
+                <w:rFonts w:ascii="Calibri" w:cs="Calibri" w:eastAsia="Calibri" w:hAnsi="Calibri"/>
+              </w:rPr>
+              <w:t xml:space="preserve">• Trí tuệ nhân tạo (AI): Xây dựng endpoint AI kiểm tra xung đột giữa thuốc trong đơn với tiền sử bệnh nền/dị ứng của bệnh nhân, gợi ý thuốc an toàn.</w:t>
+            </w:r>
+          </w:p>
+          <w:p>
+            <w:pPr>
+              <w:spacing w:after="80" w:before="120" w:line="276" w:lineRule="auto"/>
+            </w:pPr>
+            <w:r>
+              <w:rPr>
+                <w:rFonts w:ascii="Calibri" w:cs="Calibri" w:eastAsia="Calibri" w:hAnsi="Calibri"/>
+              </w:rPr>
+              <w:t xml:space="preserve">• Frontend: Xây dựng modal Onboarding sức khỏe cho người dùng mới, trang Hồ sơ bệnh án cá nhân, và tích hợp cảnh báo dị ứng thời gian thực kèm nút "Đổi thuốc an toàn 1-click" tại quầy POS Dược sĩ (Phước - nhánh feat/UC-107-allergy-contraindication-medical-record).</w:t>
+            </w:r>
+          </w:p>
+        </w:tc>
+      </w:tr>
+      <w:tr>
+        <w:trPr/>
+        <w:tc>
+          <w:tcPr>
+            <w:tcW w:w="3200" w:type="dxa"/>
+            <w:tcMar>
+              <w:top w:w="120" w:type="dxa"/>
+              <w:left w:w="160" w:type="dxa"/>
+              <w:bottom w:w="120" w:type="dxa"/>
+              <w:right w:w="160" w:type="dxa"/>
+            </w:tcMar>
+          </w:tcPr>
+          <w:p>
+            <w:pPr>
+              <w:spacing w:after="80" w:before="120" w:line="276" w:lineRule="auto"/>
+            </w:pPr>
+            <w:r>
+              <w:rPr>
+                <w:rFonts w:ascii="Calibri" w:cs="Calibri" w:eastAsia="Calibri" w:hAnsi="Calibri"/>
+                <w:b w:val="1"/>
+                <w:bCs w:val="1"/>
+              </w:rPr>
+              <w:t xml:space="preserve">Mục tiêu Kỹ thuật &amp; Đóng băng Tính năng (Feature Freeze):
+• Hoàn thành toàn bộ code chức năng mới, sẵn sàng đóng băng tính năng và chuẩn bị Review 2.</w:t>
+            </w:r>
+          </w:p>
+        </w:tc>
+        <w:tc>
+          <w:tcPr>
+            <w:tcW w:w="6160" w:type="dxa"/>
+            <w:tcMar>
+              <w:top w:w="120" w:type="dxa"/>
+              <w:left w:w="160" w:type="dxa"/>
+              <w:bottom w:w="120" w:type="dxa"/>
+              <w:right w:w="160" w:type="dxa"/>
+            </w:tcMar>
+          </w:tcPr>
+          <w:p>
+            <w:pPr>
+              <w:spacing w:after="80" w:before="120" w:line="276" w:lineRule="auto"/>
+            </w:pPr>
+            <w:r>
+              <w:rPr>
+                <w:rFonts w:ascii="Calibri" w:cs="Calibri" w:eastAsia="Calibri" w:hAnsi="Calibri"/>
+              </w:rPr>
+              <w:t xml:space="preserve">Nâng cấp Toàn diện Hạ tầng Kiểm thử &amp; Thiết lập Quality Gate Nghiêm ngặt:</w:t>
+            </w:r>
+          </w:p>
+          <w:p>
+            <w:pPr>
+              <w:spacing w:after="80" w:before="120" w:line="276" w:lineRule="auto"/>
+            </w:pPr>
+            <w:r>
+              <w:rPr>
+                <w:rFonts w:ascii="Calibri" w:cs="Calibri" w:eastAsia="Calibri" w:hAnsi="Calibri"/>
+              </w:rPr>
+              <w:t xml:space="preserve">• Tích hợp môi trường kiểm thử Hybrid Test Container linh hoạt (@testcontainers/mongodb trên Docker CI/CD GitHub Actions + fallback MongoMemoryServer khi test local).</w:t>
+            </w:r>
+          </w:p>
+          <w:p>
+            <w:pPr>
+              <w:spacing w:after="80" w:before="120" w:line="276" w:lineRule="auto"/>
+            </w:pPr>
+            <w:r>
+              <w:rPr>
+                <w:rFonts w:ascii="Calibri" w:cs="Calibri" w:eastAsia="Calibri" w:hAnsi="Calibri"/>
+              </w:rPr>
+              <w:t xml:space="preserve">• Xây dựng bộ công cụ test-rules-checker.js kiểm định tự động 7 Architecture Rules (Zero Internal HTTP qua Kafka, Zero Mock Data, Bounded Context /api/..., Comment tiếng Việt 100%, Core Business FEFO/Quota/PayOS, Guideline 3 nhóm giá trị, Rule 7 Test-Coupled Mandate kẹp bài test bắt buộc).</w:t>
+            </w:r>
+          </w:p>
+          <w:p>
+            <w:pPr>
+              <w:spacing w:after="80" w:before="120" w:line="276" w:lineRule="auto"/>
+            </w:pPr>
+            <w:r>
+              <w:rPr>
+                <w:rFonts w:ascii="Calibri" w:cs="Calibri" w:eastAsia="Calibri" w:hAnsi="Calibri"/>
+              </w:rPr>
+              <w:t xml:space="preserve">• Bóc tách độc lập toàn bộ 21 Use Cases từ Test Report 5 &amp; WBS thành các file test riêng biệt (uc-*.spec.ts, wbs-*.spec.ts), đảm bảo mỗi file phủ đủ 3 nhóm giá trị chuẩn ([Normal Values], [Boundary Values], [Abnormal Values]).</w:t>
+            </w:r>
+          </w:p>
+          <w:p>
+            <w:pPr>
+              <w:spacing w:after="80" w:before="120" w:line="276" w:lineRule="auto"/>
+            </w:pPr>
+            <w:r>
+              <w:rPr>
+                <w:rFonts w:ascii="Calibri" w:cs="Calibri" w:eastAsia="Calibri" w:hAnsi="Calibri"/>
+              </w:rPr>
+              <w:t xml:space="preserve">• Bổ sung bộ test Concurrency &amp; Idempotency chống trùng lặp Webhook PayOS VietQR và Race-condition thanh toán.</w:t>
+            </w:r>
+          </w:p>
+          <w:p>
+            <w:pPr>
+              <w:spacing w:after="80" w:before="120" w:line="276" w:lineRule="auto"/>
+            </w:pPr>
+            <w:r>
+              <w:rPr>
+                <w:rFonts w:ascii="Calibri" w:cs="Calibri" w:eastAsia="Calibri" w:hAnsi="Calibri"/>
+              </w:rPr>
+              <w:t xml:space="preserve">• Tích hợp Fast-Fail Typecheck &amp; Build (7s) và Custom TAP Reporter hiển thị log HTTP Request chuẩn GoTek. Pass 100% 34/34 test suites (199/199 test cases) (Nam).</w:t>
+            </w:r>
+          </w:p>
+        </w:tc>
+      </w:tr>
+      <w:tr>
+        <w:trPr/>
+        <w:tc>
+          <w:tcPr>
+            <w:tcW w:w="3200" w:type="dxa"/>
+            <w:tcMar>
+              <w:top w:w="120" w:type="dxa"/>
+              <w:left w:w="160" w:type="dxa"/>
+              <w:bottom w:w="120" w:type="dxa"/>
+              <w:right w:w="160" w:type="dxa"/>
+            </w:tcMar>
+          </w:tcPr>
+          <w:p>
+            <w:pPr>
+              <w:spacing w:after="80" w:before="120" w:line="276" w:lineRule="auto"/>
+            </w:pPr>
+            <w:r>
+              <w:rPr>
+                <w:rFonts w:ascii="Calibri" w:cs="Calibri" w:eastAsia="Calibri" w:hAnsi="Calibri"/>
+                <w:b w:val="1"/>
+                <w:bCs w:val="1"/>
+              </w:rPr>
+              <w:t xml:space="preserve">[VƯỢT TIẾN ĐỘ] Danh sách sản phẩm yêu thích (Wishlist - UC-96):
+• Kế hoạch gốc thuộc tuần W13 (Tháng 12), nhóm chủ động đẩy sớm để hoàn thiện luồng trải nghiệm mua sắm.</w:t>
+            </w:r>
+          </w:p>
+        </w:tc>
+        <w:tc>
+          <w:tcPr>
+            <w:tcW w:w="6160" w:type="dxa"/>
+            <w:tcMar>
+              <w:top w:w="120" w:type="dxa"/>
+              <w:left w:w="160" w:type="dxa"/>
+              <w:bottom w:w="120" w:type="dxa"/>
+              <w:right w:w="160" w:type="dxa"/>
+            </w:tcMar>
+          </w:tcPr>
+          <w:p>
+            <w:pPr>
+              <w:spacing w:after="80" w:before="120" w:line="276" w:lineRule="auto"/>
+            </w:pPr>
+            <w:r>
+              <w:rPr>
+                <w:rFonts w:ascii="Calibri" w:cs="Calibri" w:eastAsia="Calibri" w:hAnsi="Calibri"/>
+              </w:rPr>
+              <w:t xml:space="preserve">Hoàn thành 100% trọn gói UC-96 (Vượt trước 6 tuần - Ahead of Schedule):</w:t>
+            </w:r>
+          </w:p>
+          <w:p>
+            <w:pPr>
+              <w:spacing w:after="80" w:before="120" w:line="276" w:lineRule="auto"/>
+            </w:pPr>
+            <w:r>
+              <w:rPr>
+                <w:rFonts w:ascii="Calibri" w:cs="Calibri" w:eastAsia="Calibri" w:hAnsi="Calibri"/>
+              </w:rPr>
+              <w:t xml:space="preserve">• Xây dựng giao diện Wishlist trên Web và Mobile, tích hợp icon trái tim tương tác nhanh trên từng thẻ thuốc.</w:t>
+            </w:r>
+          </w:p>
+          <w:p>
+            <w:pPr>
+              <w:spacing w:after="80" w:before="120" w:line="276" w:lineRule="auto"/>
+            </w:pPr>
+            <w:r>
+              <w:rPr>
+                <w:rFonts w:ascii="Calibri" w:cs="Calibri" w:eastAsia="Calibri" w:hAnsi="Calibri"/>
+              </w:rPr>
+              <w:t xml:space="preserve">• Hoàn thiện trọn vẹn luồng trải nghiệm người dùng: Thêm vào Wishlist -&gt; Chuyển nhanh vào giỏ hàng -&gt; Thanh toán đơn hàng PayOS/COD. Đã kiểm thử tương tác mượt mà (Đạt - SCRUM-107).</w:t>
+            </w:r>
+          </w:p>
+        </w:tc>
+      </w:tr>
+      <w:tr>
+        <w:trPr/>
+        <w:tc>
+          <w:tcPr>
+            <w:tcW w:w="3200" w:type="dxa"/>
+            <w:tcMar>
+              <w:top w:w="120" w:type="dxa"/>
+              <w:left w:w="160" w:type="dxa"/>
+              <w:bottom w:w="120" w:type="dxa"/>
+              <w:right w:w="160" w:type="dxa"/>
+            </w:tcMar>
+          </w:tcPr>
+          <w:p>
+            <w:pPr>
+              <w:spacing w:after="80" w:before="120" w:line="276" w:lineRule="auto"/>
+            </w:pPr>
+            <w:r>
+              <w:rPr>
+                <w:rFonts w:ascii="Calibri" w:cs="Calibri" w:eastAsia="Calibri" w:hAnsi="Calibri"/>
+                <w:b w:val="1"/>
+                <w:bCs w:val="1"/>
+              </w:rPr>
+              <w:t xml:space="preserve">[VƯỢT TIẾN ĐỘ] Dược sĩ kết ca &amp; Quản lý KPI (UC-84 &amp; UC-111):
+• Kế hoạch gốc thuộc tuần W10 &amp; W11 (Tháng 11), nhóm triển khai sớm phục vụ nghiệp vụ bán lẻ.</w:t>
+            </w:r>
+          </w:p>
+        </w:tc>
+        <w:tc>
+          <w:tcPr>
+            <w:tcW w:w="6160" w:type="dxa"/>
+            <w:tcMar>
+              <w:top w:w="120" w:type="dxa"/>
+              <w:left w:w="160" w:type="dxa"/>
+              <w:bottom w:w="120" w:type="dxa"/>
+              <w:right w:w="160" w:type="dxa"/>
+            </w:tcMar>
+          </w:tcPr>
+          <w:p>
+            <w:pPr>
+              <w:spacing w:after="80" w:before="120" w:line="276" w:lineRule="auto"/>
+            </w:pPr>
+            <w:r>
+              <w:rPr>
+                <w:rFonts w:ascii="Calibri" w:cs="Calibri" w:eastAsia="Calibri" w:hAnsi="Calibri"/>
+              </w:rPr>
+              <w:t xml:space="preserve">Hoàn thành Logic &amp; Giao diện (Vượt trước 3 tuần - In Review):</w:t>
+            </w:r>
+          </w:p>
+          <w:p>
+            <w:pPr>
+              <w:spacing w:after="80" w:before="120" w:line="276" w:lineRule="auto"/>
+            </w:pPr>
+            <w:r>
+              <w:rPr>
+                <w:rFonts w:ascii="Calibri" w:cs="Calibri" w:eastAsia="Calibri" w:hAnsi="Calibri"/>
+              </w:rPr>
+              <w:t xml:space="preserve">• Triển khai phân hệ Dược sĩ kết thúc ca làm việc, đối soát tiền mặt thực tế trong két so với doanh thu phần mềm quầy POS.</w:t>
+            </w:r>
+          </w:p>
+          <w:p>
+            <w:pPr>
+              <w:spacing w:after="80" w:before="120" w:line="276" w:lineRule="auto"/>
+            </w:pPr>
+            <w:r>
+              <w:rPr>
+                <w:rFonts w:ascii="Calibri" w:cs="Calibri" w:eastAsia="Calibri" w:hAnsi="Calibri"/>
+              </w:rPr>
+              <w:t xml:space="preserve">• Tích hợp biểu đồ thống kê hiệu suất cá nhân và tính toán KPI theo ca làm việc (Phúc - SCRUM-106).</w:t>
+            </w:r>
+          </w:p>
+        </w:tc>
+      </w:tr>
+    </w:tbl>
+    <w:p>
+      <w:pPr>
+        <w:pStyle w:val="Heading2"/>
+        <w:spacing w:after="80" w:before="120" w:line="276" w:lineRule="auto"/>
+      </w:pPr>
+      <w:r>
+        <w:rPr>
+          <w:rFonts w:ascii="Calibri" w:cs="Calibri" w:eastAsia="Calibri" w:hAnsi="Calibri"/>
+          <w:b w:val="1"/>
+          <w:bCs w:val="1"/>
+          <w:color w:val="1E3A8A"/>
+        </w:rPr>
+        <w:t xml:space="preserve">Deliverables / Shipables this week</w:t>
+      </w:r>
+    </w:p>
+    <w:p>
+      <w:pPr>
+        <w:spacing w:after="80" w:before="120" w:line="276" w:lineRule="auto"/>
+      </w:pPr>
+      <w:r>
+        <w:rPr>
+          <w:rFonts w:ascii="Calibri" w:cs="Calibri" w:eastAsia="Calibri" w:hAnsi="Calibri"/>
+          <w:color w:val="64748B"/>
+        </w:rPr>
+        <w:t xml:space="preserve">// tuần này làm “ra” được cái gì?</w:t>
+      </w:r>
+    </w:p>
+    <w:p>
+      <w:pPr>
+        <w:spacing w:after="80" w:before="120" w:line="276" w:lineRule="auto"/>
+      </w:pPr>
+      <w:r>
+        <w:rPr>
+          <w:rFonts w:ascii="Calibri" w:cs="Calibri" w:eastAsia="Calibri" w:hAnsi="Calibri"/>
+          <w:color w:val="0F172A"/>
+        </w:rPr>
+        <w:t xml:space="preserve">Code chạy được: Web &amp; Backend: Phân hệ Email Marketing hoàn chỉnh (Resend API, Split-Screen Editor, Live Preview Desktop/Mobile, Cron Job ngầm, trang /unsubscribe/:token); Phân hệ Sản phẩm yêu thích (Wishlist UC-96) tích hợp nút trái tim trên thẻ thuốc và luồng giỏ hàng -&gt; thanh toán; Phân hệ Hồ sơ bệnh án điện tử (EMR UC-107) với Schema dữ liệu, API/Kafka, AI kiểm tra xung đột dị ứng và nút "Đổi thuốc an toàn 1-click" tại quầy POS; Phân hệ Dược sĩ kết ca &amp; KPI (SCRUM-106); Cấu hình bảo mật Cloudflare Nginx Reverse Proxy chặn IP VPS và bảo vệ Swagger; Cô lập Chatbot AI DeepSeek và luồng viễn trắc IoT GSP | Hạ tầng DevOps &amp; Testing: Bộ kiểm định kiến trúc test-rules-checker.js với 7 rules nghiêm ngặt; Cơ chế Hybrid Test Container (@testcontainers/mongodb + MongoMemoryServer); Bộ kiểm thử 21 Use Cases độc lập phủ 3 nhóm giá trị; Test Concurrency &amp; Idempotency PayOS VietQR; Fast-Fail Typecheck 7s và Custom TAP Reporter chuẩn GoTek.</w:t>
+      </w:r>
+    </w:p>
+    <w:p>
+      <w:pPr>
+        <w:spacing w:after="80" w:before="120" w:line="276" w:lineRule="auto"/>
+      </w:pPr>
+      <w:r>
+        <w:rPr>
+          <w:rFonts w:ascii="Calibri" w:cs="Calibri" w:eastAsia="Calibri" w:hAnsi="Calibri"/>
+          <w:color w:val="0F172A"/>
+        </w:rPr>
+        <w:t xml:space="preserve">Tài liệu: Requirement Management Sheet cập nhật chuẩn hóa; Đặc tả kỹ thuật Flash Sale &amp; Cron Job tự động (UC-74); Tài liệu Kế hoạch Hồ sơ bệnh án điện tử &amp; Ma trận phân rã 11 tính năng cốt lõi đồ án; Báo cáo kiểm định chất lượng 21 Use Cases WBS và Guideline quy tắc kẹp bài test bắt buộc Rule 7 (Test-Coupled Mandate).</w:t>
+      </w:r>
+    </w:p>
+    <w:p>
+      <w:pPr>
+        <w:pStyle w:val="Heading2"/>
+        <w:spacing w:after="80" w:before="120" w:line="276" w:lineRule="auto"/>
+      </w:pPr>
+      <w:r>
+        <w:rPr>
+          <w:rFonts w:ascii="Calibri" w:cs="Calibri" w:eastAsia="Calibri" w:hAnsi="Calibri"/>
+          <w:b w:val="1"/>
+          <w:bCs w:val="1"/>
+          <w:color w:val="1E3A8A"/>
+        </w:rPr>
+        <w:t xml:space="preserve">Issue</w:t>
+      </w:r>
+    </w:p>
+    <w:p>
+      <w:pPr>
+        <w:spacing w:after="80" w:before="120" w:line="276" w:lineRule="auto"/>
+      </w:pPr>
+      <w:r>
+        <w:rPr>
+          <w:rFonts w:ascii="Calibri" w:cs="Calibri" w:eastAsia="Calibri" w:hAnsi="Calibri"/>
+          <w:color w:val="64748B"/>
+        </w:rPr>
+        <w:t xml:space="preserve">Team dự án Đang gặp trở ngại &amp; vướng mắc gì?</w:t>
+      </w:r>
+    </w:p>
+    <w:tbl>
+      <w:tblPr>
+        <w:tblW w:w="9360" w:type="dxa"/>
+        <w:tblBorders>
+          <w:top w:val="single" w:sz="4" w:space="0" w:color="CBD5E1"/>
+          <w:left w:val="none"/>
+          <w:bottom w:val="single" w:sz="4" w:space="0" w:color="CBD5E1"/>
+          <w:right w:val="none"/>
+          <w:insideH w:val="single" w:sz="4" w:space="0" w:color="E2E8F0"/>
+          <w:insideV w:val="none"/>
+        </w:tblBorders>
+        <w:tblLayout w:type="fixed"/>
+      </w:tblPr>
+      <w:tr>
+        <w:trPr>
+          <w:tblHeader/>
+        </w:trPr>
+        <w:tc>
+          <w:tcPr>
+            <w:tcW w:w="1600" w:type="dxa"/>
+            <w:shd w:val="clear" w:color="auto" w:fill="E2E8F0"/>
+            <w:tcMar>
+              <w:top w:w="120" w:type="dxa"/>
+              <w:left w:w="160" w:type="dxa"/>
+              <w:bottom w:w="120" w:type="dxa"/>
+              <w:right w:w="160" w:type="dxa"/>
+            </w:tcMar>
+          </w:tcPr>
+          <w:p>
+            <w:pPr>
+              <w:spacing w:after="80" w:before="120" w:line="276" w:lineRule="auto"/>
+            </w:pPr>
+            <w:r>
+              <w:rPr>
+                <w:rFonts w:ascii="Calibri" w:cs="Calibri" w:eastAsia="Calibri" w:hAnsi="Calibri"/>
+                <w:b w:val="1"/>
+                <w:bCs w:val="1"/>
+                <w:color w:val="1E3A8A"/>
+              </w:rPr>
+              <w:t xml:space="preserve">Issue</w:t>
+            </w:r>
+          </w:p>
+        </w:tc>
+        <w:tc>
+          <w:tcPr>
+            <w:tcW w:w="2200" w:type="dxa"/>
+            <w:shd w:val="clear" w:color="auto" w:fill="E2E8F0"/>
+            <w:tcMar>
+              <w:top w:w="120" w:type="dxa"/>
+              <w:left w:w="160" w:type="dxa"/>
+              <w:bottom w:w="120" w:type="dxa"/>
+              <w:right w:w="160" w:type="dxa"/>
+            </w:tcMar>
+          </w:tcPr>
+          <w:p>
+            <w:pPr>
+              <w:spacing w:after="80" w:before="120" w:line="276" w:lineRule="auto"/>
+            </w:pPr>
+            <w:r>
+              <w:rPr>
+                <w:rFonts w:ascii="Calibri" w:cs="Calibri" w:eastAsia="Calibri" w:hAnsi="Calibri"/>
+                <w:b w:val="1"/>
+                <w:bCs w:val="1"/>
+                <w:color w:val="1E3A8A"/>
+              </w:rPr>
+              <w:t xml:space="preserve">Chi tiết</w:t>
+            </w:r>
+          </w:p>
+        </w:tc>
+        <w:tc>
+          <w:tcPr>
+            <w:tcW w:w="1600" w:type="dxa"/>
+            <w:shd w:val="clear" w:color="auto" w:fill="E2E8F0"/>
+            <w:tcMar>
+              <w:top w:w="120" w:type="dxa"/>
+              <w:left w:w="160" w:type="dxa"/>
+              <w:bottom w:w="120" w:type="dxa"/>
+              <w:right w:w="160" w:type="dxa"/>
+            </w:tcMar>
+          </w:tcPr>
+          <w:p>
+            <w:pPr>
+              <w:spacing w:after="80" w:before="120" w:line="276" w:lineRule="auto"/>
+            </w:pPr>
+            <w:r>
+              <w:rPr>
+                <w:rFonts w:ascii="Calibri" w:cs="Calibri" w:eastAsia="Calibri" w:hAnsi="Calibri"/>
+                <w:b w:val="1"/>
+                <w:bCs w:val="1"/>
+                <w:color w:val="1E3A8A"/>
+              </w:rPr>
+              <w:t xml:space="preserve">Impact</w:t>
+            </w:r>
+          </w:p>
+        </w:tc>
+        <w:tc>
+          <w:tcPr>
+            <w:tcW w:w="2000" w:type="dxa"/>
+            <w:shd w:val="clear" w:color="auto" w:fill="E2E8F0"/>
+            <w:tcMar>
+              <w:top w:w="120" w:type="dxa"/>
+              <w:left w:w="160" w:type="dxa"/>
+              <w:bottom w:w="120" w:type="dxa"/>
+              <w:right w:w="160" w:type="dxa"/>
+            </w:tcMar>
+          </w:tcPr>
+          <w:p>
+            <w:pPr>
+              <w:spacing w:after="80" w:before="120" w:line="276" w:lineRule="auto"/>
+            </w:pPr>
+            <w:r>
+              <w:rPr>
+                <w:rFonts w:ascii="Calibri" w:cs="Calibri" w:eastAsia="Calibri" w:hAnsi="Calibri"/>
+                <w:b w:val="1"/>
+                <w:bCs w:val="1"/>
+                <w:color w:val="1E3A8A"/>
+              </w:rPr>
+              <w:t xml:space="preserve">Action</w:t>
+            </w:r>
+          </w:p>
+        </w:tc>
+        <w:tc>
+          <w:tcPr>
+            <w:tcW w:w="1000" w:type="dxa"/>
+            <w:shd w:val="clear" w:color="auto" w:fill="E2E8F0"/>
+            <w:tcMar>
+              <w:top w:w="120" w:type="dxa"/>
+              <w:left w:w="160" w:type="dxa"/>
+              <w:bottom w:w="120" w:type="dxa"/>
+              <w:right w:w="160" w:type="dxa"/>
+            </w:tcMar>
+          </w:tcPr>
+          <w:p>
+            <w:pPr>
+              <w:spacing w:after="80" w:before="120" w:line="276" w:lineRule="auto"/>
+            </w:pPr>
+            <w:r>
+              <w:rPr>
+                <w:rFonts w:ascii="Calibri" w:cs="Calibri" w:eastAsia="Calibri" w:hAnsi="Calibri"/>
+                <w:b w:val="1"/>
+                <w:bCs w:val="1"/>
+                <w:color w:val="1E3A8A"/>
+              </w:rPr>
+              <w:t xml:space="preserve">Commit deadline</w:t>
+            </w:r>
+          </w:p>
+        </w:tc>
+        <w:tc>
+          <w:tcPr>
+            <w:tcW w:w="960" w:type="dxa"/>
+            <w:shd w:val="clear" w:color="auto" w:fill="E2E8F0"/>
+            <w:tcMar>
+              <w:top w:w="120" w:type="dxa"/>
+              <w:left w:w="160" w:type="dxa"/>
+              <w:bottom w:w="120" w:type="dxa"/>
+              <w:right w:w="160" w:type="dxa"/>
+            </w:tcMar>
+          </w:tcPr>
+          <w:p>
+            <w:pPr>
+              <w:spacing w:after="80" w:before="120" w:line="276" w:lineRule="auto"/>
+            </w:pPr>
+            <w:r>
+              <w:rPr>
+                <w:rFonts w:ascii="Calibri" w:cs="Calibri" w:eastAsia="Calibri" w:hAnsi="Calibri"/>
+                <w:b w:val="1"/>
+                <w:bCs w:val="1"/>
+                <w:color w:val="1E3A8A"/>
+              </w:rPr>
+              <w:t xml:space="preserve">Note</w:t>
+            </w:r>
+          </w:p>
+        </w:tc>
+      </w:tr>
+      <w:tr>
+        <w:trPr/>
+        <w:tc>
+          <w:tcPr>
+            <w:tcW w:w="1600" w:type="dxa"/>
+            <w:tcMar>
+              <w:top w:w="120" w:type="dxa"/>
+              <w:left w:w="160" w:type="dxa"/>
+              <w:bottom w:w="120" w:type="dxa"/>
+              <w:right w:w="160" w:type="dxa"/>
+            </w:tcMar>
+          </w:tcPr>
+          <w:p>
+            <w:pPr>
+              <w:spacing w:after="80" w:before="120" w:line="276" w:lineRule="auto"/>
+            </w:pPr>
+            <w:r>
+              <w:rPr>
+                <w:rFonts w:ascii="Calibri" w:cs="Calibri" w:eastAsia="Calibri" w:hAnsi="Calibri"/>
+              </w:rPr>
+              <w:t xml:space="preserve">Lỗ hổng lộ trực tiếp IP VPS &amp; Swagger backend</w:t>
+            </w:r>
+          </w:p>
+        </w:tc>
+        <w:tc>
+          <w:tcPr>
+            <w:tcW w:w="2200" w:type="dxa"/>
+            <w:tcMar>
+              <w:top w:w="120" w:type="dxa"/>
+              <w:left w:w="160" w:type="dxa"/>
+              <w:bottom w:w="120" w:type="dxa"/>
+              <w:right w:w="160" w:type="dxa"/>
+            </w:tcMar>
+          </w:tcPr>
+          <w:p>
+            <w:pPr>
+              <w:spacing w:after="80" w:before="120" w:line="276" w:lineRule="auto"/>
+            </w:pPr>
+            <w:r>
+              <w:rPr>
+                <w:rFonts w:ascii="Calibri" w:cs="Calibri" w:eastAsia="Calibri" w:hAnsi="Calibri"/>
+              </w:rPr>
+              <w:t xml:space="preserve">Môi trường demo có thể truy cập thẳng qua địa chỉ IP máy chủ và tài liệu Swagger API bị lộ công khai không qua lớp bảo vệ proxy.</w:t>
+            </w:r>
+          </w:p>
+        </w:tc>
+        <w:tc>
+          <w:tcPr>
+            <w:tcW w:w="1600" w:type="dxa"/>
+            <w:tcMar>
+              <w:top w:w="120" w:type="dxa"/>
+              <w:left w:w="160" w:type="dxa"/>
+              <w:bottom w:w="120" w:type="dxa"/>
+              <w:right w:w="160" w:type="dxa"/>
+            </w:tcMar>
+          </w:tcPr>
+          <w:p>
+            <w:pPr>
+              <w:spacing w:after="80" w:before="120" w:line="276" w:lineRule="auto"/>
+            </w:pPr>
+            <w:r>
+              <w:rPr>
+                <w:rFonts w:ascii="Calibri" w:cs="Calibri" w:eastAsia="Calibri" w:hAnsi="Calibri"/>
+              </w:rPr>
+              <w:t xml:space="preserve">Rủi ro an ninh mạng, nguy cơ bị quét cổng, lộ cấu trúc dữ liệu và rò rỉ endpoint nội bộ của các microservice.</w:t>
+            </w:r>
+          </w:p>
+        </w:tc>
+        <w:tc>
+          <w:tcPr>
+            <w:tcW w:w="2000" w:type="dxa"/>
+            <w:tcMar>
+              <w:top w:w="120" w:type="dxa"/>
+              <w:left w:w="160" w:type="dxa"/>
+              <w:bottom w:w="120" w:type="dxa"/>
+              <w:right w:w="160" w:type="dxa"/>
+            </w:tcMar>
+          </w:tcPr>
+          <w:p>
+            <w:pPr>
+              <w:spacing w:after="80" w:before="120" w:line="276" w:lineRule="auto"/>
+            </w:pPr>
+            <w:r>
+              <w:rPr>
+                <w:rFonts w:ascii="Calibri" w:cs="Calibri" w:eastAsia="Calibri" w:hAnsi="Calibri"/>
+              </w:rPr>
+              <w:t xml:space="preserve">Cấu hình Nginx Reverse Proxy ép toàn bộ truy cập đi qua Cloudflare, đóng cổng nội bộ, áp dụng xác thực cơ bản cho Swagger.</w:t>
+            </w:r>
+          </w:p>
+        </w:tc>
+        <w:tc>
+          <w:tcPr>
+            <w:tcW w:w="1000" w:type="dxa"/>
+            <w:tcMar>
+              <w:top w:w="120" w:type="dxa"/>
+              <w:left w:w="160" w:type="dxa"/>
+              <w:bottom w:w="120" w:type="dxa"/>
+              <w:right w:w="160" w:type="dxa"/>
+            </w:tcMar>
+          </w:tcPr>
+          <w:p>
+            <w:pPr>
+              <w:spacing w:after="80" w:before="120" w:line="276" w:lineRule="auto"/>
+            </w:pPr>
+            <w:r>
+              <w:rPr>
+                <w:rFonts w:ascii="Calibri" w:cs="Calibri" w:eastAsia="Calibri" w:hAnsi="Calibri"/>
+              </w:rPr>
+              <w:t xml:space="preserve">24/10/2026</w:t>
+            </w:r>
+          </w:p>
+        </w:tc>
+        <w:tc>
+          <w:tcPr>
+            <w:tcW w:w="960" w:type="dxa"/>
+            <w:tcMar>
+              <w:top w:w="120" w:type="dxa"/>
+              <w:left w:w="160" w:type="dxa"/>
+              <w:bottom w:w="120" w:type="dxa"/>
+              <w:right w:w="160" w:type="dxa"/>
+            </w:tcMar>
+          </w:tcPr>
+          <w:p>
+            <w:pPr>
+              <w:spacing w:after="80" w:before="120" w:line="276" w:lineRule="auto"/>
+            </w:pPr>
+            <w:r>
+              <w:rPr>
+                <w:rFonts w:ascii="Calibri" w:cs="Calibri" w:eastAsia="Calibri" w:hAnsi="Calibri"/>
+                <w:b w:val="1"/>
+                <w:bCs w:val="1"/>
+              </w:rPr>
+              <w:t xml:space="preserve">Đã giải quyết</w:t>
+            </w:r>
+          </w:p>
+        </w:tc>
+      </w:tr>
+      <w:tr>
+        <w:trPr/>
+        <w:tc>
+          <w:tcPr>
+            <w:tcW w:w="1600" w:type="dxa"/>
+            <w:tcMar>
+              <w:top w:w="120" w:type="dxa"/>
+              <w:left w:w="160" w:type="dxa"/>
+              <w:bottom w:w="120" w:type="dxa"/>
+              <w:right w:w="160" w:type="dxa"/>
+            </w:tcMar>
+          </w:tcPr>
+          <w:p>
+            <w:pPr>
+              <w:spacing w:after="80" w:before="120" w:line="276" w:lineRule="auto"/>
+            </w:pPr>
+            <w:r>
+              <w:rPr>
+                <w:rFonts w:ascii="Calibri" w:cs="Calibri" w:eastAsia="Calibri" w:hAnsi="Calibri"/>
+              </w:rPr>
+              <w:t xml:space="preserve">Nguy cơ Race-condition &amp; Webhook PayOS trùng lặp</w:t>
+            </w:r>
+          </w:p>
+        </w:tc>
+        <w:tc>
+          <w:tcPr>
+            <w:tcW w:w="2200" w:type="dxa"/>
+            <w:tcMar>
+              <w:top w:w="120" w:type="dxa"/>
+              <w:left w:w="160" w:type="dxa"/>
+              <w:bottom w:w="120" w:type="dxa"/>
+              <w:right w:w="160" w:type="dxa"/>
+            </w:tcMar>
+          </w:tcPr>
+          <w:p>
+            <w:pPr>
+              <w:spacing w:after="80" w:before="120" w:line="276" w:lineRule="auto"/>
+            </w:pPr>
+            <w:r>
+              <w:rPr>
+                <w:rFonts w:ascii="Calibri" w:cs="Calibri" w:eastAsia="Calibri" w:hAnsi="Calibri"/>
+              </w:rPr>
+              <w:t xml:space="preserve">Khi mạng chập chờn hoặc thanh toán đa luồng, Webhook PayOS có thể được gọi nhiều lần đồng thời gây nguy cơ xử lý trùng lặp giao dịch.</w:t>
+            </w:r>
+          </w:p>
+        </w:tc>
+        <w:tc>
+          <w:tcPr>
+            <w:tcW w:w="1600" w:type="dxa"/>
+            <w:tcMar>
+              <w:top w:w="120" w:type="dxa"/>
+              <w:left w:w="160" w:type="dxa"/>
+              <w:bottom w:w="120" w:type="dxa"/>
+              <w:right w:w="160" w:type="dxa"/>
+            </w:tcMar>
+          </w:tcPr>
+          <w:p>
+            <w:pPr>
+              <w:spacing w:after="80" w:before="120" w:line="276" w:lineRule="auto"/>
+            </w:pPr>
+            <w:r>
+              <w:rPr>
+                <w:rFonts w:ascii="Calibri" w:cs="Calibri" w:eastAsia="Calibri" w:hAnsi="Calibri"/>
+              </w:rPr>
+              <w:t xml:space="preserve">Sai lệch trạng thái đơn hàng, doanh thu bị cộng đúp hoặc số lượng tồn kho FEFO bị trừ nhiều lần không chính xác.</w:t>
+            </w:r>
+          </w:p>
+        </w:tc>
+        <w:tc>
+          <w:tcPr>
+            <w:tcW w:w="2000" w:type="dxa"/>
+            <w:tcMar>
+              <w:top w:w="120" w:type="dxa"/>
+              <w:left w:w="160" w:type="dxa"/>
+              <w:bottom w:w="120" w:type="dxa"/>
+              <w:right w:w="160" w:type="dxa"/>
+            </w:tcMar>
+          </w:tcPr>
+          <w:p>
+            <w:pPr>
+              <w:spacing w:after="80" w:before="120" w:line="276" w:lineRule="auto"/>
+            </w:pPr>
+            <w:r>
+              <w:rPr>
+                <w:rFonts w:ascii="Calibri" w:cs="Calibri" w:eastAsia="Calibri" w:hAnsi="Calibri"/>
+              </w:rPr>
+              <w:t xml:space="preserve">Bổ sung bộ test Concurrency &amp; Idempotency, áp dụng cơ chế khóa phân tán (Distributed Lock / Redis key) và kiểm tra khóa giao dịch trước khi xử lý webhook.</w:t>
+            </w:r>
+          </w:p>
+        </w:tc>
+        <w:tc>
+          <w:tcPr>
+            <w:tcW w:w="1000" w:type="dxa"/>
+            <w:tcMar>
+              <w:top w:w="120" w:type="dxa"/>
+              <w:left w:w="160" w:type="dxa"/>
+              <w:bottom w:w="120" w:type="dxa"/>
+              <w:right w:w="160" w:type="dxa"/>
+            </w:tcMar>
+          </w:tcPr>
+          <w:p>
+            <w:pPr>
+              <w:spacing w:after="80" w:before="120" w:line="276" w:lineRule="auto"/>
+            </w:pPr>
+            <w:r>
+              <w:rPr>
+                <w:rFonts w:ascii="Calibri" w:cs="Calibri" w:eastAsia="Calibri" w:hAnsi="Calibri"/>
+              </w:rPr>
+              <w:t xml:space="preserve">25/10/2026</w:t>
+            </w:r>
+          </w:p>
+        </w:tc>
+        <w:tc>
+          <w:tcPr>
+            <w:tcW w:w="960" w:type="dxa"/>
+            <w:tcMar>
+              <w:top w:w="120" w:type="dxa"/>
+              <w:left w:w="160" w:type="dxa"/>
+              <w:bottom w:w="120" w:type="dxa"/>
+              <w:right w:w="160" w:type="dxa"/>
+            </w:tcMar>
+          </w:tcPr>
+          <w:p>
+            <w:pPr>
+              <w:spacing w:after="80" w:before="120" w:line="276" w:lineRule="auto"/>
+            </w:pPr>
+            <w:r>
+              <w:rPr>
+                <w:rFonts w:ascii="Calibri" w:cs="Calibri" w:eastAsia="Calibri" w:hAnsi="Calibri"/>
+                <w:b w:val="1"/>
+                <w:bCs w:val="1"/>
+              </w:rPr>
+              <w:t xml:space="preserve">Đã giải quyết</w:t>
+            </w:r>
+          </w:p>
+        </w:tc>
+      </w:tr>
+    </w:tbl>
+    <w:p>
+      <w:pPr>
+        <w:pStyle w:val="Heading2"/>
+        <w:spacing w:after="80" w:before="120" w:line="276" w:lineRule="auto"/>
+      </w:pPr>
+      <w:r>
+        <w:rPr>
+          <w:rFonts w:ascii="Calibri" w:cs="Calibri" w:eastAsia="Calibri" w:hAnsi="Calibri"/>
+          <w:b w:val="1"/>
+          <w:bCs w:val="1"/>
+          <w:color w:val="1E3A8A"/>
+        </w:rPr>
+        <w:t xml:space="preserve">Plan next week</w:t>
+      </w:r>
+    </w:p>
+    <w:p>
+      <w:pPr>
+        <w:spacing w:after="80" w:before="120" w:line="276" w:lineRule="auto"/>
+      </w:pPr>
+      <w:r>
+        <w:rPr>
+          <w:rFonts w:ascii="Calibri" w:cs="Calibri" w:eastAsia="Calibri" w:hAnsi="Calibri"/>
+          <w:color w:val="64748B"/>
+        </w:rPr>
+        <w:t xml:space="preserve">Tuần sau “dự kiến” làm gì?</w:t>
+      </w:r>
+    </w:p>
+    <w:tbl>
+      <w:tblPr>
+        <w:tblW w:w="9360" w:type="dxa"/>
+        <w:tblBorders>
+          <w:top w:val="single" w:sz="4" w:space="0" w:color="CBD5E1"/>
+          <w:left w:val="none"/>
+          <w:bottom w:val="single" w:sz="4" w:space="0" w:color="CBD5E1"/>
+          <w:right w:val="none"/>
+          <w:insideH w:val="single" w:sz="4" w:space="0" w:color="E2E8F0"/>
+          <w:insideV w:val="none"/>
+        </w:tblBorders>
+        <w:tblLayout w:type="fixed"/>
+      </w:tblPr>
+      <w:tr>
+        <w:trPr/>
+        <w:tc>
+          <w:tcPr>
+            <w:tcW w:w="3200" w:type="dxa"/>
+            <w:tcMar>
+              <w:top w:w="120" w:type="dxa"/>
+              <w:left w:w="160" w:type="dxa"/>
+              <w:bottom w:w="120" w:type="dxa"/>
+              <w:right w:w="160" w:type="dxa"/>
+            </w:tcMar>
+          </w:tcPr>
+          <w:p>
+            <w:pPr>
+              <w:spacing w:after="80" w:before="120" w:line="276" w:lineRule="auto"/>
+            </w:pPr>
+            <w:r>
+              <w:rPr>
+                <w:rFonts w:ascii="Calibri" w:cs="Calibri" w:eastAsia="Calibri" w:hAnsi="Calibri"/>
+              </w:rPr>
+              <w:t xml:space="preserve">Recover</w:t>
+            </w:r>
+          </w:p>
+        </w:tc>
+        <w:tc>
+          <w:tcPr>
+            <w:tcW w:w="6160" w:type="dxa"/>
+            <w:tcMar>
+              <w:top w:w="120" w:type="dxa"/>
+              <w:left w:w="160" w:type="dxa"/>
+              <w:bottom w:w="120" w:type="dxa"/>
+              <w:right w:w="160" w:type="dxa"/>
+            </w:tcMar>
+          </w:tcPr>
+          <w:p>
+            <w:pPr>
+              <w:spacing w:after="80" w:before="120" w:line="276" w:lineRule="auto"/>
+            </w:pPr>
+            <w:r>
+              <w:rPr>
+                <w:rFonts w:ascii="Calibri" w:cs="Calibri" w:eastAsia="Calibri" w:hAnsi="Calibri"/>
+              </w:rPr>
+              <w:t xml:space="preserve">• Hoàn thiện review và merge chính thức phân hệ Dược sĩ kết ca, đối soát tiền mặt và KPI (SCRUM-106).
+• Bắt tay triển khai mã nguồn module Flash Sale theo khung giờ (UC-74) dựa trên tài liệu đặc tả kỹ thuật đã được phê duyệt.</w:t>
+            </w:r>
+          </w:p>
+        </w:tc>
+      </w:tr>
+      <w:tr>
+        <w:trPr/>
+        <w:tc>
+          <w:tcPr>
+            <w:tcW w:w="3200" w:type="dxa"/>
+            <w:tcMar>
+              <w:top w:w="120" w:type="dxa"/>
+              <w:left w:w="160" w:type="dxa"/>
+              <w:bottom w:w="120" w:type="dxa"/>
+              <w:right w:w="160" w:type="dxa"/>
+            </w:tcMar>
+          </w:tcPr>
+          <w:p>
+            <w:pPr>
+              <w:spacing w:after="80" w:before="120" w:line="276" w:lineRule="auto"/>
+            </w:pPr>
+            <w:r>
+              <w:rPr>
+                <w:rFonts w:ascii="Calibri" w:cs="Calibri" w:eastAsia="Calibri" w:hAnsi="Calibri"/>
+              </w:rPr>
+              <w:t xml:space="preserve">Master plan</w:t>
+            </w:r>
+          </w:p>
+        </w:tc>
+        <w:tc>
+          <w:tcPr>
+            <w:tcW w:w="6160" w:type="dxa"/>
+            <w:tcMar>
+              <w:top w:w="120" w:type="dxa"/>
+              <w:left w:w="160" w:type="dxa"/>
+              <w:bottom w:w="120" w:type="dxa"/>
+              <w:right w:w="160" w:type="dxa"/>
+            </w:tcMar>
+          </w:tcPr>
+          <w:p>
+            <w:pPr>
+              <w:spacing w:after="80" w:before="120" w:line="276" w:lineRule="auto"/>
+            </w:pPr>
+            <w:r>
+              <w:rPr>
+                <w:rFonts w:ascii="Calibri" w:cs="Calibri" w:eastAsia="Calibri" w:hAnsi="Calibri"/>
+              </w:rPr>
+              <w:t xml:space="preserve">• Hoàn thiện &amp; Release Y tế số nâng cao (UC-107): Đưa tính năng Hồ sơ bệnh án điện tử, cảnh báo tương tác dị ứng/bệnh nền và nút "Đổi thuốc an toàn 1-click" lên môi trường demo.
+• Phát triển AI &amp; Voice Search: Triển khai UC-80 (Chatbot AI tư vấn triệu chứng bệnh cơ bản) và UC-81 (Tìm kiếm thuốc bằng giọng nói Voice Search trên Mobile).
+• Phân hệ Nhà cung cấp &amp; Barcode: Triển khai UC-110 (Đề xuất NCC giá tốt nhất bằng AI), UC-79 (Gửi RFQ hàng loạt cho NCC), UC-78 (In mã vạch / tem nhãn phụ cho thuốc nhập khẩu).
+• Mở rộng test tự động cho luồng điều chuyển kho liên chi nhánh và cảnh báo nhiệt độ IoT GSP; chuẩn bị Demo Data Pack cho buổi Review 2.</w:t>
+            </w:r>
+          </w:p>
+        </w:tc>
+      </w:tr>
+    </w:tbl>
+    <w:p>
+      <w:pPr>
+        <w:pStyle w:val="Heading2"/>
+        <w:spacing w:after="80" w:before="120" w:line="276" w:lineRule="auto"/>
+      </w:pPr>
+      <w:r>
+        <w:rPr>
+          <w:rFonts w:ascii="Calibri" w:cs="Calibri" w:eastAsia="Calibri" w:hAnsi="Calibri"/>
+          <w:b w:val="1"/>
+          <w:bCs w:val="1"/>
+          <w:color w:val="1E3A8A"/>
+        </w:rPr>
+        <w:t xml:space="preserve">Meeting notes</w:t>
+      </w:r>
+    </w:p>
+    <w:p>
+      <w:pPr>
+        <w:pStyle w:val="Heading3"/>
+        <w:spacing w:after="80" w:before="120" w:line="276" w:lineRule="auto"/>
+      </w:pPr>
+      <w:r>
+        <w:rPr>
+          <w:rFonts w:ascii="Calibri" w:cs="Calibri" w:eastAsia="Calibri" w:hAnsi="Calibri"/>
+          <w:b w:val="1"/>
+          <w:bCs w:val="1"/>
+          <w:color w:val="1E3A8A"/>
+        </w:rPr>
+        <w:t xml:space="preserve">KEY NOTES</w:t>
+      </w:r>
+    </w:p>
+    <w:p>
+      <w:pPr>
+        <w:spacing w:after="80" w:before="120" w:line="276" w:lineRule="auto"/>
+      </w:pPr>
+      <w:r>
+        <w:rPr>
+          <w:rFonts w:ascii="Calibri" w:cs="Calibri" w:eastAsia="Calibri" w:hAnsi="Calibri"/>
+          <w:color w:val="64748B"/>
+        </w:rPr>
+        <w:t xml:space="preserve">// các điểm đã thống nhất</w:t>
+      </w:r>
+    </w:p>
+    <w:p>
+      <w:pPr>
+        <w:spacing w:after="80" w:before="120" w:line="276" w:lineRule="auto"/>
+      </w:pPr>
+      <w:r>
+        <w:rPr>
+          <w:rFonts w:ascii="Calibri" w:cs="Calibri" w:eastAsia="Calibri" w:hAnsi="Calibri"/>
+          <w:color w:val="0F172A"/>
+        </w:rPr>
+        <w:t xml:space="preserve">- Thống nhất tuyệt đối về An ninh Hạ tầng: Toàn bộ hệ thống Backend API và dịch vụ giám sát (Grafana, Dozzle) trên VPS demo bắt buộc phải định tuyến qua Cloudflare Nginx Reverse Proxy, đóng toàn bộ các cổng direct công khai ra Internet.
+- Ban hành Quy tắc Kiến trúc Bắt buộc Rule 7 ("Test-Coupled Mandate"): Khi viết bất kỳ hàm, Service (*.service.ts) hoặc Controller (*.controller.ts) mới nào, lập trình viên bắt buộc phải kẹp file test (*.spec.ts) tương ứng trong cùng commit, phân loại đủ 3 nhóm giá trị ([Normal Values], [Boundary Values], [Abnormal Values]). CI/CD Pipeline sẽ từ chối merge nếu thiếu test.
+- Thống nhất Luồng Nghiệp vụ Cảnh báo Dị ứng (UC-107): Tại quầy POS, khi Dược sĩ thêm thuốc có thành phần xung đột với tiền sử dị ứng/bệnh nền của khách hàng, hệ thống sẽ bật modal cảnh báo tức thì màu đỏ cam và hiển thị nút "Đổi thuốc an toàn 1-click" do AI đề xuất.
+- Đánh giá Tiến độ Chung: Nhóm bám sát 100% kế hoạch tuần W7 của Master Plan, đồng thời đã đi trước tiến độ 2 tính năng lớn là UC-96 (Wishlist - vượt trước 6 tuần) và UC-84/UC-111 (Kết ca &amp; KPI - vượt trước 3 tuần). Toàn bộ 199 bài test đều pass trên CI/CD.</w:t>
+      </w:r>
+    </w:p>
+    <w:p>
+      <w:pPr>
+        <w:pStyle w:val="Heading3"/>
+        <w:spacing w:after="80" w:before="120" w:line="276" w:lineRule="auto"/>
+      </w:pPr>
+      <w:r>
+        <w:rPr>
+          <w:rFonts w:ascii="Calibri" w:cs="Calibri" w:eastAsia="Calibri" w:hAnsi="Calibri"/>
+          <w:b w:val="1"/>
+          <w:bCs w:val="1"/>
+          <w:color w:val="1E3A8A"/>
+        </w:rPr>
+        <w:t xml:space="preserve">TODO</w:t>
+      </w:r>
+    </w:p>
+    <w:p>
+      <w:pPr>
+        <w:spacing w:after="80" w:before="120" w:line="276" w:lineRule="auto"/>
+      </w:pPr>
+      <w:r>
+        <w:rPr>
+          <w:rFonts w:ascii="Calibri" w:cs="Calibri" w:eastAsia="Calibri" w:hAnsi="Calibri"/>
+          <w:color w:val="64748B"/>
+        </w:rPr>
+        <w:t xml:space="preserve">// các việc phải làm mới thảo luận trong cuộc họp</w:t>
+      </w:r>
+    </w:p>
+    <w:p>
+      <w:pPr>
+        <w:spacing w:after="80" w:before="120" w:line="276" w:lineRule="auto"/>
+      </w:pPr>
+      <w:r>
+        <w:rPr>
+          <w:rFonts w:ascii="Calibri" w:cs="Calibri" w:eastAsia="Calibri" w:hAnsi="Calibri"/>
+          <w:color w:val="0F172A"/>
+        </w:rPr>
+        <w:t xml:space="preserve">- [Trần Hồng Phước]: Hoàn thành tích hợp Backend &amp; Frontend cho UC-107 (Hồ sơ bệnh án điện tử &amp; cảnh báo dị ứng); review và merge nhánh SCRUM-106; bắt đầu lập trình phân hệ Flash Sale (UC-74). (Deadline: 30/10/2026)
+- [Đinh Anh Phúc]: Hoàn thiện chỉnh sửa theo review cho SCRUM-106 (Dược sĩ kết ca, KPI); nghiên cứu tích hợp Voice Search và nâng cấp Chatbot AI tư vấn triệu chứng bệnh UC-80. (Deadline: 31/10/2026)
+- [Nguyễn Tiến Đạt]: Kiểm thử toàn diện luồng tương tác Wishlist -&gt; Giỏ hàng -&gt; Thanh toán trên Mobile Expo; phối hợp hoàn thiện UI/UX cảnh báo tương tác thuốc tại quầy POS cho UC-107; hỗ trợ làm sạch backlog Jira. (Deadline: 30/10/2026)
+- [Nguyễn Văn Nam]: Mở rộng bộ bài test tự động cho luồng điều chuyển kho liên chi nhánh và cảnh báo viễn trắc nhiệt độ IoT GSP; chuẩn bị bộ dữ liệu mẫu (Demo Data Pack) phục vụ buổi Review 2; giám sát chất lượng CI/CD pipeline. (Deadline: 01/11/2026)</w:t>
+      </w:r>
+    </w:p>
+    <w:p>
+      <w:pPr>
+        <w:pStyle w:val="Heading3"/>
+        <w:spacing w:after="80" w:before="120" w:line="276" w:lineRule="auto"/>
+      </w:pPr>
+      <w:r>
+        <w:rPr>
+          <w:rFonts w:ascii="Calibri" w:cs="Calibri" w:eastAsia="Calibri" w:hAnsi="Calibri"/>
+          <w:b w:val="1"/>
+          <w:bCs w:val="1"/>
+          <w:color w:val="1E3A8A"/>
+        </w:rPr>
+        <w:t xml:space="preserve">Thời gian, địa điểm, thành phần tham dự</w:t>
+      </w:r>
+    </w:p>
+    <w:p>
+      <w:pPr>
+        <w:spacing w:after="80" w:before="120" w:line="276" w:lineRule="auto"/>
+      </w:pPr>
+      <w:r>
+        <w:rPr>
+          <w:rFonts w:ascii="Calibri" w:cs="Calibri" w:eastAsia="Calibri" w:hAnsi="Calibri"/>
+          <w:color w:val="0F172A"/>
+        </w:rPr>
+        <w:t xml:space="preserve">• Thời gian: 21:00 - 22:30, Chủ Nhật ngày 25/10/2026
+• Địa điểm: Google Meet / Kênh Discord nhóm SEP490-SE06
+• Thành phần: Trần Hồng Phước (Leader), Đinh Anh Phúc, Nguyễn Tiến Đạt, Nguyễn Văn Nam (Đầy đủ 4/4 thành viên).</w:t>
       </w:r>
     </w:p>
     <w:p>
@@ -4654,11 +6228,33 @@
 </w:document>
 </file>
 
-<file path=word/numbering.xml><?xml version="1.0" encoding="utf-8"?>
+<file path=word\fontTable.xml><?xml version="1.0" encoding="utf-8"?>
+<w:fonts xmlns:mc="http://schemas.openxmlformats.org/markup-compatibility/2006" xmlns:o="urn:schemas-microsoft-com:office:office" xmlns:r="http://schemas.openxmlformats.org/officeDocument/2006/relationships" xmlns:m="http://schemas.openxmlformats.org/officeDocument/2006/math" xmlns:v="urn:schemas-microsoft-com:vml" xmlns:wp="http://schemas.openxmlformats.org/drawingml/2006/wordprocessingDrawing" xmlns:w10="urn:schemas-microsoft-com:office:word" xmlns:w="http://schemas.openxmlformats.org/wordprocessingml/2006/main" xmlns:wne="http://schemas.microsoft.com/office/word/2006/wordml" xmlns:sl="http://schemas.openxmlformats.org/schemaLibrary/2006/main" xmlns:a="http://schemas.openxmlformats.org/drawingml/2006/main" xmlns:pic="http://schemas.openxmlformats.org/drawingml/2006/picture" xmlns:c="http://schemas.openxmlformats.org/drawingml/2006/chart" xmlns:lc="http://schemas.openxmlformats.org/drawingml/2006/lockedCanvas" xmlns:dgm="http://schemas.openxmlformats.org/drawingml/2006/diagram" xmlns:wps="http://schemas.microsoft.com/office/word/2010/wordprocessingShape" xmlns:wpg="http://schemas.microsoft.com/office/word/2010/wordprocessingGroup" xmlns:w14="http://schemas.microsoft.com/office/word/2010/wordml" xmlns:w15="http://schemas.microsoft.com/office/word/2012/wordml" xmlns:w16="http://schemas.microsoft.com/office/word/2018/wordml" xmlns:w16cex="http://schemas.microsoft.com/office/word/2018/wordml/cex" xmlns:w16cid="http://schemas.microsoft.com/office/word/2016/wordml/cid" xmlns="http://schemas.microsoft.com/office/tasks/2019/documenttasks" xmlns:cr="http://schemas.microsoft.com/office/comments/2020/reactions">
+  <w:font w:name="Arial"/>
+  <w:font w:name="Calibri"/>
+  <w:font w:name="Play">
+    <w:embedRegular w:fontKey="{00000000-0000-0000-0000-000000000000}" r:id="rId1" w:subsetted="0"/>
+    <w:embedBold w:fontKey="{00000000-0000-0000-0000-000000000000}" r:id="rId2" w:subsetted="0"/>
+  </w:font>
+</w:fonts>
+</file>
+
+<file path=word\numbering.xml><?xml version="1.0" encoding="utf-8"?>
 <w:numbering xmlns:mc="http://schemas.openxmlformats.org/markup-compatibility/2006" xmlns:o="urn:schemas-microsoft-com:office:office" xmlns:r="http://schemas.openxmlformats.org/officeDocument/2006/relationships" xmlns:m="http://schemas.openxmlformats.org/officeDocument/2006/math" xmlns:v="urn:schemas-microsoft-com:vml" xmlns:wp="http://schemas.openxmlformats.org/drawingml/2006/wordprocessingDrawing" xmlns:w10="urn:schemas-microsoft-com:office:word" xmlns:w="http://schemas.openxmlformats.org/wordprocessingml/2006/main" xmlns:wne="http://schemas.microsoft.com/office/word/2006/wordml" xmlns:sl="http://schemas.openxmlformats.org/schemaLibrary/2006/main" xmlns:a="http://schemas.openxmlformats.org/drawingml/2006/main" xmlns:pic="http://schemas.openxmlformats.org/drawingml/2006/picture" xmlns:c="http://schemas.openxmlformats.org/drawingml/2006/chart" xmlns:lc="http://schemas.openxmlformats.org/drawingml/2006/lockedCanvas" xmlns:dgm="http://schemas.openxmlformats.org/drawingml/2006/diagram" xmlns:wps="http://schemas.microsoft.com/office/word/2010/wordprocessingShape" xmlns:wpg="http://schemas.microsoft.com/office/word/2010/wordprocessingGroup" xmlns:w14="http://schemas.microsoft.com/office/word/2010/wordml" xmlns:w15="http://schemas.microsoft.com/office/word/2012/wordml" xmlns:w16="http://schemas.microsoft.com/office/word/2018/wordml" xmlns:w16cex="http://schemas.microsoft.com/office/word/2018/wordml/cex" xmlns:w16cid="http://schemas.microsoft.com/office/word/2016/wordml/cid" xmlns="http://schemas.microsoft.com/office/tasks/2019/documenttasks" xmlns:cr="http://schemas.microsoft.com/office/comments/2020/reactions"/>
 </file>
 
-<file path=word/styles.xml><?xml version="1.0" encoding="utf-8"?>
+<file path=word\settings.xml><?xml version="1.0" encoding="utf-8"?>
+<w:settings xmlns:mc="http://schemas.openxmlformats.org/markup-compatibility/2006" xmlns:o="urn:schemas-microsoft-com:office:office" xmlns:r="http://schemas.openxmlformats.org/officeDocument/2006/relationships" xmlns:m="http://schemas.openxmlformats.org/officeDocument/2006/math" xmlns:v="urn:schemas-microsoft-com:vml" xmlns:wp="http://schemas.openxmlformats.org/drawingml/2006/wordprocessingDrawing" xmlns:w10="urn:schemas-microsoft-com:office:word" xmlns:w="http://schemas.openxmlformats.org/wordprocessingml/2006/main" xmlns:wne="http://schemas.microsoft.com/office/word/2006/wordml" xmlns:sl="http://schemas.openxmlformats.org/schemaLibrary/2006/main" xmlns:a="http://schemas.openxmlformats.org/drawingml/2006/main" xmlns:pic="http://schemas.openxmlformats.org/drawingml/2006/picture" xmlns:c="http://schemas.openxmlformats.org/drawingml/2006/chart" xmlns:lc="http://schemas.openxmlformats.org/drawingml/2006/lockedCanvas" xmlns:dgm="http://schemas.openxmlformats.org/drawingml/2006/diagram" xmlns:wps="http://schemas.microsoft.com/office/word/2010/wordprocessingShape" xmlns:wpg="http://schemas.microsoft.com/office/word/2010/wordprocessingGroup" xmlns:w14="http://schemas.microsoft.com/office/word/2010/wordml" xmlns:w15="http://schemas.microsoft.com/office/word/2012/wordml" xmlns:w16="http://schemas.microsoft.com/office/word/2018/wordml" xmlns:w16cex="http://schemas.microsoft.com/office/word/2018/wordml/cex" xmlns:w16cid="http://schemas.microsoft.com/office/word/2016/wordml/cid" xmlns="http://schemas.microsoft.com/office/tasks/2019/documenttasks" xmlns:cr="http://schemas.microsoft.com/office/comments/2020/reactions">
+  <w:embedTrueTypeFonts w:val="1"/>
+  <w:defaultTabStop w:val="720"/>
+  <w:compat>
+    <w:compatSetting w:val="15" w:name="compatibilityMode" w:uri="http://schemas.microsoft.com/office/word"/>
+  </w:compat>
+  <w:clrSchemeMapping w:bg1="light1" w:t1="dark1" w:bg2="light2" w:t2="dark2" w:accent1="accent1" w:accent2="accent2" w:accent3="accent3" w:accent4="accent4" w:accent5="accent5" w:accent6="accent6" w:hyperlink="hyperlink" w:followedHyperlink="followedHyperlink"/>
+</w:settings>
+</file>
+
+<file path=word\styles.xml><?xml version="1.0" encoding="utf-8"?>
 <w:styles xmlns:mc="http://schemas.openxmlformats.org/markup-compatibility/2006" xmlns:o="urn:schemas-microsoft-com:office:office" xmlns:r="http://schemas.openxmlformats.org/officeDocument/2006/relationships" xmlns:m="http://schemas.openxmlformats.org/officeDocument/2006/math" xmlns:v="urn:schemas-microsoft-com:vml" xmlns:wp="http://schemas.openxmlformats.org/drawingml/2006/wordprocessingDrawing" xmlns:w10="urn:schemas-microsoft-com:office:word" xmlns:w="http://schemas.openxmlformats.org/wordprocessingml/2006/main" xmlns:wne="http://schemas.microsoft.com/office/word/2006/wordml" xmlns:sl="http://schemas.openxmlformats.org/schemaLibrary/2006/main" xmlns:a="http://schemas.openxmlformats.org/drawingml/2006/main" xmlns:pic="http://schemas.openxmlformats.org/drawingml/2006/picture" xmlns:c="http://schemas.openxmlformats.org/drawingml/2006/chart" xmlns:lc="http://schemas.openxmlformats.org/drawingml/2006/lockedCanvas" xmlns:dgm="http://schemas.openxmlformats.org/drawingml/2006/diagram" xmlns:wps="http://schemas.microsoft.com/office/word/2010/wordprocessingShape" xmlns:wpg="http://schemas.microsoft.com/office/word/2010/wordprocessingGroup" xmlns:w14="http://schemas.microsoft.com/office/word/2010/wordml" xmlns:w15="http://schemas.microsoft.com/office/word/2012/wordml" xmlns:w16="http://schemas.microsoft.com/office/word/2018/wordml" xmlns:w16cex="http://schemas.microsoft.com/office/word/2018/wordml/cex" xmlns:w16cid="http://schemas.microsoft.com/office/word/2016/wordml/cid" xmlns="http://schemas.microsoft.com/office/tasks/2019/documenttasks" xmlns:cr="http://schemas.microsoft.com/office/comments/2020/reactions">
   <w:docDefaults>
     <w:rPrDefault>
@@ -5362,7 +6958,7 @@
 </w:styles>
 </file>
 
-<file path=word/theme/theme1.xml><?xml version="1.0" encoding="utf-8"?>
+<file path=word\theme\theme1.xml><?xml version="1.0" encoding="utf-8"?>
 <a:theme xmlns:a="http://schemas.openxmlformats.org/drawingml/2006/main" name="Office Theme">
   <a:themeElements>
     <a:clrScheme name="Office">
@@ -5655,19 +7251,4 @@
     </a:ext>
   </a:extLst>
 </a:theme>
-</file>
-
-<file path=customXML/item1.xml><?xml version="1.0" encoding="utf-8"?>
-<go:gDocsCustomXmlDataStorage xmlns:go="http://customooxmlschemas.google.com/" xmlns:r="http://schemas.openxmlformats.org/officeDocument/2006/relationships" uri="GoogleDocsCustomDataVersion2">
-  <go:docsCustomData xmlns:go="http://customooxmlschemas.google.com/" roundtripDataSignature="AMtx7mg3vowUfzNy4186hycm1ZH7NrJLLg==">CgMxLjAyDWguaXlqbGMzd3dxa2kyDmguNGF2N3dzZ3k0ZDlsOAByITFJWURUUWNtZUM1YURha0Z5Tnk3NTBYaXpZNHJrZDVxRw==</go:docsCustomData>
-</go:gDocsCustomXmlDataStorage>
-</file>
-
-<file path=customXML/itemProps1.xml><?xml version="1.0" encoding="utf-8"?>
-<ds:datastoreItem xmlns:ds="http://schemas.openxmlformats.org/officeDocument/2006/customXml" ds:itemID="{11111111-1234-1234-1234-123412341234}">
-  <ds:schemaRefs>
-    <ds:schemaRef ds:uri="http://schemas.openxmlformats.org/officeDocument/2006/relationships"/>
-    <ds:schemaRef ds:uri="http://customooxmlschemas.google.com/"/>
-  </ds:schemaRefs>
-</ds:datastoreItem>
 </file>
</xml_diff>